<commit_message>
Proofread French edition: 217 fixes applied, 13 decisions logged
Co-Authored-By: Claude Opus 5.5 <noreply@anthropic.com>
Claude-Session: https://claude.ai/code/session_015bGU9R5VguxHZDVriTWnnq
</commit_message>
<xml_diff>
--- a/corrected/Inn Trouble - ASSEMBLED - FORMATTED_French.docx
+++ b/corrected/Inn Trouble - ASSEMBLED - FORMATTED_French.docx
@@ -28,36 +28,36 @@
     </w:p>
     <w:p>
       <w:r>
-        <w:t>Copyright 2026 by Lisa Bouchard.</w:t>
-      </w:r>
-    </w:p>
-    <w:p/>
-    <w:p>
-      <w:r>
-        <w:t>Second Edition</w:t>
-      </w:r>
-    </w:p>
-    <w:p/>
-    <w:p>
-      <w:r>
-        <w:t>All rights reserved.</w:t>
-      </w:r>
-    </w:p>
-    <w:p/>
-    <w:p>
-      <w:r>
-        <w:t>No part of this publication may be reproduced, distributed, or transmitted in any form or by any means, including photocopying, recording, or other electronic or mechanical methods, without the prior written permission of the publisher, except as permitted by U.S. copyright law.</w:t>
-      </w:r>
-    </w:p>
-    <w:p/>
-    <w:p>
-      <w:r>
-        <w:t>The story, all names, characters, and incidents portrayed in this production are fictitious. No identification with actual persons (living or deceased), places, buildings, and products is intended or should be inferred.</w:t>
-      </w:r>
-    </w:p>
-    <w:p>
-      <w:r>
-        <w:t>Books in This Series</w:t>
+        <w:t xml:space="preserve">Copyright © 2026 Lisa Bouchard.</w:t>
+      </w:r>
+    </w:p>
+    <w:p/>
+    <w:p>
+      <w:r>
+        <w:t xml:space="preserve">Deuxième édition</w:t>
+      </w:r>
+    </w:p>
+    <w:p/>
+    <w:p>
+      <w:r>
+        <w:t xml:space="preserve">Tous droits réservés.</w:t>
+      </w:r>
+    </w:p>
+    <w:p/>
+    <w:p>
+      <w:r>
+        <w:t xml:space="preserve">Aucune partie de cette publication ne peut être reproduite, distribuée ou transmise sous quelque forme ou par quelque moyen que ce soit, y compris la photocopie, l'enregistrement ou tout autre procédé électronique ou mécanique, sans l'autorisation écrite préalable de l'éditeur, sauf dans les cas prévus par la législation américaine sur le droit d'auteur.</w:t>
+      </w:r>
+    </w:p>
+    <w:p/>
+    <w:p>
+      <w:r>
+        <w:t xml:space="preserve">Cette histoire, ainsi que tous les noms, personnages et événements qui y sont décrits, sont fictifs. Toute ressemblance avec des personnes réelles (vivantes ou décédées), des lieux, des bâtiments ou des produits existants serait purement fortuite et n'est pas intentionnelle.</w:t>
+      </w:r>
+    </w:p>
+    <w:p>
+      <w:r>
+        <w:t xml:space="preserve">Dans la même série</w:t>
       </w:r>
     </w:p>
     <w:p>
@@ -72,12 +72,12 @@
     </w:p>
     <w:p>
       <w:r>
-        <w:t>Table of Contents</w:t>
-      </w:r>
-    </w:p>
-    <w:p>
-      <w:r>
-        <w:t>About this Book</w:t>
+        <w:t xml:space="preserve">Table des matières</w:t>
+      </w:r>
+    </w:p>
+    <w:p>
+      <w:r>
+        <w:t xml:space="preserve">À propos de ce livre</w:t>
       </w:r>
     </w:p>
     <w:p>
@@ -162,7 +162,7 @@
     <w:p/>
     <w:p>
       <w:r>
-        <w:t>Elle a poussé un petit cri, le bref et sec piaillement qui signifiait de se dépêcher, a secoué sa queue et a dandiné sur le perron dès que j'ai eu ouvert la porte, comme si c'était elle qui m'attendait et non l'inverse.</w:t>
+        <w:t xml:space="preserve">Elle a poussé un petit cri, le bref et sec piaillement qui signifiait de se dépêcher, a secoué sa queue et s'est dandinée jusque sur le perron dès que j'ai eu ouvert la porte, comme si c'était elle qui m'attendait et non l'inverse.</w:t>
       </w:r>
     </w:p>
     <w:p/>
@@ -174,7 +174,7 @@
     <w:p/>
     <w:p>
       <w:r>
-        <w:t>J'adorais ça. Les toiles d'araignée étaient apparues dès le premier matin frais, et j'ai passé un très grand nombre d'années de ma longue vie dans un endroit où les seuls voisins étaient des lutins et des rennes, avec un mari qui chantonnait entre ses dents dans un atelier, alors je ne prendrai jamais une rue pleine de citrouilles pour acquise. M. Kim had sculpté toute une rangée de cucurbitacées devant le garage, chacune coiffée d'un petit bonnet de mécanicien en papier. Le bureau de la Gazette avait un squelette dans sa vitrine en train de lire un journal. Quelqu'un, je soupçonnais Olivia, avait tricoté un chapeau orange pour la borne-fontaine devant Yarn Tales.</w:t>
+        <w:t xml:space="preserve">J'adorais ça. Les toiles d'araignée étaient apparues dès le premier matin frais, et j'ai passé un très grand nombre d'années de ma longue vie dans un endroit où les seuls voisins étaient des lutins et des rennes, avec un mari qui chantonnait entre ses dents dans un atelier, alors je ne prendrai jamais une rue pleine de citrouilles pour acquise. M. Kim avait sculpté toute une rangée de cucurbitacées devant le garage, chacune coiffée d'un petit bonnet de mécanicien en papier. Le bureau de la Gazette avait un squelette dans sa vitrine en train de lire un journal. Quelqu'un, je soupçonnais Olivia, avait tricoté un chapeau orange pour la borne-fontaine devant Yarn Tales.</w:t>
       </w:r>
     </w:p>
     <w:p/>
@@ -210,7 +210,7 @@
     <w:p/>
     <w:p>
       <w:r>
-        <w:t>Le hall était baigné de cette bonne et profonde chaleur d'un feu entretenu depuis avant l'aurore. Il sentait le café et la fumée de bois se mêlant à l'odeur plus ancienne de la maison elle-même, cire d'abeille et vieux bois. Des clients étaient assis dans les fauteuils bas, un couple près de la fenêtre avec une carte déployée entre eux, une femme plus âgée au coin du feu penchée sur un livre de poche, et la pièce bruissait de ce murmure détendu propre aux endroits où l'on se sent bien. Il y avait pourtant ce matin une odeur inédite sous toutes les autres, vive et légèrement métallique, que je n'ai su d'abord identifier. Quand j'ai regardé autour de moi, j'ai compris. Les ferronneries de Sam Patel étaient partout où se posait mon regard. Il avait forgé les appliques murales, le grand pare-étincelles de l'îlot de la cheminée et une rangée d'étoiles en fer noir le long du manteau pour la fête, et toute la pièce de devant avait pris ce parfum subtil et net de la forge, tissé dans l'air comme l'odeur du pain dans une cuisine.</w:t>
+        <w:t xml:space="preserve">Le hall était baigné de cette bonne et profonde chaleur d'un feu entretenu depuis avant l'aurore. Il sentait le café et la fumée de bois se mêlant à l'odeur plus ancienne de la maison elle-même, cire d'abeille et vieux bois. Des clients étaient assis dans les fauteuils bas, un couple près de la fenêtre avec une carte déployée entre eux, une femme plus âgée au coin du feu penchée sur un livre de poche, et la pièce bruissait de ce murmure détendu propre aux endroits où l'on se sent bien. Il y avait pourtant ce matin une odeur inédite sous toutes les autres, vive et légèrement métallique, que je n'ai su d'abord identifier. Quand j'ai regardé autour de moi, j'ai compris. Les ferronneries de Sam Patel étaient partout où se posait mon regard. Il avait forgé les appliques murales, le grand pare-étincelles devant l'âtre et une rangée d'étoiles en fer noir le long du manteau pour la fête, et toute la pièce de devant avait pris ce parfum subtil et net de la forge, tissé dans l'air comme l'odeur du pain dans une cuisine.</w:t>
       </w:r>
     </w:p>
     <w:p/>
@@ -288,7 +288,7 @@
     <w:p/>
     <w:p>
       <w:r>
-        <w:t>J'ai compris une chose alors. Les Worthington étaient de ces clients dont tout aubergiste rêve, ceux qui prennent la plus belle chambre à la semaine, pourboirent le personnel avec largesse et demandent, sincèrement, qui a fabriqué les édredons. Quoi qui pesât sur Fiona, leur semaine supplémentaire représentait la seule planche solide sous ses pieds.</w:t>
+        <w:t xml:space="preserve">J'ai compris une chose alors. Les Worthington étaient de ces clients dont tout aubergiste rêve, ceux qui prennent la plus belle chambre à la semaine, laissent au personnel des pourboires généreux et demandent, sincèrement, qui a confectionné les courtepointes. Quoi qui pesât sur Fiona, leur semaine supplémentaire représentait la seule planche solide sous ses pieds.</w:t>
       </w:r>
     </w:p>
     <w:p/>
@@ -348,7 +348,7 @@
     <w:p/>
     <w:p>
       <w:r>
-        <w:t>— Superbe travail, ces ferrures. Le visiteur était svelte, l'œil vif, approchant la cinquantaine, habillé avec l'élégance faussement froissée d'un voyageur. Il tenait à la main un petit carnet qu'il ne cherchait nullement à dissimuler. Il a fait un signe de tête vers Sam. Forgeron du coin ? Ça se devine toujours. Il y a de l'assurance là-dedans. Et cette maison. Il s'est tourné, sans hâte, pour embrasser le hall du regard, l'escalier en rotonde, le vieux médaillon de plâtre au centre du plafond. Voilà une maison qui a une histoire. Une affaire de famille, je parie. Des générations.</w:t>
+        <w:t xml:space="preserve">— Superbe travail, ces ferrures. Le visiteur était svelte, l'œil vif, dans les cinquante-cinq ans, habillé avec l'élégance faussement froissée d'un voyageur. Il tenait à la main un petit carnet qu'il ne cherchait nullement à dissimuler. Il a fait un signe de tête vers Sam. Forgeron du coin ? Ça se devine toujours. Il y a de l'assurance là-dedans. Et cette maison. Il s'est tourné, sans hâte, pour embrasser le hall du regard, l'escalier en rotonde, le vieux médaillon de plâtre au centre du plafond. Voilà une maison qui a une histoire. Une affaire de famille, je parie. Des générations.</w:t>
       </w:r>
     </w:p>
     <w:p/>
@@ -372,13 +372,13 @@
     <w:p/>
     <w:p>
       <w:r>
-        <w:t>— Claus. Il a esquissé un sourire, bon, facile et rodé, mais je lui faisais à peu près autant confiance que j'aurais pu lancer le pare-étincelles. Vous êtes donc la fameuse Mme Claus. Comme c'est absolument merveilleux. J'avais entendu dire, bien sûr, on entend des choses, mais je n'y croyais pas tout à fait jusqu'à présent. Il s'est penché d'une fraction, sur un ton de connivence. — Dites-moi. Les vieilles familles d'ici, les Blackburn et les autres, est-ce que leurs biens sont encore en ville ? Des objets de famille, des meubles, des bijoux, ce genre de choses ? J'en piste un, d'ailleurs. Une broche.</w:t>
-      </w:r>
-    </w:p>
-    <w:p/>
-    <w:p>
-      <w:r>
-        <w:t>Il a déposé ce mot, &lt;it&gt;broche&lt;/it&gt;, entre nous comme un pêcheur pose une mouche sur l'eau, délicatement, avec infiniment de précautions, et a guetté ce qui allait mordre.</w:t>
+        <w:t xml:space="preserve">— Claus. Il a esquissé un sourire, bon, facile et rodé, mais je ne m'y fiais pas plus loin que je n'aurais pu lancer le pare-étincelles. Vous êtes donc la fameuse Mme Claus. Comme c'est absolument merveilleux. J'avais entendu dire, bien sûr, on entend des choses, mais je n'y croyais pas tout à fait jusqu'à présent. Il s'est penché d'une fraction, sur un ton de connivence. — Dites-moi. Les vieilles familles d'ici, les Blackburn et les autres, est-ce que leurs biens sont encore en ville ? Des objets de famille, des meubles, des bijoux, ce genre de choses ? J'en piste un, d'ailleurs. Une broche.</w:t>
+      </w:r>
+    </w:p>
+    <w:p/>
+    <w:p>
+      <w:r>
+        <w:t xml:space="preserve">Il a déposé ce mot, broche, entre nous comme un pêcheur pose une mouche sur l'eau, délicatement, avec infiniment de précautions, et a guetté ce qui allait mordre.</w:t>
       </w:r>
     </w:p>
     <w:p/>
@@ -420,7 +420,7 @@
     <w:p/>
     <w:p>
       <w:r>
-        <w:t>J'ai récupéré Pip, laquelle avait profité de l'intervalle pour ramper à travers le hall jusqu'à une table basse près des marches et la grande coupe étincelante qui y trônait, un compotier en cristal taillé qui projetait des arcs-en-ciel lorsque le feu l'atteignait. Elle se tenait le bec à environ un pouce d'une poire en verre, vibrant légèrement de convoitise.</w:t>
+        <w:t xml:space="preserve">J'ai récupéré Pip, laquelle avait profité de l'intervalle pour ramper à travers le hall jusqu'à une table basse près des marches et la grande coupe étincelante qui y trônait, un compotier en cristal taillé qui projetait des arcs-en-ciel lorsque le feu l'atteignait. Elle se tenait le bec à deux ou trois centimètres d'une poire en verre, vibrant légèrement de convoitise.</w:t>
       </w:r>
     </w:p>
     <w:p/>
@@ -509,12 +509,12 @@
     <w:p/>
     <w:p>
       <w:r>
-        <w:t>L'appel est arrivé le lendemain matin alors que j'avais les mains plongées dans une pâte à tarte, et j'ai su que c'était grave avant même d'avoir eu le temps de les essuyer, car le téléphone de notre chalet ne sonnait presque jamais. Les gens venaient frapper à la porte, pour la plupart, ou envoyaient un enfant avec un mot, ou vous croyaient au marché. Quand le téléphone sonnait, c'était généralement Olivia, qui voulait savoir si j'avais vu le nouveau mérinos qui venait d'arriver, ou Martha, pour me rappeler quel après-midi le cercle se réunissait. Alors, lorsqu'il a sonné à huit heures et demie par un matin gris, d'une sonnerie stridente dans la cuisine silencieuse, mon estomac s'est noué avant même que j'aie traversé la pièce.</w:t>
-      </w:r>
-    </w:p>
-    <w:p>
-      <w:r>
-        <w:t>Pip a levé les yeux de sa cachette près de la fenêtre, inclinant la tête au son.</w:t>
+        <w:t xml:space="preserve">L'appel est arrivé le lendemain matin alors que j'avais les mains plongées dans une pâte à tarte, et j'ai su que c'était grave avant même d'avoir eu le temps de les essuyer, car le téléphone de notre chalet ne sonnait presque jamais. Les gens venaient frapper à la porte, pour la plupart, ou envoyaient un enfant avec un mot, ou vous croisaient au marché. Quand le téléphone sonnait, c'était généralement Olivia, qui voulait savoir si j'avais vu le nouveau mérinos qui venait d'arriver, ou Martha, pour me rappeler quel après-midi le cercle se réunissait. Alors, lorsqu'il a sonné à huit heures et demie par un matin gris, d'une sonnerie stridente dans la cuisine silencieuse, mon estomac s'est noué avant même que j'aie traversé la pièce.</w:t>
+      </w:r>
+    </w:p>
+    <w:p>
+      <w:r>
+        <w:t xml:space="preserve">Pip a levé les yeux de son coin près de la fenêtre, inclinant la tête au son.</w:t>
       </w:r>
     </w:p>
     <w:p>
@@ -605,7 +605,7 @@
     </w:p>
     <w:p>
       <w:r>
-        <w:t>Je l'ai lu deux fois de suite. L'horloge grand-père tictaquait. Quelque chose dans la formulation m'a interpellée. Le saphir en son cœur. Une façon étrange, douce, presque tendre pour un maître chanteur de nommer une pierre volée, comme une phrase extraite d'un livre. J'ai laissé couler. J'avais des soucis plus graves en face de moi en cet instant qu'une tournure de phrase de parrain.</w:t>
+        <w:t xml:space="preserve">Je l'ai lu deux fois de suite. L'horloge grand-père tictaquait. Quelque chose dans la formulation m'a interpellée. Le saphir en son cœur. Une façon étrange, douce, presque tendre pour un maître chanteur de nommer une pierre volée, comme une phrase extraite d'un livre. J'ai laissé couler. J'avais des soucis plus graves en face de moi en cet instant qu'une tournure de phrase d'inconnu.</w:t>
       </w:r>
     </w:p>
     <w:p>
@@ -665,7 +665,7 @@
     </w:p>
     <w:p>
       <w:r>
-        <w:t xml:space="preserve">« Des années. » Elle s'est essuyé les yeux du revers de la main, un geste d'enfant. « Je l'ai trouvée après la mort de maman. Il y avait une valise dans le grenier, une vieille cantine, fermée à clé, et la clé était dans les affaires de maman avec une étiquette portant son écriture où il était juste écrit </w:t>
+        <w:t xml:space="preserve">« Des années. » Elle s'est essuyé les yeux du revers de la main, un geste d'enfant. « Je l'ai trouvée après la mort de maman. Il y avait un coffre dans le grenier, une vieille malle de voyage, fermé à clé, et la clé était dans les affaires de maman avec une étiquette portant son écriture où il était juste écrit </w:t>
       </w:r>
       <w:r>
         <w:rPr>
@@ -674,7 +674,7 @@
         <w:t>ne pas perdre</w:t>
       </w:r>
       <w:r>
-        <w:t>. Alors forcément, je l'ai ouverte. » Un petit rire brisé. « Des lettres. Un reçu de mont-de-piété, le vrai, venant de la boutique de Ridgeline, avec la date et le montant. Quelques autres bric-a-brac. Tout cela plié petit et enfoncé dans les coins, comme quelque chose qu'on ne peut pas se résoudre à jeter et qu'on ne peut pas supporter de regarder non plus. Ma mère savait. Sa mère savait. Et maintenant je sais. Et pas un seul d'entre nous n'en a jamais soufflé mot à qui que ce soit. » Elle a levé les yeux vers moi, et son regard était à vif. « À qui aurais-je pu le dire ? Comment dire une chose pareille à quelqu'un ? Comment me regarderaient-ils, comment regarderaient-ils l'auberge s'ils savaient ? »</w:t>
+        <w:t xml:space="preserve">. Alors forcément, je l'ai ouverte. » Un petit rire brisé. « Des lettres. Un reçu de mont-de-piété, le vrai, venant de la boutique de Ridgeline, avec la date et le montant. Quelques autres objets. Tout cela plié petit et enfoncé dans les coins, comme quelque chose qu'on ne peut pas se résoudre à jeter et qu'on ne peut pas supporter de regarder non plus. Ma mère savait. Sa mère savait. Et maintenant je sais. Et pas une seule d'entre nous n'en a jamais soufflé mot à qui que ce soit. » Elle a levé les yeux vers moi, et son regard était à vif. « À qui aurais-je pu le dire ? Comment dire une chose pareille à quelqu'un ? Comment me regarderaient-ils, comment regarderaient-ils l'auberge s'ils savaient ? »</w:t>
       </w:r>
     </w:p>
     <w:p>
@@ -684,7 +684,7 @@
     </w:p>
     <w:p>
       <w:r>
-        <w:t>« Mais tu ne comprends pas ? » Elle a secoué la tête, angoissée. « Peu importe ce qui est vrai chez moi. Ce qui compte, c'est ce qu'ils peuvent raconter. Si ça s'ébruite, ça détruit tout. Le nom de l'auberge. Le nom de ma famille. Cent ans de travail, anéantis à cause d'une fille que je n'ai jamais connue et d'un acte que je n'ai jamais commis. » Elle a fait un geste vers le mot. « Et maintenant, quelqu'un sait. Quelqu'un sait, Jessica, et je ne comprends pas comment, parce que cette cantine est fermée à clé dans le grenier et je suis la seule personne vivante à l'avoir jamais ouverte. La seule. Alors comment ? »</w:t>
+        <w:t xml:space="preserve">« Mais tu ne comprends pas ? » Elle a secoué la tête, angoissée. « Peu importe ce qui est vrai chez moi. Ce qui compte, c'est ce qu'ils peuvent raconter. Si ça s'ébruite, ça détruit tout. Le nom de l'auberge. Le nom de ma famille. Cent ans de travail, anéantis à cause d'une fille que je n'ai jamais connue et d'un acte que je n'ai jamais commis. » Elle a fait un geste vers le mot. « Et maintenant, quelqu'un sait. Quelqu'un sait, Jessica, et je ne comprends pas comment, parce que ce coffre est fermé à clé dans le grenier et je suis la seule personne vivante à l'avoir jamais ouverte. La seule. Alors comment ? »</w:t>
       </w:r>
     </w:p>
     <w:p>
@@ -704,12 +704,12 @@
     </w:p>
     <w:p>
       <w:r>
-        <w:t>« Jamais. » Elle a secoué énergiquement la tête, catégorique. « Jamais, je te le jure. L'endroit où elle l'a vendu n'est écrit nulle part à ma connaissance, sauf sur le reçu dans ma cantine. Et que c'était un saphir, ça n'est consigné que dans les vieilles lettres, et elles sont dans la cantine aussi. Fermées à clé. Intouchées. »</w:t>
-      </w:r>
-    </w:p>
-    <w:p>
-      <w:r>
-        <w:t>« Alors réfléchis un instant avec moi, ai-je dit, parce que c'est plus important que tout. Quiconque a écrit ce mot sait ce qu'il y avait dans cette cantine verrouillée. Et il n'y a que deux façons pour quelqu'un de savoir ce que contient une boîte fermée à clé que toi seule as ouverte. Soit cette personne est parvenue d'une manière ou d'une autre à s'introduire dans ta cantine, ce qui, d'après toi, est impossible. » J'ai levé un doigt. « Soit elle est parvenue au même secret par l'autre côté. Du côté des Blackburn. Parce que les Blackburn ont bien perdu une broche en 1924, n'est-ce pas ? Une famille pareille, ils ont dû l'écrire. Une lettre, des comptes de maison, un mot pour l'assureur, n'importe quoi. Leur version de l'histoire existe quelque part, indépendamment de la tienne. »</w:t>
+        <w:t xml:space="preserve">« Jamais. » Elle a secoué énergiquement la tête, catégorique. « Jamais, je te le jure. L'endroit où elle l'a vendu n'est écrit nulle part à ma connaissance, sauf sur le reçu dans mon coffre. Et que c'était un saphir, ça n'est consigné que dans les vieilles lettres, et elles sont dans le coffre aussi. Fermées à clé. Intouchées. »</w:t>
+      </w:r>
+    </w:p>
+    <w:p>
+      <w:r>
+        <w:t xml:space="preserve">« Alors réfléchis un instant avec moi, ai-je dit, parce que c'est plus important que tout. Quiconque a écrit ce mot sait ce qu'il y avait dans ce coffre verrouillé. Et il n'y a que deux façons pour quelqu'un de savoir ce que contient une boîte fermée à clé que toi seule as ouverte. Soit cette personne est parvenue d'une manière ou d'une autre à s'introduire dans ton coffre, ce qui, d'après toi, est impossible. » J'ai levé un doigt. « Soit elle est parvenue au même secret par l'autre côté. Du côté des Blackburn. Parce que les Blackburn ont bien perdu une broche en 1924, n'est-ce pas ? Une famille pareille, ils ont dû l'écrire. Une lettre, des comptes de maison, un mot pour l'assureur, n'importe quoi. Leur version de l'histoire existe quelque part, indépendamment de la tienne. »</w:t>
       </w:r>
     </w:p>
     <w:p>
@@ -724,12 +724,12 @@
     </w:p>
     <w:p>
       <w:r>
-        <w:t>« La Société Historique. » Elle l'a prononcé presque à voix basse. « Theo a des cartons de trucs ayant appartenu aux Blackburn. Il les a depuis des ans. Il passe ses journées et ses nuits dans ces archives à préparer l'exposition. » Sa main s'est portée de nouveau vers sa poitrine. « Oh, mais Jessica. Non. Pas Theo. Je refuse de croire que Theo ferait ça. Il apporte du cacao aux enfants. Il a pleuré à la lecture de la fête des fondateurs il y a deux ans. Pas Theo. »</w:t>
-      </w:r>
-    </w:p>
-    <w:p>
-      <w:r>
-        <w:t>« Je ne te demande pas de croire quoi que ce soit sur qui que ce soit pour l'instant, ai-je dit doucement. Je demande seulement d'où a pu venir ce savoir. Et il y a deux endroits, dont l'un est une cantine que toi seule peux ouvrir. Ce n'est pas une accusation. » J'ai plié le mot le long de ses plis usés, avec précaution, et je l'ai regardée. « Je peux les garder ? Le mot et la photo. Le mot pourrait nous en dire plus que son auteur ne le pensait. »</w:t>
+        <w:t xml:space="preserve">« La Société historique. » Elle l'a prononcé presque à voix basse. « Theo a des cartons de trucs ayant appartenu aux Blackburn. Il les a depuis des années. Il passe ses journées et ses nuits dans ces archives à préparer l'exposition. » Sa main s'est portée de nouveau vers sa poitrine. « Oh, mais Jessica. Non. Pas Theo. Je refuse de croire que Theo ferait ça. Il apporte du cacao aux enfants. Il a pleuré à la lecture de la fête des fondateurs il y a deux ans. Pas Theo. »</w:t>
+      </w:r>
+    </w:p>
+    <w:p>
+      <w:r>
+        <w:t xml:space="preserve">« Je ne te demande pas de croire quoi que ce soit sur qui que ce soit pour l'instant, ai-je dit doucement. Je demande seulement d'où a pu venir ce savoir. Et il y a deux endroits, dont l'un est un coffre que toi seule peux ouvrir. Ce n'est pas une accusation. » J'ai plié le mot le long de ses plis usés, avec précaution, et je l'ai regardée. « Je peux les garder ? Le mot et la photo. Le mot pourrait nous en dire plus que son auteur ne le pensait. »</w:t>
       </w:r>
     </w:p>
     <w:p>
@@ -774,7 +774,7 @@
     </w:p>
     <w:p>
       <w:r>
-        <w:t>« Pip, ai-je dit en descendant les marches étincelantes de givre. On va à la Société Historique. Pas aujourd'hui. Je veux réfléchir d'abord, et parler à Nick. Mais bientôt. On va aller se tenir au milieu des cartons, et on va découvrir qui est venu y fourrer son nez. »</w:t>
+        <w:t xml:space="preserve">« Pip, ai-je dit en descendant les marches étincelantes de givre. On va à la Société historique. Pas aujourd'hui. Je veux réfléchir d'abord, et parler à Nick. Mais bientôt. On va aller se tenir au milieu des cartons, et on va découvrir qui est venu y fourrer son nez. »</w:t>
       </w:r>
     </w:p>
     <w:p>
@@ -796,7 +796,7 @@
     <w:p/>
     <w:p>
       <w:r>
-        <w:t>Nick savait me lire d'un bout à l'autre d'une pièce. Je suis entrée en piétinant pour chasser le froid de mes bottes, et il a jeté un seul coup d'œil à mon visage sans poser une seule question. Il a servi deux louches d'un bouillon contenant de l'orge, des carottes et les derniers poireaux d'automne, les a posés sur la table de la cuisine et a tiré ma chaise. Il a attendu que j'aie pris trois cuillerées avant de hausser le moindre sourcil.</w:t>
+        <w:t xml:space="preserve">Nick savait me lire d'un bout à l'autre d'une pièce. Je suis entrée en piétinant pour chasser le froid de mes bottes, et il a jeté un seul coup d'œil à mon visage sans poser une seule question. Il a servi deux bols d'un bouillon contenant de l'orge, des carottes et les derniers poireaux d'automne, les a posés sur la table de la cuisine et a tiré ma chaise. Il a attendu que j'aie pris trois cuillerées avant de hausser le moindre sourcil.</w:t>
       </w:r>
     </w:p>
     <w:p/>
@@ -832,7 +832,7 @@
     <w:p/>
     <w:p>
       <w:r>
-        <w:t>« Là où tout ce qui est ancien dans cette ville finit par atterrir. » Il a hoché la tête lentement. « Les archives de Theo. La Société Historique. »</w:t>
+        <w:t xml:space="preserve">« Là où tout ce qui est ancien dans cette ville finit par atterrir. » Il a hoché la tête lentement. « Les archives de Theo. La Société historique. »</w:t>
       </w:r>
     </w:p>
     <w:p/>
@@ -904,7 +904,7 @@
     <w:p/>
     <w:p>
       <w:r>
-        <w:t>« Qu'est-ce que tu fabriques là-dedans ? » lui ai-je demandé en m'essuyant les mains. Je le lui avais déjà demandé. Il y passait des semaines, s'éclipsant après le souper muni d'une lanterne, en fredonnant, et rentrant tard en sentant le pin coupé et quelque chose de plus chaud que je ne parvenais pas à nommer.</w:t>
+        <w:t xml:space="preserve">« Qu'est-ce que tu fabriques là-dedans ? » lui ai-je demandé en m'essuyant les mains. Je le lui avais déjà demandé. Il y travaillait depuis des semaines, s'éclipsant après le souper muni d'une lanterne, en fredonnant, et rentrant tard en sentant le pin coupé et quelque chose de plus chaud que je ne parvenais pas à nommer.</w:t>
       </w:r>
     </w:p>
     <w:p/>
@@ -1041,7 +1041,7 @@
     <w:p/>
     <w:p>
       <w:r>
-        <w:t xml:space="preserve">La Société d’histoire de Frost Falls était un bâtiment de brique étroit sur la place, et le matin où l’exposition d’archives a ouvert, j’y ai vu plus de gens entrer et sortir que jamais auparavant. Le trottoir devant était un fleuve lent de manteaux. Quelqu’un avait suspendu au-dessus de la porte une banderole peinte à la main, </w:t>
+        <w:t xml:space="preserve">La Société historique de Frost Falls était un bâtiment de brique étroit sur la place, et le matin où l’exposition d’archives a ouvert, j’y ai vu plus de gens entrer et sortir que jamais auparavant. Le trottoir devant était un fleuve lent de manteaux. Quelqu’un avait suspendu au-dessus de la porte une banderole peinte à la main, </w:t>
       </w:r>
       <w:r>
         <w:rPr>
@@ -1126,22 +1126,22 @@
         <w:rPr>
           <w:i/>
         </w:rPr>
-        <w:t>From the Blackburn Family Papers, 1910–1930. On loan to the people of Frost Falls.</w:t>
-      </w:r>
-    </w:p>
-    <w:p>
-      <w:r>
-        <w:t>« Mrs. Claus. » Neil n’a pas levé les yeux du verre. « C’est fascinant, tout cela. Votre Mr. Hussein a rendu un fier service à la ville, que la ville le sache ou non. Regarde ça. » Il a pointé la vitrine du doigt, sans tout à fait toucher la vitre. « Toute une correspondance suivie sur la maisonnée. Qui a été embauché, qui a été renvoyé, ce qui a été acheté, ce qui a été vendu. » Il a tourné la tête alors, et le sourire est apparu. « Ce qui a été perdu. »</w:t>
-      </w:r>
-    </w:p>
-    <w:p>
-      <w:r>
-        <w:t>« Tu cours toujours après ta broche, ai-je dit. »</w:t>
-      </w:r>
-    </w:p>
-    <w:p>
-      <w:r>
-        <w:t>« Je cours toujours après ma broche. C’est mon travail. » Il s’est redressé en glissant le carnet sous son bras. « Un homme est venu me voir à la table de cidre à l’instant pour me raconter que les Blackburn possédaient jadis la moitié de Maple Street. Tu savais ça ? Les gens adorent vous raconter ce que les familles riches possédaient. Ils sont incapables de vous dire ce que les familles riches ont fait aux gens qui travaillaient pour elles. Cette partie-là n’entre pas dans les archives familiales. » Il a fait un signe de tête vers la vitre. « C’est curieux, non ? Vingt ans de lettres et pas une seule écrite par une bonne. »</w:t>
+        <w:t xml:space="preserve">Extrait des papiers de la famille Blackburn, 1910–1930. Prêté aux habitants de Frost Falls.</w:t>
+      </w:r>
+    </w:p>
+    <w:p>
+      <w:r>
+        <w:t xml:space="preserve">« Madame Claus. » Neil n’a pas levé les yeux du verre. « C’est fascinant, tout cela. Votre M. Hussein a rendu un fier service à la ville, que la ville le sache ou non. Regardez ça. » Il a pointé la vitrine du doigt, sans tout à fait toucher la vitre. « Toute une correspondance suivie sur la maisonnée. Qui a été embauché, qui a été renvoyé, ce qui a été acheté, ce qui a été vendu. » Il a tourné la tête alors, et le sourire est apparu. « Ce qui a été perdu. »</w:t>
+      </w:r>
+    </w:p>
+    <w:p>
+      <w:r>
+        <w:t xml:space="preserve">« Vous courez toujours après votre broche, ai-je dit. »</w:t>
+      </w:r>
+    </w:p>
+    <w:p>
+      <w:r>
+        <w:t xml:space="preserve">« Je cours toujours après ma broche. C’est mon travail. » Il s’est redressé en glissant le carnet sous son bras. « Un homme est venu me voir à la table de cidre à l’instant pour me raconter que les Blackburn possédaient jadis la moitié de Maple Street. Vous saviez ça ? Les gens adorent vous raconter ce que les familles riches possédaient. Ils sont incapables de vous dire ce que les familles riches ont fait aux gens qui travaillaient pour elles. Cette partie-là n’entre pas dans les archives familiales. » Il a fait un signe de tête vers la vitre. « C’est curieux, non ? Vingt ans de lettres et pas une seule écrite par une bonne. »</w:t>
       </w:r>
     </w:p>
     <w:p>
@@ -1151,12 +1151,12 @@
     </w:p>
     <w:p>
       <w:r>
-        <w:t>Puis Theo a fait tinter une cuillère contre un verre à l’avant de la pièce. La foule s’est tournée en faisant silence, et il a prononcé ses quelques mots, qui n’étaient pas brefs. Theo ne pouvait rien dire brièvement sur le passé. Il a remercié ses bénévoles par leur nom, chacun d’eux, y compris une Mrs. Pelletier qui avait apparemment trié des photographies trois week-ends d’affilée et était devenue écarlate d’être mentionnée. Il a remercié la ville. Il a remercié, la voix nouée, « tous ceux qui ont un jour conservé une lettre au lieu de la jeter, car l’histoire se résume à cela, en fin de compte, aux choses que les gens n’ont pas eu le cœur de jeter ».</w:t>
-      </w:r>
-    </w:p>
-    <w:p>
-      <w:r>
-        <w:t>Et puis il a prononcé la phrase qui m’a pénétrée comme une écharde sous un onglet.</w:t>
+        <w:t xml:space="preserve">Puis Theo a fait tinter une cuillère contre un verre à l’avant de la pièce. La foule s’est tournée en faisant silence, et il a prononcé ses quelques mots, qui n’étaient pas brefs. Theo ne pouvait rien dire brièvement sur le passé. Il a remercié ses bénévoles par leur nom, chacun d’eux, y compris une certaine Mme Pelletier qui avait apparemment trié des photographies trois week-ends d’affilée et était devenue écarlate d’être mentionnée. Il a remercié la ville. Il a remercié, la voix nouée, « tous ceux qui ont un jour conservé une lettre au lieu de la jeter, car l’histoire se résume à cela, en fin de compte, aux choses que les gens n’ont pas eu le cœur de jeter ».</w:t>
+      </w:r>
+    </w:p>
+    <w:p>
+      <w:r>
+        <w:t xml:space="preserve">Et puis il a prononcé la phrase qui m’a pénétrée comme une écharde sous un ongle.</w:t>
       </w:r>
     </w:p>
     <w:p>
@@ -1196,7 +1196,7 @@
     </w:p>
     <w:p>
       <w:r>
-        <w:t>Je n’ai pas touché la pile. Je n’ai pas même ralenti à côté. J’ai simplement regardé, une seule fois, en gardant le visage détendu, et j’ai avancé vers le cidre comme si le papier était la dernière chose au monde qui m’préoccupait.</w:t>
+        <w:t xml:space="preserve">Je n’ai pas touché la pile. Je n’ai pas même ralenti à côté. J’ai simplement regardé, une seule fois, en gardant le visage détendu, et j’ai avancé vers le cidre comme si le papier était la dernière chose au monde qui me préoccupait.</w:t>
       </w:r>
     </w:p>
     <w:p>
@@ -1216,7 +1216,7 @@
     </w:p>
     <w:p>
       <w:r>
-        <w:t>Mais je l’ai tout de même replié dans la poche de mon manteau, à côté de la note. Je me suis redressée et j’ai jeté un dernier regard sur la pièce chaleureuse et bondée. Sur Theo, accroupi à présent près de la table de cidre, racontant à un petit garçon la fondation de la ville de tout son cœur fatigué, les yeux du gamin écarquillés. Sur Vera, près du bureau, réalignant sa boîte de papiers d’un dernier quart de pouce. Sur Neil Carter, près de la vitre, écrivant quelque chose dans son carnet. Et sur la pile de papier couleur crème près du coude de Vera, accrochant la lumière.</w:t>
+        <w:t xml:space="preserve">Mais je l’ai tout de même replié dans la poche de mon manteau, à côté de la note. Je me suis redressée et j’ai jeté un dernier regard sur la pièce chaleureuse et bondée. Sur Theo, accroupi à présent près de la table de cidre, racontant à un petit garçon la fondation de la ville de tout son cœur fatigué, les yeux du gamin écarquillés. Sur Vera, près du bureau, réalignant sa boîte de papiers d’un dernier demi-centimètre. Sur Neil Carter, près de la vitre, écrivant quelque chose dans son carnet. Et sur la pile de papier couleur crème près du coude de Vera, accrochant la lumière.</w:t>
       </w:r>
     </w:p>
     <w:p>
@@ -1257,7 +1257,7 @@
     </w:p>
     <w:p>
       <w:r>
-        <w:t>« Nous ne les aurons pas finies à temps, a-t-elle dit, non sans humour, en énonçant simplement un fait, comme elle le faisait pour tout. Pas avec le festival avancé au week-end prochain. »</w:t>
+        <w:t xml:space="preserve">« Nous ne les aurons pas finies à temps, a-t-elle dit, sans s'en désoler, en énonçant simplement un fait, comme elle le faisait pour tout. Pas avec le festival avancé au week-end prochain. »</w:t>
       </w:r>
     </w:p>
     <w:p>
@@ -1272,7 +1272,7 @@
     </w:p>
     <w:p>
       <w:r>
-        <w:t>« Tu tricotages comme une femme payée à l'heure. »</w:t>
+        <w:t xml:space="preserve">« Tu tricotes comme une femme payée à l'heure. »</w:t>
       </w:r>
     </w:p>
     <w:p>
@@ -1302,7 +1302,7 @@
     </w:p>
     <w:p>
       <w:r>
-        <w:t>« Il ne dort pas, a dit Martha, et la platitude de sa voix a fait lever les yeux à tout le monde. Martha avait enseigné dans cette ville pendant quarante ans, et elle avait une façon de poser un fait brut sur la table pour que chacun puisse le voir, clairement, sans fioritures. Je lui ai apporté un gratin mardi soir. La porte n'était pas fermée à clé, alors je suis entrée, et je l'ai trouvé endormi à son bureau au fond, avec ses lunettes encore sur le nez et, à côté de lui, un sandwich durci qu'il n'avait jamais touché. Je n'ai pas eu le cœur de le réveiller. J'ai posé le gratin et un mot, puis je me suis éclipsée. » Elle a repris une maille. « Il vit là-bas. Dans ce bâtiment. Il a arrêté de rentrer chez lui. »</w:t>
+        <w:t xml:space="preserve">« Il ne dort pas », a dit Martha, et la platitude de sa voix a fait lever les yeux à tout le monde. Martha avait enseigné dans cette ville pendant quarante ans, et elle avait une façon de poser un fait brut sur la table pour que chacun puisse le voir, clairement, sans fioritures. « Je lui ai apporté un gratin mardi soir. La porte n'était pas fermée à clé, alors je suis entrée, et je l'ai trouvé endormi à son bureau au fond, avec ses lunettes encore sur le nez et, à côté de lui, un sandwich durci qu'il n'avait jamais touché. Je n'ai pas eu le cœur de le réveiller. J'ai posé le gratin et un mot, puis je me suis éclipsée. » Elle a repris une maille. « Il vit là-bas. Dans ce bâtiment. Il a arrêté de rentrer chez lui. »</w:t>
       </w:r>
     </w:p>
     <w:p>
@@ -1312,7 +1312,7 @@
     </w:p>
     <w:p>
       <w:r>
-        <w:t>« Ce n'est pas l'exposition. » Martha a posé ses aiguilles sur ses genoux. « C'est l'argent. La Société est fauchée, Jessica. Vraiment fauchée. Je le tiens de Theo lui-même, l'été dernier, avant qu'il ne cesse de l'admettre à qui que ce soit. Ils n'ont pas de dotation digne de ce nom. Ils n'en ont jamais eu. Ils se débrouillaient avec une petite subvention de la ville et ce qu'ils récoltaient à la foire estivale, jusqu'à ce que la ville supprime la subvention il y a deux budgets. Le toit des pièces du fond laisse entrer l'eau à chaque pluie. La chaudière est plus âgée que moi. Et il a fait des demandes auprès de tous les fonds et fondations de trois États. » Elle a secoué lentement la tête. « Refusé. Refusé. Refusé. J'ai vu les lettres arriver. Il m'en a montré une, une seule, et puis il a arrêté de m'en montrer. »</w:t>
+        <w:t xml:space="preserve">« Ce n'est pas l'exposition. » Martha a posé ses aiguilles sur ses genoux. « C'est l'argent. La Société est fauchée, Jessica. Vraiment fauchée. Je le tiens de Theo lui-même, au printemps dernier, avant qu'il ne cesse de l'admettre à qui que ce soit. Ils n'ont pas de dotation digne de ce nom. Ils n'en ont jamais eu. Ils se débrouillaient avec une petite subvention de la ville et ce qu'ils récoltaient à la foire estivale, jusqu'à ce que la ville supprime la subvention il y a deux budgets. Le toit des pièces du fond laisse entrer l'eau à chaque pluie. La chaudière est plus âgée que moi. Et il a fait des demandes auprès de tous les fonds et fondations de trois États. » Elle a secoué lentement la tête. « Refusé. Refusé. Refusé. J'ai vu les lettres arriver. Il m'en a montré une, une seule, et puis il a arrêté de m'en montrer. »</w:t>
       </w:r>
     </w:p>
     <w:p>
@@ -1387,7 +1387,7 @@
     </w:p>
     <w:p>
       <w:r>
-        <w:t>Cela m'a poignée en plein cœur. C'était Martha Green, qui avait enterré un mari et enseigné l'alphabet à la moitié de Frost Falls, qui me disait que j'avais ma place ici au point de pouvoir m'appuyer sur les autres.</w:t>
+        <w:t xml:space="preserve">Cela m'a prise à la gorge. C'était Martha Green, qui avait enterré un mari et enseigné l'alphabet à la moitié de Frost Falls, qui me disait que j'avais ma place ici au point de pouvoir m'appuyer sur les autres.</w:t>
       </w:r>
     </w:p>
     <w:p>
@@ -1402,7 +1402,7 @@
     </w:p>
     <w:p>
       <w:r>
-        <w:t>Quand Pip et moi sommes parties, une heure plus tard, la lumière s'était amincie pour prendre la couleur d'un thé léger, et les hommes étaient de retour sur la pelouse pour tendre les dernières guirlandes du festival entre les lampadaires, s'appelant les uns les autres dans le froid. Je me suis arrêtée à l'angle pour les observer un instant, les nouveaux fils s'élevant dans l'obscurité, et j'ai pensé à l'argent.</w:t>
+        <w:t xml:space="preserve">Quand Pip et moi sommes parties, une heure plus tard, la lumière s'était amincie pour prendre la couleur d'un thé léger, et les hommes étaient de retour sur la pelouse pour tendre les dernières guirlandes du festival entre les lampadaires, s'appelant les uns les autres dans le froid. Je me suis arrêtée à l'angle pour les observer un instant, les nouvelles guirlandes montant encore éteintes, et j'ai pensé à l'argent.</w:t>
       </w:r>
     </w:p>
     <w:p>
@@ -1433,7 +1433,7 @@
     </w:p>
     <w:p>
       <w:r>
-        <w:t>La place du village était l'endroit où le festival allait avoir lieu, le grand terrain vague au sud d'Evergreen qui descendait depuis le carré, avec le monument aux morts tout en haut et le grand orme à l'autre bout. Toute la ville s'était mobilisée pour l'habiller. Il y avait des tables tréteaux à porter et à aligner en rangées, une estrade à monter à l'extrémité nord, et ce qui ressemblait à un millier de petits cucurbitacés à arranger pour leur donner un air faussement négligé. En réalité, un comité allait s'en formaliser pendant une heure. J'étais venue seulement pour déposer la première douzaine de mitaines du cercle auprès du comité du festival, et quatre-vingt-dix secondes après mon arrivée, un homme que je ne connaissais pas m'avait fourré dans les bras une caisse de citrouilles à tarte en me disant : « Tu me poserais ça le long de l'estrade, s'il te plaît ? Fais attention à celle qui est molle. » C'était comme ça que les choses se passaient dans cette ville, et cela ne me dérangeait pas le moins du monde. Il n'y avait pas de place pour les réflexions avec une caisse de citrouilles dans les bras, et cela m'allait très bien.</w:t>
+        <w:t xml:space="preserve">La place du village était l'endroit où le festival allait avoir lieu, le grand pré communal au sud d'Evergreen qui descendait depuis le square, avec le monument aux morts tout en haut et le grand orme à l'autre bout. Toute la ville s'était mobilisée pour l'habiller. Il y avait des tables tréteaux à porter et à aligner en rangées, une estrade à monter à l'extrémité nord, et ce qui ressemblait à un millier de petits cucurbitacés à arranger pour leur donner un air faussement négligé. En réalité, un comité allait le peaufiner pendant une heure. J'étais venue seulement pour déposer la première douzaine de mitaines du cercle auprès du comité du festival, et quatre-vingt-dix secondes après mon arrivée, un homme que je ne connaissais pas m'avait fourré dans les bras une caisse de citrouilles à tarte en me disant : « Vous me poseriez ça le long de l'estrade, s'il vous plaît ? Faites attention à celle qui est molle. » C'était comme ça que les choses se passaient dans cette ville, et cela ne me dérangeait pas le moins du monde. Il n'y avait pas de place pour les réflexions avec une caisse de citrouilles dans les bras, et cela m'allait très bien.</w:t>
       </w:r>
     </w:p>
     <w:p>
@@ -1553,7 +1553,7 @@
     </w:p>
     <w:p>
       <w:r>
-        <w:t>— C'est à ça qu'sert une ville, Mark, ai-je dit. Tu le feras pour le prochain.</w:t>
+        <w:t xml:space="preserve">— C'est à ça que sert une ville, Mark, ai-je dit. Tu le feras pour le prochain.</w:t>
       </w:r>
     </w:p>
     <w:p>
@@ -1563,7 +1563,7 @@
     </w:p>
     <w:p>
       <w:r>
-        <w:t>Les mitaines étaient toujours dans mon sac. Je suis partie à la recherche de la personne qui dirigeait le comité et j'ai trouvé la chef de la police. Noriko Tanaka se tenait au milieu de la place, vêtue d'une parka et d'un bonnet de laine, un presse-papiers dans une main et un gobelet isotherme dans l'autre, pour envoyer les gens là où on avait besoin d'eux. C'était une femme trapue d'environ cinquante ans aux tempes grisonnantes, avec un carnet usé dépassant de la poche de son manteau. Olivia m'avait raconté qu'elle était rentrée au pays après vingt ans passés dans la police d'État pour diriger un service de six personnes, et que personne à Frost Falls ne l'avait jamais entendue élever la voix.</w:t>
+        <w:t xml:space="preserve">Les mitaines étaient toujours dans mon sac. Je suis partie à la recherche de la personne qui dirigeait le comité et j'ai trouvé la chef de la police. Noriko Tanaka se tenait au milieu de la place, vêtue d'une parka et d'un bonnet de laine, un porte-bloc dans une main et un gobelet isotherme dans l'autre, pour envoyer les gens là où on avait besoin d'eux. C'était une femme trapue d'environ cinquante ans aux tempes grisonnantes, avec un carnet usé dépassant de la poche de son manteau. Olivia m'avait raconté qu'elle était rentrée au pays après vingt ans passés dans la police d'État pour diriger un service de six personnes, et que personne à Frost Falls ne l'avait jamais entendue élever la voix.</w:t>
       </w:r>
     </w:p>
     <w:p>
@@ -1603,7 +1603,7 @@
     </w:p>
     <w:p>
       <w:r>
-        <w:t>Pip était venue inspecter le clip brillant du presse-papiers. Noriko l'a écarté hors de sa portée sans baisser les yeux et est retournée à sa liste.</w:t>
+        <w:t xml:space="preserve">Pip était venue inspecter la pince brillante du porte-bloc. Noriko l'a écarté hors de sa portée sans baisser les yeux et est retournée à sa liste.</w:t>
       </w:r>
     </w:p>
     <w:p>
@@ -1704,7 +1704,7 @@
     </w:p>
     <w:p>
       <w:r>
-        <w:t>J'ai apporté de la soupe cette fois, pas de tarte : la soupe à l'orge de Nick, dans la belle terrine à couvercle. J'ai trouvé Fiona dans la salle à manger munie d'un sous-main à pince, en train de compter les chaises à voix basse, et quand elle a vu la terrine dans mes bras, son visage s'est détendu, juste un tout petit peu.</w:t>
+        <w:t xml:space="preserve">J'ai apporté de la soupe cette fois, pas de tarte : la soupe à l'orge de Nick, dans la belle terrine à couvercle. J'ai trouvé Fiona dans la salle à manger munie d'un porte-bloc, en train de compter les chaises à voix basse, et quand elle a vu la terrine dans mes bras, son visage s'est détendu, juste un tout petit peu.</w:t>
       </w:r>
     </w:p>
     <w:p>
@@ -1724,7 +1724,7 @@
     </w:p>
     <w:p>
       <w:r>
-        <w:t>« Je n'arrête pas de penser à elle, a-t-elle dit après un moment, en posant sa cuillère. Constance. Je n'y pensais jamais. C'était juste un nom sur un mur, un visage sérieux dans un cadre. Et maintenant, je ne pense qu'à ça. Cette jeune fille, et ce qu'elle a fait, et ce que ça m'a fait cent ans plus tard. » Elle a poussé un petit rire amer. « C'comique, non ? J'ai passé toute ma vie à vivre dans sa maison et je n'ai jamais cherché à la connaître. Viens voir. Je veux te montrer quelque chose. »</w:t>
+        <w:t xml:space="preserve">« Je n'arrête pas de penser à elle, a-t-elle dit après un moment, en posant sa cuillère. Constance. Je n'y pensais jamais. C'était juste un nom sur un mur, un visage sérieux dans un cadre. Et maintenant, je ne pense qu'à ça. Cette jeune fille, et ce qu'elle a fait, et ce que ça m'a fait cent ans plus tard. » Elle a poussé un petit rire amer. « C'est comique, non ? J'ai passé toute ma vie à vivre dans sa maison et je n'ai jamais cherché à la connaître. Viens voir. Je veux te montrer quelque chose. »</w:t>
       </w:r>
     </w:p>
     <w:p>
@@ -1739,7 +1739,7 @@
     </w:p>
     <w:p>
       <w:r>
-        <w:t>J'ai regardé, et Fiona avait raison. Il y a avait beaucoup de choses dans ce jeune visage, mais la cruauté n'en faisait pas partie. Il y avait de la peur, contenue avec force. Il y avait un pli obstiné dans la mâchoire, et sous les deux, une sorte de courage fatigué, le courage de quelqu'un à qui il ne reste plus une seule bonne option et qui a dû en prendre une mauvaise avec bravoure.</w:t>
+        <w:t xml:space="preserve">J'ai regardé, et Fiona avait raison. Il y avait beaucoup de choses dans ce jeune visage, mais la cruauté n'en faisait pas partie. Il y avait de la peur, contenue avec force. Il y avait un pli obstiné dans la mâchoire, et sous les deux, une sorte de courage fatigué, le courage de quelqu'un à qui il ne reste plus une seule bonne option et qui a dû en prendre une mauvaise avec bravoure.</w:t>
       </w:r>
     </w:p>
     <w:p>
@@ -1795,7 +1795,7 @@
     <w:p/>
     <w:p>
       <w:r>
-        <w:t>La forge se trouvait à la lisière de la ville, là où l'avenue Evergreen cessait d'être une rue pour devenir une route, le tout dernier bâtiment avant les collines, et on l'entendait bien avant de la voir. Le tintement du marteau sur le fer portait, clair et limpide, à travers la froide matinée, un son doté d'une forme qui allait s'amplifiant et s'amenuisant. En dessous grondait le sourd vrombissement du feu. Lorsqu'elle apparut enfin, la bâtisse se révéla sous la forme d'un long hangar bas, ouvert sur un côté. En m'approchant de cette ouverture, la chaleur de la forge m'a frappée, jaillissant dans la fraîcheur d'octobre, et avec elle est venue l'odeur.</w:t>
+        <w:t xml:space="preserve">La forge se trouvait à la lisière de la ville, là où Evergreen Avenue cessait d'être une rue pour devenir une route, le tout dernier bâtiment avant les collines, et on l'entendait bien avant de la voir. Le tintement du marteau sur le fer portait, clair et limpide, à travers la froide matinée, un son doté d'une forme qui allait s'amplifiant et s'amenuisant. En dessous grondait le sourd vrombissement du feu. Lorsqu'elle apparut enfin, la bâtisse se révéla sous la forme d'un long hangar bas, ouvert sur un côté. En m'approchant de cette ouverture, la chaleur de la forge m'a frappée, jaillissant dans la fraîcheur d'octobre, et avec elle est venue l'odeur.</w:t>
       </w:r>
     </w:p>
     <w:p/>
@@ -1831,7 +1831,7 @@
     <w:p/>
     <w:p>
       <w:r>
-        <w:t>« Le festival donne du fil à retordre à un forgeron. » Il est revenu avec le bougeoir que j'avais commandé pour me servir de prétexte, une fine volute de fer noir conçue pour porter une seule bougie, le métal s'étirant en une longue spirale souple, semblable à une liane. C'était ravissant, et je le lui ai dit en le faisant tournoyer dans la lumière. La petite fierté honnête de cette réussite a traversé son visage avant de s'effacer.</w:t>
+        <w:t xml:space="preserve">« Le festival donne du travail à un forgeron. » Il est revenu avec le bougeoir que j'avais commandé pour me servir de prétexte, une fine volute de fer noir conçue pour porter une seule bougie, le métal s'étirant en une longue spirale souple, semblable à une liane. C'était ravissant, et je le lui ai dit en le faisant tournoyer dans la lumière. La petite fierté honnête de cette réussite a traversé son visage avant de s'effacer.</w:t>
       </w:r>
     </w:p>
     <w:p/>
@@ -1843,13 +1843,13 @@
     <w:p/>
     <w:p>
       <w:r>
-        <w:t>« C'est vous qui avez fait l'auberge, ai-je dit d'un ton détendu en retournant le bougeoir. Tout ce travail en fer forgé dans le hall de Fiona. Les étoiles sur le manteau de la cheminée, les appliques des lampes, l'écran pare-feu. »</w:t>
-      </w:r>
-    </w:p>
-    <w:p/>
-    <w:p>
-      <w:r>
-        <w:t>« Tout cela. » Sa mâchoire s'est contractée, et il a empoigné un chiffon pour le frotter sur une paire de pinces qui étaient pourtant déjà propres. « Non pas que j'aie touché un centime pour la dernière partie. Vingt dollars, c'est ce qu'elle me doit. Je sais ce que ça a l'air. Un homme fait qui radote pour vingt dollars, comme un gamin à qui l'on doit son argent de poche. Ce n'est pas une question d'argent. »</w:t>
+        <w:t xml:space="preserve">« C'est vous qui avez fait l'auberge, ai-je dit d'un ton détendu en retournant le bougeoir. Tout ce travail en fer forgé dans le hall de Fiona. Les étoiles sur le manteau de la cheminée, les appliques des lampes, le pare-étincelles. »</w:t>
+      </w:r>
+    </w:p>
+    <w:p/>
+    <w:p>
+      <w:r>
+        <w:t xml:space="preserve">« Tout cela. » Sa mâchoire s'est contractée, et il a empoigné un chiffon pour le frotter sur une paire de pinces qui étaient pourtant déjà propres. « Non pas que j'aie touché un centime pour la dernière partie. Vingt dollars, c'est ce qu'elle me doit. Je sais de quoi ça a l'air. Un homme fait qui radote pour vingt dollars, comme un gamin à qui l'on doit son argent de poche. Ce n'est pas une question d'argent. »</w:t>
       </w:r>
     </w:p>
     <w:p/>
@@ -1885,13 +1885,13 @@
     <w:p/>
     <w:p>
       <w:r>
-        <w:t>« Tout le monde est sur les rotules chaque année. » Il a enfin posé son chiffon et m'a regardée droit dans les yeux. « Ça ne me dérange pas d'attendre mon dû de la part d'une amie qui galère, madame Claus. Toute la ville jongle, je le sais aussi bien que n'importe qui, je fais la moitié de mon travail sur la confiance. Si elle s'était contentée de me dire : "Sam, c'est serré, laisse-moi jusqu'au printemps", j'aurais déchiré la facture en lui diciendo de n'y plus repenser. C'est ce regard fuyant que je ne supporte pas. Une femme qui manque simplement d'argent n'agit pas ainsi. Elle a honte, ou elle a peur de quelque chose, et ça n'a rien à voir avec mes vingt dollars, et je n'arrive pas à m'approcher assez pour l'aider. » Il a écarté ses mains noircies par la suie. « Est-ce qu'elle a des ennuis ? De vrais ennuis ? Parce que si c'est le cas, j'aimerais bien mieux le savoir et l'aider plutôt que de rester planté ici à ruminer pour de la menue monnaie comme un petit joueur. »</w:t>
-      </w:r>
-    </w:p>
-    <w:p/>
-    <w:p>
-      <w:r>
-        <w:t>Et cela, plus que tout le reste, a balayé le plus clair de mes soupçons, ou peu s'en faut, car un homme se livrant à de l'extorsion ne se tiendrait pas dans sa propre forge le cœur sur la main à se demander si la femme qu'il saigne va bien. Mais s'en faut de peu n'est pas certitude, et je suis restée sur mes gardes, posant la question pour laquelle j'étais venue en partie sous couvert de cette odeur.</w:t>
+        <w:t xml:space="preserve">« Tout le monde est sur les rotules chaque année. » Il a enfin posé son chiffon et m'a regardée droit dans les yeux. « Ça ne me dérange pas d'attendre mon dû de la part d'une amie qui galère, madame Claus. Toute la ville jongle, je le sais aussi bien que n'importe qui, je fais la moitié de mon travail sur la confiance. Si elle s'était contentée de me dire : "Sam, c'est serré, laisse-moi jusqu'au printemps", j'aurais déchiré la facture en lui disant de n'y plus repenser. C'est ce regard fuyant que je ne supporte pas. Une femme qui manque simplement d'argent n'agit pas ainsi. Elle a honte, ou elle a peur de quelque chose, et ça n'a rien à voir avec mes vingt dollars, et je n'arrive pas à m'approcher assez pour l'aider. » Il a écarté ses mains noircies par la suie. « Est-ce qu'elle a des ennuis ? De vrais ennuis ? Parce que si c'est le cas, j'aimerais bien mieux le savoir et l'aider plutôt que de rester planté ici à ruminer pour de la menue monnaie comme un petit joueur. »</w:t>
+      </w:r>
+    </w:p>
+    <w:p/>
+    <w:p>
+      <w:r>
+        <w:t xml:space="preserve">Et cela, plus que tout le reste, a balayé le plus clair de mes soupçons, ou peu s'en faut, car un homme se livrant à de l'extorsion ne se tiendrait pas dans sa propre forge le cœur sur la main à se demander si la femme qu'il saigne va bien. Mais à peu de chose près n'est pas certitude, et je suis restée sur mes gardes, posant la question pour laquelle j'étais venue en partie sous couvert de cette odeur.</w:t>
       </w:r>
     </w:p>
     <w:p/>
@@ -1933,13 +1933,13 @@
     <w:p/>
     <w:p>
       <w:r>
-        <w:t>Je n'ai rien laissé paraître de tout cela. Mais cela s'est sédimenté en une question valant bien plus que l'odeur elle-même. La note sentait la forge. Mais sentait-elle la forge parce que Sam Patel s'était penché dessus une plume à la main, ou parce qu'elle avait séjouné là où se trouvait le fer de Sam Patel ?</w:t>
-      </w:r>
-    </w:p>
-    <w:p/>
-    <w:p>
-      <w:r>
-        <w:t>« Merci, Sam, ai-je dit, en le payant pour le bougeoir, et je le remerciais pour bien plus que cet objet. Pour le travail. Et pour vous être enquéri d'elle de tout votre cœur. Je lui dirai que vous l'avez fait. Gentiment. »</w:t>
+        <w:t xml:space="preserve">Je n'ai rien laissé paraître de tout cela. Mais cela s'est sédimenté en une question valant bien plus que l'odeur elle-même. La note sentait la forge. Mais sentait-elle la forge parce que Sam Patel s'était penché dessus une plume à la main, ou parce qu'elle avait séjourné là où se trouvait le fer de Sam Patel ?</w:t>
+      </w:r>
+    </w:p>
+    <w:p/>
+    <w:p>
+      <w:r>
+        <w:t xml:space="preserve">« Merci, Sam, ai-je dit, en le payant pour le bougeoir, et je le remerciais pour bien plus que cet objet. Pour le travail. Et pour vous être enquis d'elle de tout votre cœur. Je lui dirai que vous l'avez fait. Gentiment. »</w:t>
       </w:r>
     </w:p>
     <w:p/>
@@ -2016,7 +2016,7 @@
     <w:p/>
     <w:p>
       <w:r>
-        <w:t>« Pas le fin mot de l'histoire. De près, pourtant. » Il avait tapoté le flanc d'une boîte. « Je sais qu'elle a quitté la maison des Blackburn au cours de l'hiver vingt-quatre. Je sais qu'elle n'est pas sortie par les portes habituelles. Aucune vente enregistrée, aucun don, aucun legs, rien d'écrit, ce qui, d'après mon expérience, signifie qu'elle est sortie par la mauvaise porte. Un vol, presque à coup sûr, même s'il est cent ans trop tard pour y changer quoi que ce soit. » Il s'était adossé à sa chaise. « Après avoir quitté la maison, la piste devient froide ici et se réchauffe plus loin, discrète, à deux villes d'ici. Un prêteur sur gages à Ridgeline. Ils tenaient des registres épouvantables, ces vieux magasins, mais ils en tenaient quelques-uns, et il y a un journal de bord de commis qui a survécu, et j'essaie de faire correspondre une date qui y figure avec l'hiver où la broche a disparu. Ensuite, j'aurai tout l'arc narratif de l'affaire, de la maison au mont-de-piété, et je pourrai tracer ma ligne, boucler mon dossier et rentrer chez moi. »</w:t>
+        <w:t xml:space="preserve">« Pas le fin mot de l'histoire. J'en suis proche, pourtant. » Il avait tapoté le flanc d'une boîte. « Je sais qu'elle a quitté la maison des Blackburn au cours de l'hiver vingt-quatre. Je sais qu'elle n'est pas sortie par les portes habituelles. Aucune vente enregistrée, aucun don, aucun legs, rien d'écrit, ce qui, d'après mon expérience, signifie qu'elle est sortie par la mauvaise porte. Un vol, presque à coup sûr, même s'il est cent ans trop tard pour y changer quoi que ce soit. » Il s'était adossé à sa chaise. « Après avoir quitté la maison, la piste devient froide ici et se réchauffe plus loin, discrète, à deux villes d'ici. Un prêteur sur gages à Ridgeline. Ils tenaient des registres épouvantables, ces vieux magasins, mais ils en tenaient quelques-uns, et il y a un journal de bord de commis qui a survécu, et j'essaie de faire correspondre une date qui y figure avec l'hiver où la broche a disparu. Ensuite, j'aurai tout l'arc narratif de l'affaire, de la maison au mont-de-piété, et je pourrai tracer ma ligne, boucler mon dossier et rentrer chez moi. »</w:t>
       </w:r>
     </w:p>
     <w:p/>
@@ -2088,7 +2088,7 @@
     <w:p/>
     <w:p>
       <w:r>
-        <w:t>Il had ri, un vrai rire, et m'avait laissée partir. J'avais pris sa carte et j'avais récupéré Pip là où elle inspectait l'étagère inférieure de la section d'histoire locale, puis nous étions rentrées toutes les deux à la maison en faisant tourner la carte encore et encore entre mes doigts.</w:t>
+        <w:t xml:space="preserve">Il avait ri, un vrai rire, et m'avait laissée partir. J'avais pris sa carte et j'avais récupéré Pip là où elle inspectait l'étagère inférieure de la section d'histoire locale, puis nous étions rentrées toutes les deux à la maison en faisant tourner la carte encore et encore entre mes doigts.</w:t>
       </w:r>
     </w:p>
     <w:p/>
@@ -2117,7 +2117,7 @@
     <w:p/>
     <w:p>
       <w:r>
-        <w:t>« Madame Claus ! » Bram a fait le tour du chalet au trot, en se tordant son bonnet entre les mains. Bram était l’elfe qui était descendu dans le Sud avec nous, le contremaître de l’atelier relocalisé, dévoué, tatillon et bâti selon les proportions générales d’une patate inquiète, et il était au summum de l’angoisse à présent. « C’est Dancer. Elle s’est échappée encore une fois. C’est la troisième fois cette semaine, madame Claus, la troisième. Et je jurerais sur chaque bouton de ma veste que ce loquet était fermé quand je l’ai laissé, fermé et vérifié, et la voilà maintenant qui mange les bons choux et refuse qu’on la conduise, et le tout ne me dit rien qui vaille, je ne vous le fais pas dire. »</w:t>
+        <w:t xml:space="preserve">« Madame Claus ! » Bram a fait le tour du chalet au trot, en tordant son bonnet entre ses mains. Bram était l’elfe qui était descendu dans le Sud avec nous, le contremaître de l’atelier relocalisé, dévoué, tatillon et bâti selon les proportions générales d’une patate inquiète, et il était au summum de l’angoisse à présent. « C’est Dancer. Elle s’est échappée encore une fois. C’est la troisième fois cette semaine, madame Claus, la troisième. Et je jurerais sur chaque bouton de ma veste que ce loquet était fermé quand je l’ai laissé, fermé et vérifié, et la voilà maintenant qui mange les bons choux et refuse qu’on la conduise, et le tout ne me dit rien qui vaille, je ne vous le fais pas dire. »</w:t>
       </w:r>
     </w:p>
     <w:p/>
@@ -2135,7 +2135,7 @@
     <w:p/>
     <w:p>
       <w:r>
-        <w:t>Il avait raison, bien sûr, même si je ne l’ai pas dit tout haut. Je suis sortie dans le jardin froid et j’ai posé ma main à plat sur l’épaule chaude de Dancer. Elle m’a laissée faire et s’est légèrement appuyée contre moi. Elle ne se serait pas laissée guider d’un seul pouce par Bram, mais je l’ai ramenée sans le moindre problème à travers le chemin en direction du paddock. Le portillon était grand ouvert, tout ce qu’il y a de plus normal. Je l’ai fait passer et j’ai abaissé le loquet. Nous sommes restés tous les trois plantés là à regarder le loquet. Il est resté fermé. Dancer a passé son museau par-dessus la lisière supérieure et a poussé un long soupir tiède à l’adresse de Bram et de moi.</w:t>
+        <w:t xml:space="preserve">Il avait raison, bien sûr, même si je ne l’ai pas dit tout haut. Je suis sortie dans le jardin froid et j’ai posé ma main à plat sur l’épaule chaude de Dancer. Elle m’a laissée faire et s’est légèrement appuyée contre moi. Elle ne se serait pas laissée guider d’un seul pouce par Bram, mais je l’ai ramenée sans le moindre problème à travers le chemin en direction du paddock. Le portillon était grand ouvert, tout ce qu’il y a de plus normal. Je l’ai fait passer et j’ai abaissé le loquet. Nous sommes restés tous les trois plantés là à regarder le loquet. Il est resté fermé. Dancer a passé son museau par-dessus la traverse supérieure et a poussé un long soupir tiède à l’adresse de Bram et de moi.</w:t>
       </w:r>
     </w:p>
     <w:p/>
@@ -2231,7 +2231,7 @@
     <w:p/>
     <w:p>
       <w:r>
-        <w:t>Pip had been nosing along the bottom rail of the paddock fence the whole while. I had the note in my coat pocket, and now she did what she'd taken to doing whenever it was near. She came to the pocket, pressed her beak flat against the outside of it and went still, the stillness she fell into when she'd caught a scent and was making certain of it. Then she turned and waddled away from me with great purpose, straight up the path to the kitchen door, and waited there until I opened it. She crossed the floor and stopped at the basket where I'd set the light holder I'd carried home from the forge that morning. She sat down beside the basket, looked back at me and chirped, once, sharp and certain as a finger pointing.</w:t>
+        <w:t xml:space="preserve">Pip avait fureté tout ce temps le long de la traverse inférieure de la clôture du paddock. J’avais le mot dans la poche de mon manteau, et elle a fait alors ce qu’elle avait pris l’habitude de faire chaque fois qu’il était à proximité. Elle est venue jusqu’à la poche, a pressé son bec à plat contre le tissu et s’est immobilisée, de cette immobilité qui la saisissait lorsqu’elle avait capté une odeur et s’assurait de sa nature. Puis elle s’est détournée et s’est éloignée de moi en se dandinant d’un air résolu, tout droit par le sentier jusqu’à la porte de la cuisine, et a attendu là que je l’ouvre. Elle a traversé la pièce et s’est arrêtée près du panier où j’avais posé le bougeoir rapporté de la forge ce matin-là. Elle s’est assise à côté du panier, s’est retournée vers moi et a poussé un petit cri, un seul, bref et assuré comme un doigt pointé.</w:t>
       </w:r>
     </w:p>
     <w:p/>
@@ -2266,7 +2266,7 @@
     <w:p/>
     <w:p>
       <w:r>
-        <w:t>La mairie était un bâtiment en brique un peu vieillot au bout de la place, avec un beffroi qui avançait de quatre minutes depuis la nuit des temps. J'y suis allée ce lundi-là avec Pip, pour deux courses, l'une bien réelle et l'autre un peu moins. La vraie course consistait à ajouter le nom du cercle sur la liste des bénévoles du festival et à demander, sans mandat d'aucun autre que celui de la ville, si Frost Falls ne pouvait pas trouver un petit peu d'argent pour la Société d'histoire avant que son toit ne s'effondre pour de bon. La course moins réelle consistait à observer, de visu et de tout près, Vera Reed.</w:t>
+        <w:t xml:space="preserve">La mairie était un bâtiment en brique un peu vieillot au bout de la place, avec un beffroi qui avançait de quatre minutes depuis la nuit des temps. J'y suis allée ce lundi-là avec Pip, pour deux courses, l'une bien réelle et l'autre un peu moins. La vraie course consistait à ajouter le nom du cercle sur la liste des bénévoles du festival et à demander, sans mandat d'aucun autre que celui de la ville, si Frost Falls ne pouvait pas trouver un petit peu d'argent pour la Société historique avant que son toit ne s'effondre pour de bon. La course moins réelle consistait à observer, de visu et de tout près, Vera Reed.</w:t>
       </w:r>
     </w:p>
     <w:p/>
@@ -2296,7 +2296,7 @@
     <w:p/>
     <w:p>
       <w:r>
-        <w:t>Il avait une minute, et il me l'a octroyée depuis son bureau impeccable sans même prendre la peine de se lever. J'ai plaidé la cause de la Société du mieux que j'ai pu. Le toit qui laissait passer l'eau dans les arrière-salles. La chaudière qui vivait son dernier hiver. Deux siècles de la mémoire de la ville qui partaient lentement en ruine faute d'une fraction de ce que la commune dépensait pour un seul week-end de festival. Je l'ai fait avec chaleur, et je l'ai fait brièvement. Claire m'avait raconté que les histoires tristes ne déridaient pas les cordons de la bourse, et j'essayais de viser quelque chose de plus solide et de plus difficile à balayer d'un revers de main que la simple tristesse.</w:t>
+        <w:t xml:space="preserve">Il avait une minute, et il me l'a octroyée depuis son bureau impeccable sans même prendre la peine de se lever. J'ai plaidé la cause de la Société du mieux que j'ai pu. Le toit qui laissait passer l'eau dans les arrière-salles. La chaudière qui vivait son dernier hiver. Deux siècles de la mémoire de la ville qui partaient lentement en ruine faute d'une fraction de ce que la commune dépensait pour un seul week-end de festival. Je l'ai fait avec chaleur, et je l'ai fait brièvement. Claire m'avait raconté que les histoires tristes ne déliaient pas les cordons de la bourse, et j'essayais de viser quelque chose de plus solide et de plus difficile à balayer d'un revers de main que la simple tristesse.</w:t>
       </w:r>
     </w:p>
     <w:p/>
@@ -2308,7 +2308,7 @@
     <w:p/>
     <w:p>
       <w:r>
-        <w:t>« C'est une noble cause, a-t-il dit quand j'ai eu fini. Théo fait du bon travail, à sa façon. Mais le budget de la ville est le budget de la ville, madame Claus, et l'histoire, vous m'excuserez de le dire, ne déblaie pas les routes en février et ne maintient pas l'éclairage public allumé. La Société a toujours fonctionné par ses propres moyens. Je suis sûr qu'elle retombera sur ses pieds, elle l'a toujours fait. Il a esquissé un sourire, le sourire d'un homme qui s'estimait généreux pour avoir prêté l'oreille. Peut-être que votre festival s'avérera une jolie petite collecte de fonds pour eux. Les gens deviennent si sentimentaux à cette période de l'année. »</w:t>
+        <w:t xml:space="preserve">« C'est une noble cause, a-t-il dit quand j'ai eu fini. Theo fait du bon travail, à sa façon. Mais le budget de la ville est le budget de la ville, madame Claus, et l'histoire, vous m'excuserez de le dire, ne déblaie pas les routes en février et ne maintient pas l'éclairage public allumé. La Société a toujours fonctionné par ses propres moyens. Je suis sûr qu'elle retombera sur ses pieds, elle l'a toujours fait. » Il a esquissé un sourire, le sourire d'un homme qui s'estimait généreux pour avoir prêté l'oreille. « Peut-être que votre festival s'avérera une jolie petite collecte de fonds pour eux. Les gens deviennent si sentimentaux à cette période de l'année. »</w:t>
       </w:r>
     </w:p>
     <w:p/>
@@ -2353,13 +2353,13 @@
     <w:p/>
     <w:p>
       <w:r>
-        <w:t xml:space="preserve">Les épaules de Vera se sont raidies, un tout petit mouvement, aussi vite apparu qu'disparu, pareil à un fil qu'on tend à s'en faire mal avant de le relâcher. </w:t>
-      </w:r>
-    </w:p>
-    <w:p/>
-    <w:p>
-      <w:r>
-        <w:t>« Les gens viennent me voir pour toutes sortes de raisons, a-t-elle répondu. Sa plume n'a pas cessé d'avancer. Surtout pour se plaindre de leurs impôts. »</w:t>
+        <w:t xml:space="preserve">Les épaules de Vera se sont raidies, un tout petit mouvement, aussi vite apparu que disparu, pareil à un fil qu'on tend à s'en faire mal avant de le relâcher. </w:t>
+      </w:r>
+    </w:p>
+    <w:p/>
+    <w:p>
+      <w:r>
+        <w:t xml:space="preserve">« Les gens viennent me voir pour toutes sortes de raisons, a-t-elle répondu. » Sa plume n'a pas cessé d'avancer. « Surtout pour se plaindre de leurs impôts. »</w:t>
       </w:r>
     </w:p>
     <w:p/>
@@ -2383,7 +2383,7 @@
     <w:p/>
     <w:p>
       <w:r>
-        <w:t>« Je ne connais rien aux Blackburn, a-t-elle déclaré, ce qui était tout de même curieux à dire alors qu'un Blackburn se trouvait à moins de deux mètres derrière sa porte ouverte et que les actes notariés des Blackburn remplissaient les tiroirs juste dans son dos. C'est le rayon de Théo. La Société d'histoire. Je ne fais que garder les archives. Je ne les lis pas. » Elle a fait glisser la liste du festival de l'autre côté du sous-main vers moi. « Voilà. Le cercle est ajouté. Est-ce qu'il y avait autre chose ? »</w:t>
+        <w:t xml:space="preserve">« Je ne connais rien aux Blackburn », a-t-elle déclaré, ce qui était tout de même curieux à dire alors qu'un Blackburn se trouvait à moins de deux mètres derrière sa porte ouverte et que les actes notariés des Blackburn remplissaient les tiroirs juste dans son dos. « C'est le rayon de Theo. La Société historique. Je ne fais que garder les archives. Je ne les lis pas. » Elle a fait glisser la liste du festival de l'autre côté du sous-main vers moi. « Voilà. Le cercle est ajouté. Est-ce qu'il y avait autre chose ? »</w:t>
       </w:r>
     </w:p>
     <w:p/>
@@ -2431,7 +2431,7 @@
     <w:p/>
     <w:p>
       <w:r>
-        <w:t xml:space="preserve">Une femme aux prises avec des soucis d'argent. Une femme qui détenait les clés de cent ans d'histoire sur qui possédait quoi, l'acte de propriété de l'auberge Winter Wonderland caché quelque part dans ces mêmes tiroirs, et tout ce que la ville avait consigné par écrit en 1924 lorsqu'une broche avait disparu d'une grande demeure, si tant est qu'on eût jamais rien consigné du tout. Une femme qui s'était raidie aux mots </w:t>
+        <w:t xml:space="preserve">Une femme aux prises avec des soucis d'argent. Une femme qui détenait les clés de cent ans d'histoire sur qui possédait quoi, l'acte de propriété du Winter Wonderland Inn caché quelque part dans ces mêmes tiroirs, et tout ce que la ville avait consigné par écrit en 1924 lorsqu'une broche avait disparu d'une grande demeure, si tant est qu'on eût jamais rien consigné du tout. Une femme qui s'était raidie aux mots </w:t>
       </w:r>
       <w:r>
         <w:rPr>
@@ -2446,7 +2446,7 @@
     <w:p/>
     <w:p>
       <w:r>
-        <w:t>Je ne savais pas ce que tout cela signifiait. Cela pouvait ne rien vouloir dire de plus qu'une femme fatiguée qui goûtait peu les questions indiscrètes par une longue journée. Mais mon appel en faveur de la Société avait échoué, exactement comme Dot l'avait prédit, et la Société s'enfonçait toujours un peu plus dans l'obscurité. Et maintenant, il y avait deux personnes à Frost Falls dont je ne pouvais plus entendre le nom de Blackburn sans penser à elles. L'une d'elles dirigeait le dépôt d'archives d'où les lettres avaient disparu.</w:t>
+        <w:t xml:space="preserve">Je ne savais pas ce que tout cela signifiait. Cela pouvait ne rien vouloir dire de plus qu'une femme fatiguée qui goûtait peu les questions indiscrètes par une longue journée. Mais mon appel en faveur de la Société avait échoué, exactement comme Dot l'avait prédit, et la Société s'enfonçait toujours un peu plus dans l'obscurité. Et maintenant, il y avait deux personnes à Frost Falls auxquelles je ne pouvais plus m'empêcher de penser en entendant le nom de Blackburn. L'une d'elles dirigeait le dépôt d'archives d'où les lettres avaient disparu.</w:t>
       </w:r>
     </w:p>
     <w:p/>
@@ -2463,7 +2463,7 @@
     <w:p/>
     <w:p>
       <w:r>
-        <w:t xml:space="preserve">Le conseil d'administration de la Société d'histoire s'est réuni ce lundi-là au soir, dans la froide pièce du fond sous le toit qui menaçait ruine. Claire m'a demandé de l'accompagner, en partie parce que la </w:t>
+        <w:t xml:space="preserve">Le conseil d'administration de la Société historique s'est réuni ce lundi-là au soir, dans la froide pièce du fond sous le toit qui menaçait ruine. Claire m'a demandé de l'accompagner, en partie parce que la </w:t>
       </w:r>
       <w:r>
         <w:rPr>
@@ -2532,7 +2532,7 @@
     </w:p>
     <w:p>
       <w:r>
-        <w:t>Claire est partie rédiger son article gentil et navrant qui ne secouerait rien du tout. Je suis restée pour aider Theo, et j'ai empilé les chaises avec l'homme que je venais de soupçonner de faire chanter mon amie. Il m'en a remerciée trois fois. Puis il m'a raconté qu'en 1936, une inondation avait failli emporter les archives municipales d'origine, et qu'une douzaine de citoyens s'étaient passés les cartons de main en main pour les mettre à l'abri sur les hauteurs. C'était la ville à son meilleur, a-t-il dit, des gens sauvant le passé de leurs propres mains, et il y pensait pendant les mauvaises nuits.</w:t>
+        <w:t xml:space="preserve">Claire est partie rédiger son article gentil et navrant qui ne secouerait rien du tout. Je suis restée pour aider Theo, et j'ai empilé les chaises avec l'homme que j'avais commencé à soupçonner de faire chanter mon amie. Il m'en a remerciée trois fois. Puis il m'a raconté qu'en 1936, une inondation avait failli emporter les archives municipales d'origine, et qu'une douzaine de citoyens s'étaient passés les cartons de main en main pour les mettre à l'abri sur les hauteurs. C'était la ville à son meilleur, a-t-il dit, des gens sauvant le passé de leurs propres mains, et il y pensait pendant les mauvaises nuits.</w:t>
       </w:r>
     </w:p>
     <w:p>
@@ -2564,7 +2564,7 @@
     <w:p/>
     <w:p>
       <w:r>
-        <w:t>« Mrs. Claus ! Et Pip ! » Il a contourné le bureau et s'est accroupi pour saluer le pingouin, qui l'a toisé avec l'air d'un membre de la royauté en visite. « Je n'aurais jamais cru dire ça, mais un pingouin est exactement le type d'adhérent qu'il me manquait. Taillé pour le froid. Nageur né. Les gens n'arrêtent pas de me répéter que je devrais installer une piscine, et je réponds que je n'ai pas la place, mais pour Pip, je trouverais l'espace. »</w:t>
+        <w:t xml:space="preserve">« Madame Claus ! Et Pip ! » Il a contourné le bureau et s'est accroupi pour saluer le pingouin, qui l'a toisé avec l'air d'un membre de la royauté en visite. « Je n'aurais jamais cru dire ça, mais un pingouin est exactement le type d'adhérent qu'il me manquait. Taillé pour le froid. Nageur né. Les gens n'arrêtent pas de me répéter que je devrais installer une piscine, et je réponds que je n'ai pas la place, mais pour Pip, je trouverais l'espace. »</w:t>
       </w:r>
     </w:p>
     <w:p/>
@@ -2600,7 +2600,7 @@
     <w:p/>
     <w:p>
       <w:r>
-        <w:t>Le sourire a tenu bon, mais cela lui a coûté quelque chose de le maintenir. « Lentement », a-t-il avoué. « La banque bloque le prêt. Troisième mois d'affilée. À chaque fois que je crois qu'on y est, ils réclament un formulaire de plus, un chiffre de plus, un mois de relevés de plus. » Il a détourné le regard, par-delà le sol neuf et lumineux. « Je ne vais pas vous mentir, Mrs. Claus, c'est dur. J'ai tout mis dans cet endroit. Tout ce que j'avais et une bonne part de ce que je n'avais pas. Il y a des nuits où je fais les comptes, après quoi je reste allongé sans trouver le sommeil. »</w:t>
+        <w:t xml:space="preserve">Le sourire a tenu bon, mais cela lui a coûté quelque chose de le maintenir. « Lentement », a-t-il avoué. « La banque bloque le prêt. Troisième mois d'affilée. À chaque fois que je crois qu'on y est, ils réclament un formulaire de plus, un chiffre de plus, un mois de relevés de plus. » Il a détourné le regard, par-delà le sol neuf et lumineux. « Je ne vais pas vous mentir, madame Claus, c'est dur. J'ai tout mis dans cet endroit. Tout ce que j'avais et une bonne part de ce que je n'avais pas. Il y a des nuits où je fais les comptes, après quoi je reste allongé sans trouver le sommeil. »</w:t>
       </w:r>
     </w:p>
     <w:p/>
@@ -2612,13 +2612,13 @@
     <w:p/>
     <w:p>
       <w:r>
-        <w:t>« C'est vrai. » Il a poussé un long soupir, puis, parce que sa mère l'avait apparemment éduqué pour ne pas se plaindre sans y adjoindre un plan, il a redressé les épaules. « Mais voilà ce que je fais pour y remédier, puisque vous me le demandez, et je préfère vous le dire franchement plutôt que de vous laisser vous faire du souci. J'ai décroché le contrat de sécurité du festival. Les nuits, tout le week-end, à surveiller les stands, la scène et le matériel pour que rien ne disparaisse dans le noir. Et j'ai rajouté les cours matinaux, boot camp à cinq heures et demie, avant même que la journée normale ne commence. » Il a haussé les épaules, et le sourire est revenu, plus authentique cette fois. « On ne règle pas des problèmes d'argent en se contentant de formuler des vœux, Mrs. Claus. On les règle en abattant plus d'heures de travail que le problème n'en a. C'est la seule méthode que je connaisse et elle ne m'a jamais fait défaut, c'est juste long et ça fait mal. »</w:t>
-      </w:r>
-    </w:p>
-    <w:p/>
-    <w:p>
-      <w:r>
-        <w:t>Je suis restée un moment avec ça, comme j'étais restée avec les vingt dollars de Sam. Voilà un homme croulant sous les dettes, avec toutes les raisons du monde et toutes les opportunités par-dessus le marché. Sa riposte consistait à monter la garde toute la nuit sur le festival de la ville moyennant finance et à faire faire des fentes à des grands-mères à cinq heures et demie du matin. Jamal cumulait trois emplois pour s'extirper de son gouffre de manière honnête, éreintante, pouce par pouce, et cela ne collait pas avec une lettre de chantage réclamant un demi-million de dollars. L'arithmétique ne concordait pas. Si Jamal Washington had le moindre moyen d'extorquer une pareille somme grâce à un secret, il ne réglerait pas son réveil sur cinq heures.</w:t>
+        <w:t xml:space="preserve">« C'est vrai. » Il a poussé un long soupir, puis, parce que sa mère l'avait apparemment éduqué pour ne pas se plaindre sans y adjoindre un plan, il a redressé les épaules. « Mais voilà ce que je fais pour y remédier, puisque vous me le demandez, et je préfère vous le dire franchement plutôt que de vous laisser vous faire du souci. J'ai décroché le contrat de sécurité du festival. Les nuits, tout le week-end, à surveiller les stands, la scène et le matériel pour que rien ne disparaisse dans le noir. Et j'ai rajouté les cours matinaux, boot camp à cinq heures et demie, avant même que la journée normale ne commence. » Il a haussé les épaules, et le sourire est revenu, plus authentique cette fois. « On ne règle pas des problèmes d'argent en se contentant de formuler des vœux, madame Claus. On les règle en abattant plus d'heures de travail que le problème n'en a. C'est la seule méthode que je connaisse et elle ne m'a jamais fait défaut, c'est juste long et ça fait mal. »</w:t>
+      </w:r>
+    </w:p>
+    <w:p/>
+    <w:p>
+      <w:r>
+        <w:t xml:space="preserve">Je suis restée un moment avec ça, comme j'étais restée avec les vingt dollars de Sam. Voilà un homme croulant sous les dettes, avec toutes les raisons du monde et toutes les opportunités par-dessus le marché. Sa riposte consistait à monter la garde toute la nuit sur le festival de la ville moyennant finance et à faire faire des fentes à des grands-mères à cinq heures et demie du matin. Jamal cumulait trois emplois pour s'extirper de son gouffre de manière honnête, éreintante, pouce par pouce, et cela ne collait pas avec une lettre de chantage réclamant un demi-million de dollars. L'arithmétique ne concordait pas. Si Jamal Washington avait le moindre moyen d'extorquer une pareille somme grâce à un secret, il ne réglerait pas son réveil sur cinq heures.</w:t>
       </w:r>
     </w:p>
     <w:p/>
@@ -2636,13 +2636,13 @@
     <w:p/>
     <w:p>
       <w:r>
-        <w:t>« Jeter un œil ? » Il a ri, pris au dépourvu. « Mrs. Claus, je portais des vitrines d'exposition deux par deux en essayant de ne pas poser mon pied sur une chaise centenaire. Je n'ai pas lu un seul mot. J'aurais été bien incapable de distinguer un Blackburn d'une mûre. Theo me tendait un carton en me disant attention maintenant, fais bien attention, celui-là est précieux, et je transportais le carton précieux là où il me l'indiquait pour repartir illico chercher le carton précieux suivant. » Il a secoué la tête, souriant à ce souvenir. « À la fin de la semaine, j'étais tellement lessivé que j'aurais signé n'importe quoi juste pour avoir la permission de m'asseoir. Voilà toute ma carrière d'historien. »</w:t>
-      </w:r>
-    </w:p>
-    <w:p/>
-    <w:p>
-      <w:r>
-        <w:t>Il l'a dit sur le ton de la plaisanterie, sans se douter qu'il m'avait fourni le moindre indice, et j'ai gardé le visage impassible malgré le petit déclic net que cela a produit en moi. Il n'avait pas lu les lettres. Il avait transporté les cartons en fixant ses pieds. Quoi que le maître chanteur eût pu lire dans les documents des Blackburn, la broche, la pierre, le prêteur sur gages, Jamal n'avait jamais had tout cela sous les yeux. Il l'avait eu entre les bras, enfermé dans une boîte, sans jamais regarder à l'intérieur.</w:t>
+        <w:t xml:space="preserve">« Jeter un œil ? » Il a ri, pris au dépourvu. « Madame Claus, je portais des vitrines d'exposition deux par deux en essayant de ne pas passer le pied à travers une chaise centenaire. Je n'ai pas lu un seul mot. J'aurais été bien incapable de distinguer un Blackburn d'une mûre. Theo me tendait un carton en me disant attention maintenant, fais bien attention, celui-là est précieux, et je transportais le carton précieux là où il me l'indiquait pour repartir illico chercher le carton précieux suivant. » Il a secoué la tête, souriant à ce souvenir. « À la fin de la semaine, j'étais tellement lessivé que j'aurais signé n'importe quoi juste pour avoir la permission de m'asseoir. Voilà toute ma carrière d'historien. »</w:t>
+      </w:r>
+    </w:p>
+    <w:p/>
+    <w:p>
+      <w:r>
+        <w:t xml:space="preserve">Il l'a dit sur le ton de la plaisanterie, sans se douter qu'il m'avait fourni le moindre indice, et j'ai gardé le visage impassible malgré le petit déclic net que cela a produit en moi. Il n'avait pas lu les lettres. Il avait transporté les cartons en fixant ses pieds. Quoi que le maître chanteur eût pu lire dans les documents des Blackburn, la broche, la pierre, le prêteur sur gages, Jamal n'avait jamais eu tout cela sous les yeux. Il l'avait eu entre les bras, enfermé dans une boîte, sans jamais regarder à l'intérieur.</w:t>
       </w:r>
     </w:p>
     <w:p/>
@@ -2654,7 +2654,7 @@
     <w:p/>
     <w:p>
       <w:r>
-        <w:t>« C'est un type bien. » Son sourire s'est adouci. « Mort d'inquiétude pour cet endroit, en revanche, tout du long. Ça se voyait sur son visage. Comme si le bâtiment était un proche malade qu'il veillait toute la nuit. Il s'arrêtait au milieu d'une phrase où il me disait où placer une vitrine pour fixer la trace d'humidité au plafond de l'arrière-salle comme si elle cherchait personnellement à le tuer. » Il a secoué la tête. « J'espère que quelqu'un va l'aider. Je lui donnerais l'argent moi-même si j'en avais, mais je suis à peu près le moins bien placé de toute cette ville pour qu'on me demande de l'argent cette année. »</w:t>
+        <w:t xml:space="preserve">« C'est un type bien. » Son sourire s'est adouci. « Mort d'inquiétude pour cet endroit, en revanche, tout du long. Ça se voyait sur son visage. Comme si le bâtiment était un proche malade qu'il veillait toute la nuit. Il s'arrêtait au milieu d'une phrase où il me disait où placer une vitrine et se mettait à fixer la trace d'humidité au plafond de l'arrière-salle comme si elle cherchait personnellement à le tuer. » Il a secoué la tête. « J'espère que quelqu'un va l'aider. Je lui donnerais l'argent moi-même si j'en avais, mais je suis à peu près le moins bien placé de toute cette ville pour qu'on me demande de l'argent cette année. »</w:t>
       </w:r>
     </w:p>
     <w:p/>
@@ -2713,7 +2713,7 @@
         <w:t>&lt;/bt&gt;</w:t>
       </w:r>
       <w:r>
-        <w:t>, un objet de pacotille pour touristes abritant une miniature en céramique de Frost Falls, avec le vert de la mairie et le reste. Ce matin-là, lorsque je me suis arrêtée pour acheter les brioches à la cannelle de Nick, la neige à l’intérieur refusait de retomber. Elle tourbillonnait sans fin, sans qu’aucune main ne l’agite, formant un minuscule blizzard qui tournait en boucle derrière le verre. Greta avait jeté un torchon sur la moitié de la boule, comme si cela pouvait aider, et vendait ses brioches juste à côté avec la gaieté déterminée d’une femme ayant décidé de faire comme si la boule à neige n'existait pas.</w:t>
+        <w:t xml:space="preserve">, un objet de pacotille pour touristes abritant une miniature en céramique de Frost Falls, avec la place, la mairie et tout le reste. Ce matin-là, lorsque je me suis arrêtée pour acheter les brioches à la cannelle de Nick, la neige à l’intérieur refusait de retomber. Elle tourbillonnait sans fin, sans qu’aucune main ne l’agite, formant un minuscule blizzard qui tournait en boucle derrière le verre. Greta avait jeté un torchon sur la moitié de la boule, comme si cela pouvait aider, et vendait ses brioches juste à côté avec la gaieté déterminée d’une femme ayant décidé de faire comme si la boule à neige n'existait pas.</w:t>
       </w:r>
     </w:p>
     <w:p/>
@@ -2725,7 +2725,7 @@
     <w:p/>
     <w:p>
       <w:r>
-        <w:t>— Bonjour, Mrs. Claus, a dit Greta. Ne faites pas attention à la boule. Elle fait des siennes depuis l’aube. — Elle a fait glisser mes brioches vers moi. — C’est le grand mixeur, je crois. Ça secoue tout le comptoir.</w:t>
+        <w:t xml:space="preserve">— Bonjour, madame Claus, a dit Greta. Ne faites pas attention à la boule. Elle fait des siennes depuis l’aube. — Elle a fait glisser mes brioches vers moi. — C’est le grand mixeur, je crois. Ça secoue tout le comptoir.</w:t>
       </w:r>
     </w:p>
     <w:p/>
@@ -2743,7 +2743,7 @@
     <w:p/>
     <w:p>
       <w:r>
-        <w:t>Sur la place, les ennuis étaient de la responsabilité de Bram. Prancer s’était échappée de son enclos pendant la nuit pour descendre en ville, et elle se tenait dans le bassin de la fontaine — que la municipalité coupait chaque mois d’octobre — avec de l’eau jusqu’aux paturons dans les feuilles mortes. Elle se tenait là, la tête haute, et refusait de bouger.</w:t>
+        <w:t xml:space="preserve">Sur la place, les ennuis étaient de la responsabilité de Bram. Prancer s’était échappée de son enclos pendant la nuit pour descendre en ville, et elle se tenait dans le bassin de la fontaine — que la municipalité coupait chaque mois d’octobre — enfoncée jusqu’aux paturons dans les feuilles mortes. Elle se tenait là, la tête haute, et refusait de bouger.</w:t>
       </w:r>
     </w:p>
     <w:p/>
@@ -2755,13 +2755,13 @@
     <w:p/>
     <w:p>
       <w:r>
-        <w:t>— Mrs. Claus ! — Il ne s’est même pas retourné. — C’est Prancer, cette fois ! Prancer ! Elle est dans la fontaine, et il n’y a même pas d’eau dedans, elle ne veut pas sortir, il y a une foule qui s’amasse, et j’ai tout essayé, j’ai essayé le sucre, j’ai essayé la fermeté, j’ai essayé de la raisonner, ce qui, je vous l’accorde, relevait de l’optimisme. — Il a tiré, et Prancer l’a regardé avec la sereine indifférence d’une créature qui n’avait aucune intention d’aller nulle part. — Deux en vadrouille maintenant. Deux ! Prancer dans la fontaine et Vixen qui s’est débrouillée pour entrer dans la salle paroissiale et qui a mangé la paille de la crèche, et elle n’a même pas de remords, ça se voit qu’elle n’a pas de remords, regardez-la... oh, elle n’est pas là, elle est à l’église, mais si elle avait été là, vous auriez vu qu’elle n’a aucun remords.</w:t>
-      </w:r>
-    </w:p>
-    <w:p/>
-    <w:p>
-      <w:r>
-        <w:t>Une petite foule s’était en effet rassemblée, une foule ravie. Des enfants étaient apparus, comme ils le font dès qu’il y a un renne, et ils grimpaient sur le rebord de la fontaine pour la caresser en poussant des cris aigus. Un homme que je ne connaissais pas photographiait Prancer pour ses petits-enfants, et le vieux Mr. Kim, de l’atelier mécanique, avait sorti une chaise pliante sur le trottoir pour assister à tout le spectacle avec la satisfaction d’un spectateur assistant à une bonne représentation.</w:t>
+        <w:t xml:space="preserve">— Madame Claus ! — Il ne s’est même pas retourné. — C’est Prancer, cette fois ! Prancer ! Elle est dans la fontaine, et il n’y a même pas d’eau dedans, elle ne veut pas sortir, il y a une foule qui s’amasse, et j’ai tout essayé, j’ai essayé le sucre, j’ai essayé la fermeté, j’ai essayé de la raisonner, ce qui, je vous l’accorde, relevait de l’optimisme. — Il a tiré, et Prancer l’a regardé avec la sereine indifférence d’une créature qui n’avait aucune intention d’aller nulle part. — Deux en vadrouille maintenant. Deux ! Prancer dans la fontaine et Vixen qui s’est débrouillée pour entrer dans la salle paroissiale et qui a mangé la paille de la crèche, et elle n’a même pas de remords, ça se voit qu’elle n’a pas de remords, regardez-la... oh, elle n’est pas là, elle est à l’église, mais si elle avait été là, vous auriez vu qu’elle n’a aucun remords.</w:t>
+      </w:r>
+    </w:p>
+    <w:p/>
+    <w:p>
+      <w:r>
+        <w:t xml:space="preserve">Une petite foule s’était en effet rassemblée, une foule ravie. Des enfants étaient apparus, comme ils le font dès qu’il y a un renne, et ils grimpaient sur le rebord de la fontaine pour la caresser en poussant des cris aigus. Un homme que je ne connaissais pas photographiait Prancer pour ses petits-enfants, et le vieux M. Kim, de l’atelier mécanique, avait sorti une chaise pliante sur le trottoir pour assister à tout le spectacle avec la satisfaction d’un spectateur assistant à une bonne représentation.</w:t>
       </w:r>
     </w:p>
     <w:p/>
@@ -2797,7 +2797,7 @@
     <w:p/>
     <w:p>
       <w:r>
-        <w:t>— Elle trace vers l’atelier, a dit Bram en balayant les feuilles de ses genoux. Elles veulent toutes aller à l’atelier, maintenant. Pourquoi est-ce qu’elles veulent toutes aller à l’atelier, Mrs. Claus ? Qu’est-ce qu’il a là-dedans ?</w:t>
+        <w:t xml:space="preserve">— Elle trace vers l’atelier, a dit Bram en balayant les feuilles de ses genoux. Elles veulent toutes aller à l’atelier, maintenant. Pourquoi est-ce qu’elles veulent toutes aller à l’atelier, madame Claus ? Qu’est-ce qu’il a là-dedans ?</w:t>
       </w:r>
     </w:p>
     <w:p/>
@@ -2821,7 +2821,7 @@
     <w:p/>
     <w:p>
       <w:r>
-        <w:t>Il est reparti d’un pas lourd en grommelant. La foule s’est dispersée, les enfants continuaient à pointer le doigt vers le haut du chemin, et Mr. Kim a replié sa chaise, pleinement satisfait.</w:t>
+        <w:t xml:space="preserve">Il est reparti d’un pas lourd en grommelant. La foule s’est dispersée, les enfants continuaient à pointer le doigt vers le haut du chemin, et M. Kim a replié sa chaise, pleinement satisfait.</w:t>
       </w:r>
     </w:p>
     <w:p/>
@@ -2833,7 +2833,7 @@
     <w:p/>
     <w:p>
       <w:r>
-        <w:t>Cela aurait dû m’inquiéter davantage. Il y a vait un maître chanteur en ville et une amie qu’on pressurait pour un demi-million de dollars. Mais un renne venait tout juste de s’extraire d’une fontaine parce que je lui avais dit qu’il y avait quelque chose de plus chaleureux plus haut sur le chemin. Les enfants l’avaient acclamée jusqu’au coin de la rue. Mon cœur, en dépit de toute raison, s’envolait comme un cerf-volant.</w:t>
+        <w:t xml:space="preserve">Cela aurait dû m’inquiéter davantage. Il y avait un maître chanteur en ville et une amie qu’on pressurait pour un demi-million de dollars. Mais un renne venait tout juste de s’extraire d’une fontaine parce que je lui avais dit qu’il y avait quelque chose de plus chaleureux plus haut sur le chemin. Les enfants l’avaient acclamée jusqu’au coin de la rue. Mon cœur, en dépit de toute raison, s’envolait comme un cerf-volant.</w:t>
       </w:r>
     </w:p>
     <w:p>
@@ -2849,7 +2849,7 @@
     </w:p>
     <w:p>
       <w:r>
-        <w:t>Pip et moi avons été les dernières à arriver. Le cercle avait rapproché ses chaises du poêle à bois, avec des paniers de laine vert écolier posés sur le sol entre eux. Les mitaines achevées pendaient par paires le long d'une cordelette au-dessus du comptoir, comme du linge étendu. Pip est allée tout droit vers le bocal à boutons sur l'étagère basse près de la caisse, et Olivia l'a déplacé sur le haut du comptoir sans faire sauter une seule mailles.</w:t>
+        <w:t xml:space="preserve">Pip et moi avons été les dernières à arriver. Le cercle avait rapproché ses chaises du poêle à bois, avec des paniers de laine vert écolier posés sur le sol entre elles. Les mitaines achevées pendaient par paires le long d'une cordelette au-dessus du comptoir, comme du linge étendu. Pip est allée tout droit vers le bocal à boutons sur l'étagère basse près de la caisse, et Olivia l'a déplacé sur le haut du comptoir sans faire sauter une seule maille.</w:t>
       </w:r>
     </w:p>
     <w:p>
@@ -2889,12 +2889,12 @@
     </w:p>
     <w:p>
       <w:r>
-        <w:t>« Le journal de demain. Page trois. » Claire n'a pas levé les yeux de ses aiguilles. « Ils ont voté pour garder les portes ouvertes jusqu'en janvier, et après ça, personne ne sait. Je suis restée assise pendant deux heures. Théo n'arrêtait pas de s'excuser pour le toit, comme s'il avait fait le trou lui-même. »</w:t>
-      </w:r>
-    </w:p>
-    <w:p>
-      <w:r>
-        <w:t>Martha n'a rien dit. Elle avait apporté un autre gratin à Théo dimanche, et cette fois il en avait mangé un peu. Elle me l'avait dit sur le pas de la porte, d'une voix basse, comme un bulletin de santé venu d'une chambre de malade.</w:t>
+        <w:t xml:space="preserve">« Le journal de demain. Page trois. » Claire n'a pas levé les yeux de ses aiguilles. « Ils ont voté pour garder les portes ouvertes jusqu'en janvier, et après ça, personne ne sait. Je suis restée assise pendant deux heures. Theo n'arrêtait pas de s'excuser pour le toit, comme s'il avait fait le trou lui-même. »</w:t>
+      </w:r>
+    </w:p>
+    <w:p>
+      <w:r>
+        <w:t xml:space="preserve">Martha n'a rien dit. Elle avait apporté un autre gratin à Theo dimanche, et cette fois il en avait mangé un peu. Elle me l'avait dit sur le pas de la porte, d'une voix basse, comme un bulletin de santé venu d'une chambre de malade.</w:t>
       </w:r>
     </w:p>
     <w:p>
@@ -2964,12 +2964,12 @@
     </w:p>
     <w:p>
       <w:r>
-        <w:t>Ellie s'était remise à compter ses mailles à voix basse. À la fin du rang, elle a dit : « Est-ce que quelqu'un a vu Fiona cette semaine ? Elle n'a assisté à aucune réunion de comité. C'est toujours elle qui s'occupe de la table des tourtes. »</w:t>
-      </w:r>
-    </w:p>
-    <w:p>
-      <w:r>
-        <w:t>« Elle s'occupe toujours de la table des tourtes, » a dit Olivia. « Elle me l'a dit dimanche. »</w:t>
+        <w:t xml:space="preserve">Ellie s'était remise à compter ses mailles à voix basse. À la fin du rang, elle a dit : « Est-ce que quelqu'un a vu Fiona cette semaine ? Elle n'a assisté à aucune réunion de comité. C'est toujours elle qui s'occupe de la table des tartes. »</w:t>
+      </w:r>
+    </w:p>
+    <w:p>
+      <w:r>
+        <w:t xml:space="preserve">« Elle s'occupe toujours de la table des tartes, » a dit Olivia. « Elle me l'a dit dimanche. »</w:t>
       </w:r>
     </w:p>
     <w:p>
@@ -3051,7 +3051,7 @@
     </w:p>
     <w:p>
       <w:r>
-        <w:t>« Sam n'a eu aucune chance. Il n'a jamais mis les pieds aux archives, il dit que la poussière le fait éternuer, et je le crois aussi. Il m'a dit que les vieilles familles, c'était le rayon de Theo, et il le pensait vraiment. » J'ai tapoté la page. « L'odeur de forge l'a mis sur la liste, et je crois que cette odeur de forge va être précisément ce qui l'en retirera, parce que Pip me répète depuis la première nuit que la note sent l'endroit où le fer de Sam se trouve, et non Sam. Et le fer de Sam est partout dans le hall de Fiona. Tout ce qu'on laisse dans ce hall ressort en sentant son feu. Tout. »</w:t>
+        <w:t xml:space="preserve">« Sam n'en a jamais eu l'occasion. Il n'a jamais mis les pieds aux archives, il dit que la poussière le fait éternuer, et je le crois aussi. Il m'a dit que les vieilles familles, c'était le rayon de Theo, et il le pensait vraiment. » J'ai tapoté la page. « L'odeur de forge l'a mis sur la liste, et je crois que cette odeur de forge va être précisément ce qui l'en retirera, parce que Pip me répète depuis la première nuit que la note sent l'endroit où le fer de Sam se trouve, et non Sam. Et le fer de Sam est partout dans le hall de Fiona. Tout ce qu'on laisse dans ce hall ressort en sentant son feu. Tout. »</w:t>
       </w:r>
     </w:p>
     <w:p>
@@ -3066,7 +3066,7 @@
     </w:p>
     <w:p>
       <w:r>
-        <w:t>« Et ton grand dadais de monsieur Carter. »</w:t>
+        <w:t xml:space="preserve">« Et ton bruyant monsieur Carter. »</w:t>
       </w:r>
     </w:p>
     <w:p>
@@ -3111,7 +3111,7 @@
     </w:p>
     <w:p>
       <w:r>
-        <w:t>« Bientôt, ai-je dit. Il y a d'abord deux fils à nouer. Sam, et l'étranger. Je veux qu'ils soient tous les deux partis pour de bon, blanchis au-delà de tout doute, avant de m'autoriser à entrer dans ces archives et à regarder Theo en face. Je lui dois bien ça, de ne pas porter mes soupçons sur lui tant qu'il ne restera personne d'autre à suspecter. Et ensuite j'irai, je regarderai les lettres, et je découvrirai si les mots correspondent. »</w:t>
+        <w:t xml:space="preserve">« Bientôt, ai-je dit. Il y a d'abord deux fils à nouer. Sam, et l'étranger. Je veux qu'ils soient tous les deux écartés pour de bon, blanchis au-delà de tout doute, avant de m'autoriser à entrer dans ces archives et à regarder Theo en face. Je lui dois bien ça, de ne pas porter mes soupçons sur lui tant qu'il ne restera personne d'autre à suspecter. Et ensuite j'irai, je regarderai les lettres, et je découvrirai si les mots correspondent. »</w:t>
       </w:r>
     </w:p>
     <w:p>
@@ -3180,7 +3180,7 @@
     <w:p/>
     <w:p>
       <w:r>
-        <w:t>« Tu ne savais pas, ai-je dit. Comment aurais-tu pu ? C'est pour cette raison exacte que je te l'ai dit maintenant. »</w:t>
+        <w:t xml:space="preserve">« Vous ne saviez pas, ai-je dit. Comment auriez-vous pu ? C'est pour cette raison exacte que je vous l'ai dit maintenant. »</w:t>
       </w:r>
     </w:p>
     <w:p/>
@@ -3192,19 +3192,19 @@
     <w:p/>
     <w:p>
       <w:r>
-        <w:t>Et voilà, la dernière preuve, bien que j'étais venue pour faire amende honorable et non pour trouver des preuves. Si Sam Patel avait écrit ces notes, il ne se tiendrait pas sur le porche froid de Fiona avec un niveau à la main en proposant, le visage blême, de m'aider à l'attraper lui-même. Toute l'idée s'écroulait dès qu'on voyait son visage.</w:t>
-      </w:r>
-    </w:p>
-    <w:p/>
-    <w:p>
-      <w:r>
-        <w:t>L'odeur sur la note n'avait jamais été celle de Sam. C'était celle de son travail. Un forgeur finit le fer en y brûlant de l'huile pendant qu'il est encore chaud, et la ferronnerie neuve garde cette fumée pendant des semaines. Le hall de Fiona en était plein, la rampe d'escalier, l'écran de cheminée, les supports posés sur le porche, et le manteau et le sac à outils de Sam avaient pendu près de sa porte tous les jours pendant trois semaines. Chaque papier posé sur ce bureau avait pris cette odeur. La note s'y trouvait aussi. L'indice qui l'avait mis en haut de ma liste m'avait indiqué tout du long où la note s'était trouvée. Pas qui l'avait écrite. Je l'avais lue à l'envers. Maintenant, je pouvais la lire dans le bon sens, et le bon sens le blanchissait de fond en comble.</w:t>
-      </w:r>
-    </w:p>
-    <w:p/>
-    <w:p>
-      <w:r>
-        <w:t>« Surveillez le bureau de la réception, lui ai-je dit, puisqu'il l'avait demandé, et puisqu'il avait largement mérité une vraie réponse. Le festival a lieu ce week-end, et l'auberge va regorger d'étrangers qui vont et viennent toute la journée. Si quelqu'un dépose quelque chose sur ce bureau et s'en va rapidement, au milieu de toute cette foule, vous me retiendrez son visage. Vous avez l'œil perçant, et vous serez là sur cette échelle de toute façon. C'est tout ce que je veux. Ne les arrêtez pas, ne dites pas un mot, ne laissez rien paraître. Juste vous souvenir du visage. »</w:t>
+        <w:t xml:space="preserve">Et voilà, la dernière preuve, bien que je sois venue pour faire amende honorable et non pour trouver des preuves. Si Sam Patel avait écrit ces notes, il ne se tiendrait pas sur le porche froid de Fiona avec un niveau à la main en proposant, le visage blême, de m'aider à l'attraper lui-même. Toute l'idée s'écroulait dès qu'on voyait son visage.</w:t>
+      </w:r>
+    </w:p>
+    <w:p/>
+    <w:p>
+      <w:r>
+        <w:t xml:space="preserve">L'odeur sur la note n'avait jamais été celle de Sam. C'était celle de son travail. Un forgeron finit le fer en y brûlant de l'huile pendant qu'il est encore chaud, et la ferronnerie neuve garde cette fumée pendant des semaines. Le hall de Fiona en était plein, la rampe d'escalier, le pare-étincelles, les supports posés sur le porche, et le manteau et le sac à outils de Sam avaient pendu près de sa porte tous les jours pendant trois semaines. Chaque papier posé sur ce bureau avait pris cette odeur. La note s'y trouvait aussi. L'indice qui l'avait mis en haut de ma liste m'avait indiqué tout du long où la note s'était trouvée. Pas qui l'avait écrite. Je l'avais lue à l'envers. Maintenant, je pouvais la lire dans le bon sens, et le bon sens le blanchissait de fond en comble.</w:t>
+      </w:r>
+    </w:p>
+    <w:p/>
+    <w:p>
+      <w:r>
+        <w:t xml:space="preserve">« Surveillez le bureau de la réception, lui ai-je dit, puisqu'il l'avait demandé, et puisqu'il avait largement mérité une vraie réponse. Le festival a lieu ce week-end, et l'auberge va regorger d'étrangers qui vont et viennent toute la journée. Si quelqu'un dépose quelque chose sur ce bureau et s'en va rapidement, au milieu de toute cette foule, vous me retiendrez son visage. Vous avez l'œil perçant, et vous serez là sur cette échelle de toute façon. C'est tout ce que je veux. Ne les arrêtez pas, ne dites pas un mot, ne laissez rien paraître. Souvenez-vous juste du visage. »</w:t>
       </w:r>
     </w:p>
     <w:p/>
@@ -3251,7 +3251,7 @@
     <w:p/>
     <w:p>
       <w:r>
-        <w:t>« Monsieur Carter, ai-je dit. Je vais vous dire quelque chose, et observez votre visage pendant que je le dirai, et je vous serais obligée de me laisser faire les deux. »</w:t>
+        <w:t xml:space="preserve">« Monsieur Carter, ai-je dit. Je vais vous dire quelque chose, et observer votre visage pendant que je le dirai, et je vous serais obligée de me laisser faire les deux. »</w:t>
       </w:r>
     </w:p>
     <w:p/>
@@ -3263,7 +3263,7 @@
     <w:p/>
     <w:p>
       <w:r>
-        <w:t>Pip est allée directement vers la loupe et s'est penchée sur son rebord en laiton, en l'admirant dedans.</w:t>
+        <w:t xml:space="preserve">Pip est allée directement vers la loupe et s'est penchée sur son rebord en laiton, pour s'y admirer.</w:t>
       </w:r>
     </w:p>
     <w:p/>
@@ -3281,7 +3281,7 @@
     <w:p/>
     <w:p>
       <w:r>
-        <w:t>« Un demi-million. Il s'est rejeté en arrière et a poussé un sifflement étouffé. Bon sang. Quelqu'un pressurise la descendante. À propos d'un truc que la loi ne peut pas toucher. » Il a lentement secoué la tête, avec du dégoût, un vrai dégoût. « C'est cruel, M&lt;sup&gt;me&lt;/sup&gt; Claus, et c'est stupide. Il n'y a pas de charges que quiconque pourrait retenir à propos de cette broche maintenant. La succession Blackburn ne veut pas de l'argent de votre amie et elle ne veut certainement pas de sa peau. Elle veut une ligne dans un grand livre qui indique où la pièce est allée, pour que les avocats puissent clore le dossier et cesser de se facturer les uns les autres. Quiconque saigne votre amie lui vend une terreur qui n'est même pas réelle. La honte est sa seule arme. Il ne reste aucun fondement juridique, plus après cent ans. »</w:t>
+        <w:t xml:space="preserve">« Un demi-million. » Il s'est rejeté en arrière et a poussé un sifflement étouffé. « Bon sang. Quelqu'un pressurise la descendante. À propos d'un truc que la loi ne peut pas toucher. » Il a lentement secoué la tête, avec du dégoût, un vrai dégoût. « C'est cruel, madame Claus, et c'est stupide. Il n'y a pas de charges que quiconque pourrait retenir à propos de cette broche maintenant. La succession Blackburn ne veut pas de l'argent de votre amie et elle ne veut certainement pas de sa peau. Elle veut une ligne dans un grand livre qui indique où la pièce est allée, pour que les avocats puissent clore le dossier et cesser de se facturer les uns les autres. Quiconque saigne votre amie lui vend une terreur qui n'est même pas réelle. La honte est sa seule arme. Il ne reste aucun fondement juridique, plus après cent ans. »</w:t>
       </w:r>
     </w:p>
     <w:p/>
@@ -3311,13 +3311,13 @@
     <w:p/>
     <w:p>
       <w:r>
-        <w:t>« On lui devait cet argent, a dit Neil en me regardant lire. C'est la partie que les racontars omettent toujours, parce que les racontars veulent un méchant bien propre et un crime bien propre. Les Blackburn n'avaient pas payé leur personnel de maison depuis des mois, cet hiver-là de vingt-quatre. J'ai les plaintes là-dedans, les autres domestiques qui ont pli bagage, et une lettre, M&lt;sup&gt;me&lt;/sup&gt; Claus, une lettre de Constance elle-même, demandant, très poliment, ses arriérés de salaire, et à qui l'on a répondu en retour d'être reconnaissante d'avoir un toit au-dessus de sa tête. Sa mère mourait ce même hiver, à trois rues de là, et il n'y avait pas d'argent pour un médecin, aucun. Et elle était là, jour après jour, à épousseter une broche qui valait plus que ce qu'elle gagnerait en trois vies, tandis que la famille qui la possédait lui disait d'être reconnaissante. » Il a écarté les mains. « Je ne dis pas qu'elle a eu raison de la prendre. Je dis qu'elle n'était pas une voleuse de la manière simpliste que la note veut faire croire à votre amie. C'était une jeune fille désespérée, volée d'abord par des gens riches qui avaient largement les moyens de la payer et qui ont choisi de ne pas le faire. Elle s'est remboursée avec la seule chose qu'elle pouvait atteindre, et a bâti cent ans d'accueil honnête par-dessus. Il y a de pires fondations pour une auberge. »</w:t>
-      </w:r>
-    </w:p>
-    <w:p/>
-    <w:p>
-      <w:r>
-        <w:t>Je suis restée assise avec le dossier ouvert entre les mains, et quelque chose s'est lentement retourné au fond de ma poitrine. Cela changeait la tournure de toute l'affaire. Le secret que Fiona s'était à moitié tuer à garder, le vol honteux à la racine de sa famille, paraissait différent lorsqu'on étalait les papiers bien à plat dans la lumière. C'était une dure histoire, et une histoire humaine : une fille désespérée dans une maison froide, et une dette réglée de la seule façon qui lui restait. Racontée d'une certaine manière, en chuchotant, avec la moitié des faits, elle pouvait la ruiner. Racontée de la vraie manière, entièrement, avec les documents de Neil étalés dessous, elle ne la ruinerait peut-être pas du tout. Cela pourrait même être une histoire au milieu de laquelle une femme pourrait se tenir bien droite.</w:t>
+        <w:t xml:space="preserve">« On lui devait cet argent, a dit Neil en me regardant lire. C'est la partie que les racontars omettent toujours, parce que les racontars veulent un méchant bien propre et un crime bien propre. Les Blackburn n'avaient pas payé leur personnel de maison depuis des mois, cet hiver-là de vingt-quatre. J'ai les plaintes là-dedans, les autres domestiques qui ont plié bagage, et une lettre, madame Claus, une lettre de Constance elle-même, demandant, très poliment, ses arriérés de salaire, et à qui l'on a répondu en retour d'être reconnaissante d'avoir un toit au-dessus de sa tête. Sa mère mourait ce même hiver, à trois rues de là, et il n'y avait pas d'argent pour un médecin, aucun. Et elle était là, jour après jour, à épousseter une broche qui valait plus que ce qu'elle gagnerait en trois vies, tandis que la famille qui la possédait lui disait d'être reconnaissante. » Il a écarté les mains. « Je ne dis pas qu'elle a eu raison de la prendre. Je dis qu'elle n'était pas une voleuse de la manière simpliste que la note veut faire croire à votre amie. C'était une jeune fille désespérée, volée d'abord par des gens riches qui avaient largement les moyens de la payer et qui ont choisi de ne pas le faire. Elle s'est remboursée avec la seule chose qu'elle pouvait atteindre, et a bâti cent ans d'accueil honnête par-dessus. Il y a de pires fondations pour une auberge. »</w:t>
+      </w:r>
+    </w:p>
+    <w:p/>
+    <w:p>
+      <w:r>
+        <w:t xml:space="preserve">Je suis restée assise avec le dossier ouvert entre les mains, et quelque chose s'est lentement retourné au fond de ma poitrine. Cela changeait la tournure de toute l'affaire. Le secret que Fiona s'était à moitié tuée à garder, le vol honteux à la racine de sa famille, paraissait différent lorsqu'on étalait les papiers bien à plat dans la lumière. C'était une dure histoire, et une histoire humaine : une fille désespérée dans une maison froide, et une dette réglée de la seule façon qui lui restait. Racontée d'une certaine manière, en chuchotant, avec la moitié des faits, elle pouvait la ruiner. Racontée de la vraie manière, entièrement, avec les documents de Neil étalés dessous, elle ne la ruinerait peut-être pas du tout. Cela pourrait même être une histoire au milieu de laquelle une femme pourrait se tenir bien droite.</w:t>
       </w:r>
     </w:p>
     <w:p/>
@@ -3373,7 +3373,7 @@
         <w:rPr>
           <w:i/>
         </w:rPr>
-        <w:t>MANQUANT — à reclassement une fois retrouvé.</w:t>
+        <w:t xml:space="preserve">MANQUANT — à reclasser une fois retrouvé.</w:t>
       </w:r>
     </w:p>
     <w:p>
@@ -3389,7 +3389,7 @@
         <w:rPr>
           <w:i/>
         </w:rPr>
-        <w:t>Correspondance d'Adelaide Blackburn à sa sœur, hiver 1924. Concerne le vol du broche de famille (le saphir en son cœur) par un domestique ; la pièce a été mise en gage par la suite à Ridgeline. D'un intérêt local considérable.</w:t>
+        <w:t xml:space="preserve">Correspondance d'Adelaide Blackburn à sa sœur, hiver 1924. Concerne le vol de la broche de famille (le saphir en son cœur) par un domestique ; la pièce a été mise en gage par la suite à Ridgeline. D'un intérêt local considérable.</w:t>
       </w:r>
     </w:p>
     <w:p>
@@ -3399,12 +3399,12 @@
     </w:p>
     <w:p>
       <w:r>
-        <w:t>Je me suis figée. Je me suis entraînée toute ma vie à ne pas laisser mon corps me trahir, et j'ai eu besoin de tout cet entraînement à cet instant, assise à la table de travail de Theo avec sa fiche en main, parce que la note de chantage pliée dans mon manteau contenait ces mêmes mots. Pas des mots semblables. Ces mots-là. Je n'avais pas besoin de sortir la note pour en être sûre ; je l'avais lue cent fois et je pouvais la voir derrière mes paupières. Le saphir en son cœur. C'est une façon bizarre de décrire un broche, une touche poétique, le phrasé d'un historien et non d'un voleur. Il figurait dans la note de chantage exactement comme sur la fiche de Theo, les mêmes cinq mots dans le même ordre. Deux personnes ne décrivent pas un bijou avec les mêmes cinq mots bizarres par hasard.</w:t>
-      </w:r>
-    </w:p>
-    <w:p>
-      <w:r>
-        <w:t>Quiconque avait écrit cette note had lu cette fiche. Ou avait lu la lettre que la fiche résumait. Ou avait écrit cette fiche elle-même.</w:t>
+        <w:t xml:space="preserve">Je me suis figée. Je me suis entraînée toute ma vie à ne pas laisser mon corps me trahir, et j'ai eu besoin de tout cet entraînement à cet instant, assise à la table de travail de Theo avec sa fiche en main, parce que la note de chantage pliée dans mon manteau contenait ces mêmes mots. Pas des mots semblables. Ces mots-là. Je n'avais pas besoin de sortir la note pour en être sûre ; je l'avais lue cent fois et je pouvais la voir derrière mes paupières. Le saphir en son cœur. C'est une façon bizarre de décrire une broche, une touche poétique, le phrasé d'un historien et non d'un voleur. Il figurait dans la note de chantage exactement comme sur la fiche de Theo, les mêmes cinq mots dans le même ordre. Deux personnes ne décrivent pas un bijou avec les mêmes cinq mots bizarres par hasard.</w:t>
+      </w:r>
+    </w:p>
+    <w:p>
+      <w:r>
+        <w:t xml:space="preserve">Quiconque avait écrit cette note avait lu cette fiche. Ou avait lu la lettre que la fiche résumait. Ou avait écrit cette fiche elle-même.</w:t>
       </w:r>
     </w:p>
     <w:p>
@@ -3479,7 +3479,7 @@
     </w:p>
     <w:p>
       <w:r>
-        <w:t>J'ai pris sa main, et nous avons traversé la cour froide et argentée tandis que la clarté dorée s'épandait un peu plus à chaque pas, Pip dandinant des fesses devant nous. Nick a posé la main sur la porte de l'atelier et l'a poussée.</w:t>
+        <w:t xml:space="preserve">J'ai pris sa main, et nous avons traversé la cour froide et argentée tandis que la clarté dorée s'épandait un peu plus à chaque pas, Pip se dandinant devant nous. Nick a posé la main sur la porte de l'atelier et l'a poussée.</w:t>
       </w:r>
     </w:p>
     <w:p>
@@ -3526,13 +3526,13 @@
     <w:p/>
     <w:p>
       <w:r>
-        <w:t>Des hommes transportaient des tréteaux sur la pelouse quand je suis descendue par Evergreen. À l'auberge, Vera Reed descendait les marches du porche alors que j'y montais, avec un cabas en toile sur l'épaule et un presse-papiers sous le bras, boutonnée jusqu'au menton contre le froid comme elle l'avait été à l'exposition.</w:t>
-      </w:r>
-    </w:p>
-    <w:p/>
-    <w:p>
-      <w:r>
-        <w:t>— Des laissez-passer de stationnement, a-t-elle dit, avant que je n'aie demandé, et elle a levé le presse-papiers. Pour les clients de l'auberge. Le maire en veut un sur chaque tableau de bord avant midi.</w:t>
+        <w:t xml:space="preserve">Des hommes transportaient des tréteaux sur la pelouse quand je suis descendue par Evergreen. À l'auberge, Vera Reed descendait les marches du porche alors que j'y montais, avec un cabas en toile sur l'épaule et un porte-bloc sous le bras, boutonnée jusqu'au menton contre le froid comme elle l'avait été à l'exposition.</w:t>
+      </w:r>
+    </w:p>
+    <w:p/>
+    <w:p>
+      <w:r>
+        <w:t xml:space="preserve">— Des laissez-passer de stationnement, a-t-elle dit, avant que je n'aie demandé, et elle a levé le porte-bloc. Pour les clients de l'auberge. Le maire en veut un sur chaque tableau de bord avant midi.</w:t>
       </w:r>
     </w:p>
     <w:p/>
@@ -3574,7 +3574,7 @@
         <w:rPr>
           <w:i/>
         </w:rPr>
-        <w:t>Le festival s'arrête dimanche. Aie l'argent prêt d'ici là, ou toute la ville sera au courant pour ta famille dès lundi matin. Un ruban rouge sur la couronne quand ce sera fait. Ne fais pas l'idiote avec ça.</w:t>
+        <w:t xml:space="preserve">Le festival s'arrête dimanche. Ayez l'argent prêt d'ici là, ou toute la ville sera au courant pour votre famille dès lundi matin. Un ruban rouge sur la couronne quand ce sera fait. Ne faites pas l'idiote avec ça.</w:t>
       </w:r>
     </w:p>
     <w:p/>
@@ -3586,7 +3586,7 @@
     <w:p/>
     <w:p>
       <w:r>
-        <w:t>— Dimanche, a dit Fiona. Ça fait trois jours. Je ne l'aurai pas en trois jours, je ne l'aurais pas en trois ans, et il doit le savoir, c'est obligé, alors qu'est-ce qu'il veut au juste ? Il veut juste me regarder couler ?</w:t>
+        <w:t xml:space="preserve">— Dimanche, a dit Fiona. Ça fait trois jours. Je ne l'aurai pas en trois jours, je ne l'aurai pas en trois ans, et il doit le savoir, c'est obligé, alors qu'est-ce qu'il veut au juste ? Il veut juste me regarder couler ?</w:t>
       </w:r>
     </w:p>
     <w:p/>
@@ -3610,7 +3610,7 @@
     <w:p/>
     <w:p>
       <w:r>
-        <w:t>J'avais un air. J'ai toujours un air, apparemment. Et je savais, ou d'assez près pour que l'approximation ne tienne qu'à la manière et au fait d'agir seule. Mais je n'étais pas prête à prononcer son nom à haute voix dans cette petite pièce. Dire Theo Hussein à haute voix devant Fiona allait déclencher une avalanche que je ne pourrais plus retenir, et je voulais être absolument sûre, et sûre de m'y prendre avec tact, avant de laisser tout dévaler.</w:t>
+        <w:t xml:space="preserve">J'avais un air. J'ai toujours un air, apparemment. Et je savais, ou d'assez près pour que l'approximation ne tienne qu'à la manière et à la question de savoir s'il avait agi seul. Mais je n'étais pas prête à prononcer son nom à haute voix dans cette petite pièce. Dire Theo Hussein à haute voix devant Fiona allait déclencher une avalanche que je ne pourrais plus retenir, et je voulais être absolument sûre, et sûre de m'y prendre avec tact, avant de laisser tout dévaler.</w:t>
       </w:r>
     </w:p>
     <w:p/>
@@ -3622,7 +3622,7 @@
     <w:p/>
     <w:p>
       <w:r>
-        <w:t>— Je n'ai rien d'autre à te donner que trois jours. Elle l'a dit sans amertume, simplement usée jusqu'à la trame. Trois jours, alors. Le festival. Elle a esquissé un petit rire brisé. Et c'est moi qui suis censée l'animer. Sourire aux clients. Juger le concours de tartes samedi. Me lever et souhaiter la bienvenue à tout le monde pour portes ouvertes de l'auberge. Tout ça, avec cette chose plantée dans ma poitrine comme une pierre qu'on aurait avalée.</w:t>
+        <w:t xml:space="preserve">— Je n'ai rien d'autre à te donner que trois jours. Elle l'a dit sans amertume, simplement usée jusqu'à la trame. Trois jours, alors. Le festival. Elle a esquissé un petit rire brisé. Et c'est moi qui suis censée l'animer. Sourire aux clients. Juger le concours de tartes samedi. Me lever et souhaiter la bienvenue à tout le monde pour les portes ouvertes de l'auberge. Tout ça, avec cette chose plantée dans ma poitrine comme une pierre qu'on aurait avalée.</w:t>
       </w:r>
     </w:p>
     <w:p/>
@@ -3667,7 +3667,7 @@
     <w:p/>
     <w:p>
       <w:r>
-        <w:t>Mais quelqu'un le pouvait. Quelqu'un qui se déplaçait dans cette ville d'une manière si ordinaire qu'aucun regard ne s'accrocherait jamais à lui, qui pouvait passer à l'auberge au milieu de la foule du festival, poser un objet, continuer son chemin et ne laisser absolument aucune vague. Je ne voyais pas qui cela pouvait être. Mais avec deux notes entre les mains, j'ai eu l'intuition que la main qui les avait écrites et celle qui les avaient portées dans le hall n'étaient peut-être pas du tout la même.</w:t>
+        <w:t xml:space="preserve">Mais quelqu'un le pouvait. Quelqu'un qui se déplaçait dans cette ville d'une manière si ordinaire qu'aucun regard ne s'accrocherait jamais à lui, qui pouvait passer à l'auberge au milieu de la foule du festival, poser un objet, continuer son chemin et ne laisser absolument aucune vague. Je ne voyais pas qui cela pouvait être. Mais avec deux notes entre les mains, j'ai eu l'intuition que la main qui les avait écrites et celle qui les avait portées dans le hall n'étaient peut-être pas du tout la même.</w:t>
       </w:r>
     </w:p>
     <w:p/>
@@ -3685,7 +3685,7 @@
     <w:p/>
     <w:p>
       <w:r>
-        <w:t>Je suis sortie dans le froid avec Pip d'un pas canardeur tout près de mon talon et les banderoles du festival claquant au-dessus de nous. Je n'avais plus à me demander qui avait lu ces lettres. À présent, il me fallait découvrir combien de mains les avaient transportées. Et puis, le plus dur de tout, je devais décider ce que diable j'allais faire de cette réponse.</w:t>
+        <w:t xml:space="preserve">Je suis sortie dans le froid avec Pip qui se dandinait tout près de mon talon et les banderoles du festival claquant au-dessus de nous. Je n'avais plus à me demander qui avait lu ces lettres. À présent, il me fallait découvrir combien de mains les avaient transportées. Et puis, le plus dur de tout, je devais décider ce que diable j'allais faire de cette réponse.</w:t>
       </w:r>
     </w:p>
     <w:p>
@@ -3701,7 +3701,7 @@
     </w:p>
     <w:p>
       <w:r>
-        <w:t>La place du village s'était métamorphosée depuis le matin. Les tables à tréteaux que nous avions transportées et préparées avec tant de soin croulaient désormais sous les offrandes des habitants : les tourtes de Greta, cent pots de confiture, les raviolis de la femme de M. Kim et toute une table de mitaines tricotées par le cercle, disposées en rangs par taille. Sur l'estrade à l'extrémité nord, un groupe jouait, un vrai, trois vieillards et une fille au violon, de ce genre de musique qui donne envie même à ceux qui juraient ne pas danser de battre la mesure du pied sur le sol gelé. Des lanternes pendaient aux arbres dénudés. Des stands de cidre et de châtaignes grillées bordaient toute la place, et par-dessus tout cela brillaient les lumières du festival. Elles brillaient d'or à présent, chaque guirlande, régulières et chaleureuses. Pas une seule âme n'en a fait la remarque, car toute la ville avait décidé ensemble, sans un mot, que ces lumières avaient toujours été dorées et un point c'est tout.</w:t>
+        <w:t xml:space="preserve">La place du village s'était métamorphosée depuis le matin. Les tables à tréteaux que nous avions transportées et préparées avec tant de soin croulaient désormais sous les offrandes des habitants : les tartes de Greta, cent pots de confiture, les raviolis de la femme de M. Kim et toute une table de mitaines tricotées par le cercle, disposées en rangs par taille. Sur l'estrade à l'extrémité nord, un groupe jouait, un vrai, trois vieillards et une fille au violon, de ce genre de musique qui donne envie même à ceux qui juraient ne pas danser de battre la mesure du pied sur le sol gelé. Des lanternes pendaient aux arbres dénudés. Des stands de cidre et de châtaignes grillées bordaient toute la place, et par-dessus tout cela brillaient les lumières du festival. Elles brillaient d'or à présent, chaque guirlande, régulières et chaleureuses. Pas une seule âme n'en a fait la remarque, car toute la ville avait décidé ensemble, sans un mot, que ces lumières avaient toujours été dorées et un point c'est tout.</w:t>
       </w:r>
     </w:p>
     <w:p>
@@ -3736,7 +3736,7 @@
     </w:p>
     <w:p>
       <w:r>
-        <w:t>« On aurait dit que tu t'apprêtais à plaquer Mme Pelletier au sol », a-t-elle dit.</w:t>
+        <w:t xml:space="preserve">« On aurait dit que vous vous apprêtiez à plaquer Mme Pelletier au sol », a-t-elle dit.</w:t>
       </w:r>
     </w:p>
     <w:p>
@@ -3746,7 +3746,7 @@
     </w:p>
     <w:p>
       <w:r>
-        <w:t>« Ah bon. » Elle a bu une gorgée de son cidre. Elle ne me regardait pas. Elle observait la foule, comme je le faisais tout l'après-midi. « Sam Patel a pensé la même chose. Ça fait deux d'entre vous à surveiller la réception de Fiona. Il y a quelque chose que je devrais savoir, Mme Claus ? »</w:t>
+        <w:t xml:space="preserve">« Ah bon. » Elle a bu une gorgée de son cidre. Elle ne me regardait pas. Elle observait la foule, comme je le faisais tout l'après-midi. « Sam Patel a pensé la même chose. Ça fait deux d'entre vous à surveiller la réception de Fiona. Il y a quelque chose que je devrais savoir, madame Claus ? »</w:t>
       </w:r>
     </w:p>
     <w:p>
@@ -3761,17 +3761,17 @@
     </w:p>
     <w:p>
       <w:r>
-        <w:t>Elle a hoché la tête, comme si c'était une réponse qu'elle entendait souvent. « Tu sais où se trouve le poste. Le café est mauvais, mais la porte est ouverte. Les dimanches aussi. » Elle a incliné sa tasse vers le porche de l'auberge, où Pip posait dans une écharpe rouge pour une famille de cinq personnes. « Ton manchot a rapporté à la Société plus d'argent aujourd'hui que le maire de toute l'année. »</w:t>
-      </w:r>
-    </w:p>
-    <w:p>
-      <w:r>
-        <w:t>« Ne lui dis pas », ai-je dit. « Elle voudrait sa part. »</w:t>
-      </w:r>
-    </w:p>
-    <w:p>
-      <w:r>
-        <w:t>La magie était partout ce jour-là, de petites manières que la ville pouvait balayer d'un haussement d'épaules. Lorsque le groupe a entamé un reel, les lanternes dans les arbres ont oscillé légèrement, bien que je ne sentisse aucun vent. Des fougères givrées ont poussé à l'intérieur des fenêtres de l'auberge selon des motifs trop superbes pour être le fruit du hasard, ont fondu et ont repoussé. Et dans la dernière heure de clarté, alors que le soleil se couchait derrière les collines et que les lumières dorées du festival prenaient toute leur splendeur, il s'est mis à neiger, doucement, pour la première fois depuis la semaine où nous avions trouvé Boule de Neige. Des flocons épais et lents ont tournoyé sur la place, sur le groupe, les stands et les visages levés vers le ciel. Toute la ville s'est figée, d'un seul coup, a levé les yeux et s'est tue.</w:t>
+        <w:t xml:space="preserve">Elle a hoché la tête, comme si c'était une réponse qu'elle entendait souvent. « Vous savez où se trouve le poste. Le café est mauvais, mais la porte est ouverte. Les dimanches aussi. » Elle a incliné sa tasse vers le porche de l'auberge, où Pip posait dans une écharpe rouge pour une famille de cinq personnes. « Votre manchot a rapporté à la Société plus d'argent aujourd'hui que le maire de toute l'année. »</w:t>
+      </w:r>
+    </w:p>
+    <w:p>
+      <w:r>
+        <w:t xml:space="preserve">« Ne le lui dites pas », ai-je dit. « Elle voudrait sa part. »</w:t>
+      </w:r>
+    </w:p>
+    <w:p>
+      <w:r>
+        <w:t xml:space="preserve">La magie était partout ce jour-là, de petites manières que la ville pouvait balayer d'un haussement d'épaules. Lorsque le groupe a entamé un reel, les lanternes dans les arbres ont oscillé légèrement, bien que je ne sentisse aucun vent. Des fougères givrées ont poussé à l'intérieur des fenêtres de l'auberge selon des motifs trop superbes pour être le fruit du hasard, ont fondu et ont repoussé. Et dans la dernière heure de clarté, alors que le soleil se couchait derrière les collines et que les lumières dorées du festival prenaient toute leur splendeur, il s'est mis à neiger, doucement, pour la première fois depuis la semaine où nous avions trouvé Snowball. Des flocons épais et lents ont tournoyé sur la place, sur le groupe, les stands et les visages levés vers le ciel. Toute la ville s'est figée, d'un seul coup, a levé les yeux et s'est tue.</w:t>
       </w:r>
     </w:p>
     <w:p>
@@ -3812,7 +3812,7 @@
     <w:p/>
     <w:p>
       <w:r>
-        <w:t>J'avais écarté trois hommes, et ce faisant, je m'étais retrouvée seule dans une petite pièce face à la vérité que j'avais employée ces hommes à fuir.</w:t>
+        <w:t xml:space="preserve">J'avais écarté trois hommes, et ce faisant, je m'étais retrouvée seule dans une petite pièce face à la vérité que je m'étais servie d'eux pour fuir.</w:t>
       </w:r>
     </w:p>
     <w:p>
@@ -3844,7 +3844,7 @@
     </w:p>
     <w:p>
       <w:r>
-        <w:t>J'avais pris la seconde note et une feuille de papier de la Société, une feuille vierge que Theo m'avait tendue aux archives pour étiqueter de nouveaux dossiers, et que j'avais rapportée chez moi dans mon sac. Je les avais approchées toutes les deux de la lampe. Le même crème. Le même poids sous les doigts. Les mêmes fines vergures imprimées dans le grain, ces stries parallèles en relief que laisse la forme du cirié, faciles à deviner lorsqu'on sait tenir une feuille face à la lumière pour l'observer. Elles concordaient. Bien sûr qu'elles concordaient. La note avait été écrite sur du papier provenant du stock de Theo, la pile sur le comptoir d'accueil du bâtiment qu'il n'avait pas quitté depuis des jours.</w:t>
+        <w:t xml:space="preserve">J'avais pris la seconde note et une feuille de papier de la Société, une feuille vierge que Theo m'avait tendue aux archives pour étiqueter de nouveaux dossiers, et que j'avais rapportée chez moi dans mon sac. Je les avais approchées toutes les deux de la lampe. Le même crème. Le même poids sous les doigts. Les mêmes fines vergures imprimées dans le grain, ces stries parallèles en relief que laisse la forme du papetier, faciles à deviner lorsqu'on sait tenir une feuille face à la lumière pour l'observer. Elles concordaient. Bien sûr qu'elles concordaient. La note avait été écrite sur du papier provenant du stock de Theo, la pile sur le comptoir d'accueil du bâtiment qu'il n'avait pas quitté depuis des jours.</w:t>
       </w:r>
     </w:p>
     <w:p>
@@ -3854,7 +3854,7 @@
     </w:p>
     <w:p>
       <w:r>
-        <w:t>J'avais pleuré un peu, assise là à la table de la cuisine. Un homme bon venait de commettre un acte terrible, et je n'allais pas contempler cela les yeux secs.</w:t>
+        <w:t xml:space="preserve">J'avais pleuré un peu, assise là à la table de la cuisine. Un homme bon avait commis un acte terrible, et je n'allais pas contempler cela les yeux secs.</w:t>
       </w:r>
     </w:p>
     <w:p>
@@ -3870,7 +3870,7 @@
         <w:rPr>
           <w:i/>
         </w:rPr>
-        <w:t>I know how your family came by this inn,</w:t>
+        <w:t xml:space="preserve">Je sais comment votre famille a mis la main sur cette auberge,</w:t>
       </w:r>
       <w:r>
         <w:t xml:space="preserve"> disait la première note. Le vol proprement dit, la broche, la pierre, le prêteur sur gages de Ridgeline, tout se trouvait dans les lettres des Blackburn, dans les archives de Theo. Mais l'achat de l'auberge, l'acquisition de 1924, la trace écrite d'une propriété changeant de mains, ne figuraient dans aucune lettre des Blackburn. C'était un registre foncier. Un acte de propriété.</w:t>
@@ -3925,7 +3925,7 @@
     <w:p/>
     <w:p>
       <w:r>
-        <w:t>L'histoire était trop ennuyeuse pour être un mensonge, ce qui était précisément le but. Je lui ai raconté que le comité du festival avait besoin de l'ancien acte de propriété du square, le terrain communal lui-même, pour régler un petit différend concernant l'emplacement autorisé du chariot d'un marchand ambulant, et qu'elle serait adorable de me le chercher. Elle a soupiré, ce soupir faussement accablé d'une femme à qui l'on demande une corvée de plus en fin de journée, et elle est allée dans la salle des archives au fond pour le trouver.</w:t>
+        <w:t xml:space="preserve">L'histoire était trop ennuyeuse pour être un mensonge, ce qui était précisément le but. Je lui ai raconté que le comité du festival avait besoin de l'ancien acte de propriété du square, le terrain communal lui-même, pour régler un petit différend concernant l'emplacement autorisé du chariot d'un marchand ambulant, et qu'elle serait adorable de me le chercher. Elle a soupiré, ce soupir faussement accablé d'une femme à qui l'on demande une corvée de plus par une longue journée, et elle est allée dans la salle des archives au fond pour le trouver.</w:t>
       </w:r>
     </w:p>
     <w:p/>
@@ -3943,7 +3943,7 @@
         <w:rPr>
           <w:i/>
         </w:rPr>
-        <w:t>PROPERTY — EVERGREEN AVE — WINTER WONDERLAND INN.</w:t>
+        <w:t xml:space="preserve">PROPRIÉTÉ — EVERGREEN AVE — WINTER WONDERLAND INN.</w:t>
       </w:r>
     </w:p>
     <w:p/>
@@ -3985,7 +3985,7 @@
     <w:p/>
     <w:p>
       <w:r>
-        <w:t>Ses yeux étaient devenus brillants, et elle n'a pas pu lever les siens pour croiser les miens, pas plus qu'elle ne le pouvait chaque fois que l'histoire ancienne était évoquée à haute voix. J'ai compris, en me tenant là dans mon manteau avec l'acte du square dans mon sac, que Vera Reed n'était pas une scélérate. C'était une femme effrayée qui s'était laissée entraîner dans une combine par un homme en qui elle avait confiance, ou qu'elle pitiérait, ou les deux, et elle était allée trop loin pour faire marche arrière. Elle le savait, et elle ne dormait pas mieux que la femme qu'elle contribuait à détruire.</w:t>
+        <w:t xml:space="preserve">Ses yeux étaient devenus brillants, et elle n'a pas pu lever les siens pour croiser les miens, pas plus qu'elle ne le pouvait chaque fois que l'histoire ancienne était évoquée à haute voix. J'ai compris, en me tenant là dans mon manteau avec l'acte du square dans mon sac, que Vera Reed n'était pas une scélérate. C'était une femme effrayée qui s'était laissée entraîner dans une combine par un homme en qui elle avait confiance, ou qui lui faisait pitié, ou les deux, et elle était allée trop loin pour faire marche arrière. Elle le savait, et elle ne dormait pas mieux que la femme qu'elle contribuait à détruire.</w:t>
       </w:r>
     </w:p>
     <w:p/>
@@ -3997,7 +3997,7 @@
     <w:p/>
     <w:p>
       <w:r>
-        <w:t>Theo détenait le vol. Il l'avait trouvé dans les lettres de Blackburn, la broche, la pierre, le prêteur sur gages. Il l'avait répertorié de sa main soignée, &lt;hi&gt;le saphir en son cœur&lt;/hi&gt;, et ensuite il avait soustrait ces lettres des dossiers en les déclarant disparues. Mais Theo, en train de couler, épié par toute la ville, jamais chez lui, n'aurait pas pu faire le reste. Il n'aurait pas pu confirmer que l'auberge avait été achetée avec cet argent, car cette preuve ne se trouvait pas dans son bâtiment. Et il n'aurait pas pu transporter les notes à travers la ville pour en déposer une sur un bureau bondé en plein jour de festival, car Theo Hussein n'aurait pas pu descendre l'avenue Evergreen incognito pour sauver sa peau.</w:t>
+        <w:t xml:space="preserve">Theo détenait le vol. Il l'avait trouvé dans les lettres de Blackburn, la broche, la pierre, le prêteur sur gages. Il l'avait répertorié de sa main soignée, le saphir en son cœur, et ensuite il avait soustrait ces lettres des dossiers en les déclarant disparues. Mais Theo, en train de couler, épié par toute la ville, jamais chez lui, n'aurait pas pu faire le reste. Il n'aurait pas pu confirmer que l'auberge avait été achetée avec cet argent, car cette preuve ne se trouvait pas dans son bâtiment. Et il n'aurait pas pu transporter les notes à travers la ville pour en déposer une sur un bureau bondé en plein jour de festival, car Theo Hussein n'aurait pas pu descendre Evergreen Avenue incognito pour sauver sa peau.</w:t>
       </w:r>
     </w:p>
     <w:p/>
@@ -4009,13 +4009,13 @@
     <w:p/>
     <w:p>
       <w:r>
-        <w:t>Elles l'avaient fait ensemble. Theo pour la Société qu'il regardait mourir à petit feu. Vera pour l'argent dont elle avait si manifestement besoin, un salaire de commune pour un travail de grande ville et des factures qu'elle avait presque admises ne pas pouvoir payer. Ou pour lui, en partie, par une sorte de loyauté ou de pitié dont je ne voyais pas le fond. Je n'avais pas besoin de connaître ses motivations exactes. La structure était solide.</w:t>
-      </w:r>
-    </w:p>
-    <w:p/>
-    <w:p>
-      <w:r>
-        <w:t>Je les tenais toutes les deux. Après toute cette angoisse, cela aurait dû ressembler à une victoire, et pourtant j'avais plutôt l'impression de me tenir au sommet d'une longue colline que je n'avais nulle envie de descendre. Au pied de celle-ci se trouvaient deux personnes que j'avais connues et aimées, une amie qu'elles avaient broyée entre elles et toute une ville chaleureuse qui allait peut-être devoir apprendre quelque chose de laid sur deux de ses enfants.</w:t>
+        <w:t xml:space="preserve">Ils l'avaient fait ensemble. Theo pour la Société qu'il regardait mourir à petit feu. Vera pour l'argent dont elle avait si manifestement besoin, un salaire de commune pour un travail de grande ville et des factures qu'elle avait presque admises ne pas pouvoir payer. Ou pour lui, en partie, par une sorte de loyauté ou de pitié dont je ne voyais pas le fond. Je n'avais pas besoin de connaître ses motivations exactes. La structure était solide.</w:t>
+      </w:r>
+    </w:p>
+    <w:p/>
+    <w:p>
+      <w:r>
+        <w:t xml:space="preserve">Je les tenais tous les deux. Après toute cette angoisse, cela aurait dû ressembler à une victoire, et pourtant j'avais plutôt l'impression de me tenir au sommet d'une longue colline que je n'avais nulle envie de descendre. Au pied de celle-ci se trouvaient deux personnes que j'avais connues et aimées, une amie qu'ils avaient broyée entre eux et toute une ville chaleureuse qui allait peut-être devoir apprendre quelque chose de laid sur deux de ses enfants.</w:t>
       </w:r>
     </w:p>
     <w:p/>
@@ -4027,7 +4027,7 @@
     <w:p/>
     <w:p>
       <w:r>
-        <w:t>J'avais trouvé la vérité. Venait maintenant la partie la plus difficile, celle qu'aucune intelligence ne pouvait accomplir à ma place. Maintenant, je dois choisir comment cela va se terminer.</w:t>
+        <w:t xml:space="preserve">J'avais trouvé la vérité. Venait maintenant la partie la plus difficile, celle qu'aucune intelligence ne pouvait accomplir à ma place. Maintenant, il me fallait choisir comment cela se terminerait.</w:t>
       </w:r>
     </w:p>
     <w:p/>
@@ -4050,7 +4050,7 @@
     <w:p/>
     <w:p>
       <w:r>
-        <w:t>Cela se présentait ainsi. Je savais qui. Je savais comment. J'en détenais la preuve : la fiche de catalogue, le papier assorti tenu à la lampe, le titre de propriété de l'auberge posé hors de son tiroir. Je pouvais donc aller trouver Theo et Vera en toute discrétion, rien qu'à trois, sans personne d'autre au monde, et leur dire : Je sais. Arrêtez maintenant, et cela s'arrête ici, ce soir, sans que personne d'autre ne se doute de rien. Plus jamais. Et ils l'auraient fait, car c'étaient des âmes effrayées et non des criminels endurcis. Ils auraient pleuré de soulagement d'être épargnés. Les lettres cesseraient, et Fiona serait en sécurité. Le secret retournerait dans sa valise au grenier. Theo garderait sa Société et sa bonne réputation, et Vera son poste. La ville n'aurait jamais à apprendre que deux de ses enfants avaient mal tourné pour une simple saison difficile. Tous ceux que j'aimais seraient épargnés par ce chagrin.</w:t>
+        <w:t xml:space="preserve">Cela se présentait ainsi. Je savais qui. Je savais comment. J'en détenais la preuve : la fiche de catalogue, le papier assorti tenu à la lampe, le titre de propriété de l'auberge posé hors de son tiroir. Je pouvais donc aller trouver Theo et Vera en toute discrétion, rien qu'à trois, sans personne d'autre au monde, et leur dire : Je sais. Arrêtez maintenant, et cela s'arrête ici, ce soir, sans que personne d'autre ne se doute de rien. Plus jamais. Et ils l'auraient fait, car c'étaient des âmes effrayées et non des criminels endurcis. Ils auraient pleuré de soulagement d'être épargnés. Les notes cesseraient, et Fiona serait en sécurité. Le secret retournerait dans son coffre au grenier. Theo garderait sa Société et sa bonne réputation, et Vera son poste. La ville n'aurait jamais à apprendre que deux de ses enfants avaient mal tourné pour une simple saison difficile. Tous ceux que j'aimais seraient épargnés par ce chagrin.</w:t>
       </w:r>
     </w:p>
     <w:p/>
@@ -4074,7 +4074,7 @@
     <w:p/>
     <w:p>
       <w:r>
-        <w:t>Un mot murmuré dans l'ombre protégerait chaque personne, à l'exception de celle qu'il était censé protéger par-dessus tout. Cela ne libérerait pas Fiona. Cela changerait seulement entre quelles mains son secret reposait. En cet instant, un maître chanteur le détenait. Après ma clémence discrète, ce serait moi. Nick aussi, et Theo et Vera également, pardonnés et blanchis, les deux seules personnes au monde qui savaient exactement comment transformer cette valise de grenier en une fortune. Fiona passerait le reste de ses jours à savoir que deux de ses voisins avaient jadis tenté de lui extorquer une rançon et s'en étaient tirés sans le moindre mal, et qu'ils pourraient recommencer, par n'importe quelle mauvaise nuit, par n'importe quel hiver de détresse au fil des ans. La peur ne s'éteindrait pas. Elle se tairait seulement. J'avais lu dix mille lettres au Pôle, et la blessure qu'elles recelaient était si souvent un secret porté seul dans la nuit.</w:t>
+        <w:t xml:space="preserve">Un mot murmuré dans l'ombre protégerait chaque personne, à l'exception de celle qu'il était censé protéger par-dessus tout. Cela ne libérerait pas Fiona. Cela changerait seulement entre quelles mains son secret reposait. En cet instant, un maître chanteur le détenait. Après ma clémence discrète, ce serait moi. Nick aussi, et Theo et Vera également, pardonnés et blanchis, les deux seules personnes au monde qui savaient exactement comment transformer ce coffre du grenier en une fortune. Fiona passerait le reste de ses jours à savoir que deux de ses voisins avaient jadis tenté de lui extorquer une rançon et s'en étaient tirés sans le moindre mal, et qu'ils pourraient recommencer, par n'importe quelle mauvaise nuit, par n'importe quel hiver de détresse au fil des ans. La peur ne s'éteindrait pas. Elle se tairait seulement. J'avais lu dix mille lettres au Pôle, et la blessure qu'elles recelaient était si souvent un secret porté seul dans la nuit.</w:t>
       </w:r>
     </w:p>
     <w:p/>
@@ -4104,13 +4104,13 @@
     <w:p/>
     <w:p>
       <w:r>
-        <w:t>« Je ne peux pas l'enfouir, ai-je repris. Dieu sait si j'en ai envie. Dieu sait que j'aimerais aller là-bas ce soir, chuchoter pour effacer tout cela et laisser chacun à sa vie. Mais si je fais ça, Fiona ne cesse jamais d'avoir peur, pas vraiment. Theo n'a jamais à devenir un homme digne d'être pardonné. Et la pourriture continue de ronger les murs en cachettes, hors de ma vue. » J'ai pressé la paume de mes mains contre mes yeux. « La solution charitable et la solution facile ne se recoupent pas. Tout doit remonter à la lumière. Entièrement. Par le canal de Noriko Tanaka. Selon les voies de la loi, appliquées avec douceur, avec clémence, mais appliquées. C'est le seul moyen pour que Fiona s'en affranchisse pour de bon, et le seul moyen pour que Theo devienne autre chose qu'un homme portant un crime scellé sous ses planches. »</w:t>
-      </w:r>
-    </w:p>
-    <w:p/>
-    <w:p>
-      <w:r>
-        <w:t>« C'est la voie la plus rude, a dit doucement Nick. Pour toi plus que pour tous. La ville va porter le deuil, Jess, et certains regretteront que tu n'aies rien dit, et c'est toi qui auras attiré cette peine sur eux. Ils sauront que c'est ton œuvre. »</w:t>
+        <w:t xml:space="preserve">« Je ne peux pas l'enfouir, ai-je repris. Dieu sait si j'en ai envie. Dieu sait que j'aimerais aller là-bas ce soir, chuchoter pour effacer tout cela et laisser chacun à sa vie. Mais si je fais ça, Fiona ne cesse jamais d'avoir peur, pas vraiment. Theo n'a jamais à devenir un homme digne d'être pardonné. Et la pourriture continue de ronger les murs en cachette, hors de ma vue. » J'ai pressé la paume de mes mains contre mes yeux. « La solution charitable et la solution facile ne se recoupent pas. Tout doit remonter à la lumière. Entièrement. Par le canal de Noriko Tanaka. Selon les voies de la loi, appliquées avec douceur, avec clémence, mais appliquées. C'est le seul moyen pour que Fiona s'en affranchisse pour de bon, et le seul moyen pour que Theo devienne autre chose qu'un homme portant un crime scellé sous ses planches. »</w:t>
+      </w:r>
+    </w:p>
+    <w:p/>
+    <w:p>
+      <w:r>
+        <w:t xml:space="preserve">« C'est la voie la plus rude, a dit doucement Nick. Pour toi plus que pour tous. La ville va porter le deuil, Jess, et certains regretteront que tu n'aies pas laissé les choses en l'état, et c'est toi qui auras attiré cette peine sur eux. Ils sauront que c'est ton œuvre. »</w:t>
       </w:r>
     </w:p>
     <w:p/>
@@ -4140,7 +4140,7 @@
     <w:p/>
     <w:p>
       <w:r>
-        <w:t>Nick s'est penché et a pris ma main. Son regard exprimait à la fois la fierté et la peine. « Alors nous y parviendrons ensemble, a-t-il dit. Et Jess. Quel qu'en soit le prix pour toi auprès des gens, à la fin. Tu ne seras pas l'étrangère qui a brisék un homme bon. Tu seras celle qui a aimé cet endroit assez pour le guérir. Certains refuseront de le voir un temps. Mais moi, je le vois. Et ceux qui comptent finiront par le comprendre. »</w:t>
+        <w:t xml:space="preserve">Nick s'est penché et a pris ma main. Son regard exprimait à la fois la fierté et la peine. « Alors nous y parviendrons ensemble, a-t-il dit. Et Jess. Quel qu'en soit le prix pour toi auprès des gens, à la fin. Tu ne seras pas l'étrangère qui a brisé un homme bon. Tu seras celle qui a aimé cet endroit assez pour le guérir. Certains refuseront de le voir un temps. Mais moi, je le vois. Et ceux qui comptent finiront par le comprendre. »</w:t>
       </w:r>
     </w:p>
     <w:p/>
@@ -4259,7 +4259,7 @@
     <w:p/>
     <w:p>
       <w:r>
-        <w:t>« Être dans la pièce, ai-je dit. Si tu peux le supporter. Pas pour accuser qui que ce soit. Juste pour être là, pour que Theo doive regarder le visage de l'amie qu'il a essayée de blesser, et pour que tu ne sois plus celle qu'on laisse seule dans le noir avec ça. Tu n'as pas à prononcer un seul mot si tu ne le veux pas. Mais c'est ton histoire, Fiona, plus que celle de n'importe qui. Tu devrais être là quand elle finira par remonter à la lumière. »</w:t>
+        <w:t xml:space="preserve">« Être dans la pièce, ai-je dit. Si tu peux le supporter. Pas pour accuser qui que ce soit. Juste pour être là, pour que Theo doive regarder le visage de l'amie qu'il a essayé de blesser, et pour que tu ne sois plus celle qu'on laisse seule dans le noir avec ça. Tu n'as pas à prononcer un seul mot si tu ne le veux pas. Mais c'est ton histoire, Fiona, plus que celle de n'importe qui. Tu devrais être là quand elle finira par remonter à la lumière. »</w:t>
       </w:r>
     </w:p>
     <w:p/>
@@ -4330,7 +4330,7 @@
     <w:p/>
     <w:p>
       <w:r>
-        <w:t xml:space="preserve">« Theo », ai-je dit. « Les lettres de chantage envoyées à Fiona ont été écrites sur le papier à en-tête de la Société. Le papier vélin épais aux vergures marquées. Je l'ai comparé grain à grain avec une feuille de ton stock. » Il a tressailli, mais j'ai continué, d'une voix assurée. « Et elles décrivent la broche comme </w:t>
+        <w:t xml:space="preserve">« Theo », ai-je dit. « Les lettres de chantage envoyées à Fiona ont été écrites sur le papier à en-tête de la Société. Le papier vergé épais aux vergures marquées. Je l'ai comparé grain à grain avec une feuille de ton stock. » Il a tressailli, mais j'ai continué, d'une voix assurée. « Et elles décrivent la broche comme </w:t>
       </w:r>
       <w:r>
         <w:rPr>
@@ -4351,7 +4351,7 @@
     <w:p/>
     <w:p>
       <w:r>
-        <w:t>« Je me suis dit que ce n'était pas vraiment du vol », a-t-il dit. « Pas à Fiona. Je me suis dit que l'auberge avait été achetée avec de l'argent volé à l'origine, alors en reprendre un peu n'était pas un vol, c'était, je ne sais pas, l'histoire se corrigeant elle-même, une créance enfin exigible. Je suis si doué pour donner au passé le sens dont j'ai besoin. C'est le fruit de toute ma formation, faire en sorte que le passé ait un sens. » Il a pressé ses poings contre ses yeux comme un enfant. « Le toit s'effondre. La chaudière est en train de lâcher. Cent ans de mémoire de cette ville, chaque lettre, chaque photographie, chaque acte, tout cela partant à vau-l'eau, et chaque porte honnête à laquelle j'ai frappé fermée à mon nez, le maire, les subventions, les fondations, toutes sans exception. Et puis j'ai trouvé ces lettres, et c'était là, un demi-million de dollars, bien calé dans le passé, et je me suis dit, je peux sauver ça. Je peux tout sauver, chaque bribe, et personne ne sera vraiment blessé, parce que l'argent était de toute façon sale au départ. » Il a levé les yeux, l'air misérable. « Et puis j'ai vu ce que cela lui faisait. À Fiona. Je l'ai vue grisonner. Et je me suis dit que j'arrêterais, et je n'ai pas arrêté, parce que j'étais déjà engrené, et une fois que je l'avais fait, je me suis dit qu'une de plus ne changerait rien. » Il s'est tourné vers Fiona, et sa voix s'est brisée. « Je suis tellement désolé. Je suis tellement désolé, Fiona. Je me suis perdu quelque part là-dedans. J'aime tellement l'histoire de cette ville que j'ai oublié qu'elle est faite de personnes vivantes. »</w:t>
+        <w:t xml:space="preserve">« Je me suis dit que ce n'était pas vraiment du vol », a-t-il dit. « Pas à Fiona. Je me suis dit que l'auberge avait été achetée avec de l'argent volé à l'origine, alors en reprendre un peu n'était pas un vol, c'était, je ne sais pas, l'histoire se corrigeant elle-même, une créance enfin exigible. Je suis si doué pour donner au passé le sens dont j'ai besoin. C'est le fruit de toute ma formation, faire en sorte que le passé ait un sens. » Il a pressé ses poings contre ses yeux comme un enfant. « Le toit s'effondre. La chaudière est en train de lâcher. Cent ans de mémoire de cette ville, chaque lettre, chaque photographie, chaque acte, tout cela partant à vau-l'eau, et chaque porte honnête à laquelle j'ai frappé fermée à mon nez, le maire, les subventions, les fondations, toutes sans exception. Et puis j'ai trouvé ces lettres, et c'était là, un demi-million de dollars, bien calé dans le passé, et je me suis dit, je peux sauver ça. Je peux tout sauver, chaque bribe, et personne ne sera vraiment blessé, parce que l'argent était de toute façon sale au départ. » Il a levé les yeux, l'air misérable. « Et puis j'ai vu ce que cela lui faisait. À Fiona. Je l'ai vue blêmir. Et je me suis dit que j'arrêterais, et je n'ai pas arrêté, parce que j'étais déjà pris dans l'engrenage, et une fois que je l'avais fait, je me suis dit qu'une de plus ne changerait rien. » Il s'est tourné vers Fiona, et sa voix s'est brisée. « Je suis tellement désolé. Je suis tellement désolé, Fiona. Je me suis perdu quelque part là-dedans. J'aime tellement l'histoire de cette ville que j'ai oublié qu'elle est faite de personnes vivantes. »</w:t>
       </w:r>
     </w:p>
     <w:p/>
@@ -4363,13 +4363,13 @@
     <w:p/>
     <w:p>
       <w:r>
-        <w:t>Je me suis alors tourné vers Vera, et je l'ai fait avec douceur, car elle était assise là à trembler, les bras enroulés autour d'elle. Elle était déjà presque arrivée à la vérité par elle-même.</w:t>
-      </w:r>
-    </w:p>
-    <w:p/>
-    <w:p>
-      <w:r>
-        <w:t>« Vera », ai-je dit. « Theo a commis le vol. Mais les notes indiquaient que l'auberge avait été achetée avec l'argent de la broche, et cela ne figurait dans aucune lettre des Blackburn. C'est un registre foncier. Un acte de propriété. Et l'acte de propriété de cette auberge reposait hors de son tiroir dans ton panier de reclassement hier matin, manipulé, sur le bureau d'une femme qui m'avait affirmé deux fois qu'elle ne consulte jamais les archives dans son dos. » J'ai gardé la voix douce. « Il a commis le vol. Tu avais l'acte. Et tu avais les jambes, Vera. Il n'aurait pas pu traverser cette ville inaperçu pour tout l'or du monde, tout le monde connaît Theo, tout le monde l'arrête. Mais personne ne sourcille si la secrétaire du maire passe à l'auberge pendant le festival. Je t'ai croisée moi-même sur les marches ce matin-là, avec tes cartes de stationnement. Il n'aurait pas pu le faire seul. Il avait besoin de quelqu'un capable de se mouvoir dans la ville sans être vu. C'était toi. »</w:t>
+        <w:t xml:space="preserve">Je me suis alors tournée vers Vera, et je l'ai fait avec douceur, car elle était assise là à trembler, les bras enroulés autour d'elle. Elle était déjà presque arrivée à la vérité par elle-même.</w:t>
+      </w:r>
+    </w:p>
+    <w:p/>
+    <w:p>
+      <w:r>
+        <w:t xml:space="preserve">« Vera », ai-je dit. « Theo détenait le vol. Mais les notes indiquaient que l'auberge avait été achetée avec l'argent de la broche, et cela ne figurait dans aucune lettre des Blackburn. C'est un registre foncier. Un acte de propriété. Et l'acte de propriété de cette auberge reposait hors de son tiroir dans ton panier de reclassement hier matin, manipulé, sur le bureau d'une femme qui m'avait affirmé deux fois qu'elle ne consulte jamais les archives dans son dos. » J'ai gardé la voix douce. « Il détenait le vol. Tu avais l'acte. Et tu avais les jambes, Vera. Il n'aurait pas pu traverser cette ville inaperçu pour tout l'or du monde, tout le monde connaît Theo, tout le monde l'arrête. Mais personne ne sourcille si la secrétaire du maire passe à l'auberge pendant le festival. Je t'ai croisée moi-même sur les marches ce matin-là, avec tes cartes de stationnement. Il n'aurait pas pu le faire seul. Il avait besoin de quelqu'un capable de se mouvoir dans la ville sans être vu. C'était toi. »</w:t>
       </w:r>
     </w:p>
     <w:p/>
@@ -4381,7 +4381,7 @@
     <w:p/>
     <w:p>
       <w:r>
-        <w:t>« Il est venu me voir », a-t-elle dit. « Il y a des semaines. Pratiquement hors de lui, à me parler de la Société, de la façon dont il avait découvert cette chose et ne pouvait pas agir seul. Et j'aurais dû dire non. Je sais que j'aurais dû dire non, je le savais déjà. » Elle s'est balancée légèrement, les bras serrés autour d'elle. « Mais je suis tellement dans le pétrin, Mme Claus. Le maire me paie une misère et m'exploite jusqu'à la moelle, et j'ai des dettes à vous couper le sommeil, de celles qui ne vous laissent pas dormir, et Theo disait que c'était de l'argent volé à l'origine, à une riche famille il y a cent ans, et que cela sauverait la Société, et qu'une part me reviendrait, et que je pourrais enfin souffler. Il a fait passer ça pour presque noble. Il est doué pour ça, faire passer une affaire pour de l'histoire au lieu d'un crime. Et je voulais tellement m'en sortir que je l'ai laissé me le présenter ainsi, parce que je voulais y croire. » Elle a regardé Fiona, accablée. « Je n'ai jamais pensé à vous en tant que personne. C'est le pire, c'est ce que je vais traîner. Je n'ai pensé qu'à l'argent et aux nuits blanches. Je suis désolée. Je suis tellement désolée, Fiona. »</w:t>
+        <w:t xml:space="preserve">« Il est venu me voir », a-t-elle dit. « Il y a des semaines. Pratiquement hors de lui, à me parler de la Société, de la façon dont il avait découvert cette chose et ne pouvait pas agir seul. Et j'aurais dû dire non. Je sais que j'aurais dû dire non, je le savais déjà. » Elle s'est balancée légèrement, les bras serrés autour d'elle. « Mais je suis tellement dans le pétrin, madame Claus. Le maire me paie une misère et m'exploite jusqu'à la moelle, et j'ai des dettes à vous couper le sommeil, de celles qui ne vous laissent pas dormir, et Theo disait que c'était de l'argent volé à l'origine, à une riche famille il y a cent ans, et que cela sauverait la Société, et qu'une part me reviendrait, et que je pourrais enfin souffler. Il a fait passer ça pour presque noble. Il est doué pour ça, faire passer une affaire pour de l'histoire au lieu d'un crime. Et je voulais tellement m'en sortir que je l'ai laissé me le présenter ainsi, parce que je voulais y croire. » Elle a regardé Fiona, accablée. « Je n'ai jamais pensé à vous en tant que personne. C'est le pire, c'est ce que je vais traîner. Je n'ai pensé qu'à l'argent et aux nuits blanches. Je suis désolée. Je suis tellement désolée, Fiona. »</w:t>
       </w:r>
     </w:p>
     <w:p/>
@@ -4428,7 +4428,7 @@
     <w:p/>
     <w:p>
       <w:r>
-        <w:t>« La justice réparatrice, nous a-t-elle expliqué ensuite à tous, en termes plus simples, autour d'un café à l'auberge. Ça ne marche que si la personne qui a commis la faute regarde le mal en face et aide à le réparer de ses propres mains. C'est donc ce qu'ils vont faire. Pas de cellule. Quelque chose de plus dur qu'une cellule, à sa manière. Ils vont réparer les choses, devant les personnes qu'ils ont blessées, sur une longue période. Et s'ils échouent, la porte la plus dure est toujours là, ouverte juste derrière eux. »</w:t>
+        <w:t xml:space="preserve">« La justice restaurative, nous a-t-elle expliqué ensuite à tous, en termes plus simples, autour d'un café à l'auberge. Ça ne marche que si la personne qui a commis la faute regarde le mal en face et aide à le réparer de ses propres mains. C'est donc ce qu'ils vont faire. Pas de cellule. Quelque chose de plus dur qu'une cellule, à sa manière. Ils vont réparer les choses, devant les personnes qu'ils ont blessées, sur une longue période. Et s'ils échouent, la porte la plus dure est toujours là, ouverte juste derrière eux. »</w:t>
       </w:r>
     </w:p>
     <w:p/>
@@ -4482,7 +4482,7 @@
     <w:p/>
     <w:p>
       <w:r>
-        <w:t>Je suis allée voir Vera toute seule, après. Je l'ai trouvée en train de ranger les dernières affaires de son bureau à l'hôtel de ville, et je l'ai aidée à porter un carton jusqu'à sa voiture. Pip attendait sur la dernière marche, l'œil fixé sur un presse-papier en laiton qui dépassait du haut du carton. Sur les marches froides, j'ai dit à Vera ce que j'étais venue lui dire.</w:t>
+        <w:t xml:space="preserve">Je suis allée voir Vera toute seule, après. Je l'ai trouvée en train de ranger les dernières affaires de son bureau à la mairie, et je l'ai aidée à porter un carton jusqu'à sa voiture. Pip attendait sur la dernière marche, l'œil fixé sur un presse-papier en laiton qui dépassait du haut du carton. Sur les marches froides, j'ai dit à Vera ce que j'étais venue lui dire.</w:t>
       </w:r>
     </w:p>
     <w:p/>
@@ -4500,13 +4500,13 @@
     <w:p/>
     <w:p>
       <w:r>
-        <w:t>Fiona était libre. Les notes avaient cessé. Le secret était sorti des ténèbres, et hors des ténèbres, il n'avait plus aucune mordant. Deux personnes qui s'étaient égarées regardaient la réalité en face maintenant, et commençaient, tout juste, à entamer la longue marche vers elles-mêmes.</w:t>
-      </w:r>
-    </w:p>
-    <w:p/>
-    <w:p>
-      <w:r>
-        <w:t>Cela aurait dû être la fin. Mais il restait la question de la Société elle-même, la chose même que Theo avait ruiné sa santé à essayer de sauver. Il en était exclu maintenant. Le toit laissait toujours passer la pluie et la chaudière rendait toujours l'âme, et rien dans tout ce règlement de comptes n'avait rapporté un seul dollar pour l'une ou l'autre de ces urgences.</w:t>
+        <w:t xml:space="preserve">Fiona était libre. Les notes avaient cessé. Le secret était sorti des ténèbres, et hors des ténèbres, il n'avait plus aucun mordant. Deux personnes qui s'étaient égarées regardaient la réalité en face maintenant, et commençaient, tout juste, à entamer la longue marche vers elles-mêmes.</w:t>
+      </w:r>
+    </w:p>
+    <w:p/>
+    <w:p>
+      <w:r>
+        <w:t xml:space="preserve">Cela aurait dû être la fin. Mais il restait la question de la Société elle-même, la chose même que Theo s'était perdu à vouloir sauver. Il en était exclu maintenant. Le toit laissait toujours passer la pluie et la chaudière rendait toujours l'âme, et rien dans tout ce règlement de comptes n'avait rapporté un seul dollar pour l'une ou l'autre de ces urgences.</w:t>
       </w:r>
     </w:p>
     <w:p/>
@@ -4528,12 +4528,12 @@
     </w:p>
     <w:p>
       <w:r>
-        <w:t>Ils étaient au courant, bien sûr. Rien de tel ne restait secret à Frost Falls plus d'une matinée. Les polis et aimables Worthington avaient compris, à travers les rumeurs du festival et le silence de l'auberge, que la Société Historique traversait de graves difficultés financières et que ces difficultés avaient poussé un homme intègre à commettre un acte répréhensible. M. Worthington m'a trouvée sur la véranda de l'auberge lors de leur dernier matin, sa femme à ses côtés dans son cachemire crème, son beau manteau posé sur le bras, et il est allé droit au but avec l'aisance d'un homme pour qui l'argent n'avait jamais été un sujet difficile à aborder.</w:t>
-      </w:r>
-    </w:p>
-    <w:p>
-      <w:r>
-        <w:t>« Madame Claus, a-t-il dit. Nous nous sommes attachés à cette ville pendant nos semaines ici. Vraiment attachés. Et nous comprenons que la Société Historique traverse une réelle détresse financière. Une détresse sérieuse, d'après ce que l'on entend. » Il a souri, chaleureux et assuré. « Nous sommes en mesure d'aider. Généreusement. Assez pour régler toute l'affaire d'un seul coup, le toit, la chaudière, et une dotation en plus pour assurer la pérennité de l'endroit pour une génération. Je serais heureux de faire le chèque avant de partir ce matin. Cela nous coûterait très peu et signifierait beaucoup ici, et franchement, après toute cette laideur, je pense que la ville a bien besoin d'une bonne nouvelle pour clore la saison. »</w:t>
+        <w:t xml:space="preserve">Ils étaient au courant, bien sûr. Rien de tel ne restait secret à Frost Falls plus d'une matinée. Les polis et aimables Worthington avaient compris, à travers les rumeurs du festival et le silence de l'auberge, que la Société historique traversait de graves difficultés financières et que ces difficultés avaient poussé un homme intègre à commettre un acte répréhensible. M. Worthington m'a trouvée sur la véranda de l'auberge lors de leur dernier matin, sa femme à ses côtés dans son cachemire crème, son beau manteau posé sur le bras, et il est allé droit au but avec l'aisance d'un homme pour qui l'argent n'avait jamais été un sujet difficile à aborder.</w:t>
+      </w:r>
+    </w:p>
+    <w:p>
+      <w:r>
+        <w:t xml:space="preserve">« Madame Claus, a-t-il dit. Nous nous sommes attachés à cette ville pendant nos semaines ici. Vraiment attachés. Et nous comprenons que la Société historique traverse une réelle détresse financière. Une détresse sérieuse, d'après ce que l'on entend. » Il a souri, chaleureux et assuré. « Nous sommes en mesure d'aider. Généreusement. Assez pour régler toute l'affaire d'un seul coup, le toit, la chaudière, et une dotation en plus pour assurer la pérennité de l'endroit pour une génération. Je serais heureux de faire le chèque avant de partir ce matin. Cela nous coûterait très peu et signifierait beaucoup ici, et franchement, après toute cette laideur, je pense que la ville a bien besoin d'une bonne nouvelle pour clore la saison. »</w:t>
       </w:r>
     </w:p>
     <w:p>
@@ -4553,7 +4553,7 @@
     </w:p>
     <w:p>
       <w:r>
-        <w:t>« C'est un grand cœur, monsieur Worthington, ai-je dit. Et je vais vous dire maintenant quelque chose qui risque de vous sembler étrange, et j'espère que vous l'entendrez telle qu'elle est pensée, car ce n'est pas un refus de votre gentillesse. Je pense que vous devriez garder votre chèque. Pour l'instant. »</w:t>
+        <w:t xml:space="preserve">« C'est un grand cœur, monsieur Worthington, ai-je dit. Et je vais vous dire maintenant quelque chose qui risque de vous sembler étrange, et j'espère que vous l'entendrez dans l'esprit où je le dis, car ce n'est pas un refus de votre gentillesse. Je pense que vous devriez garder votre chèque. Pour l'instant. »</w:t>
       </w:r>
     </w:p>
     <w:p>
@@ -4637,7 +4637,7 @@
     <w:p/>
     <w:p>
       <w:r>
-        <w:t>Pip s'est approchée du poêle pour inspecter le dossier, n'y a rien trouvé qui sentît le poisson, et est retournée dans son panier.</w:t>
+        <w:t xml:space="preserve">Pip a quitté le poêle pour venir inspecter le dossier, n'y a rien trouvé qui sentît le poisson, et est retournée dans son panier.</w:t>
       </w:r>
     </w:p>
     <w:p/>
@@ -4655,7 +4655,7 @@
         <w:t>&lt;/bt&gt;</w:t>
       </w:r>
       <w:r>
-        <w:t>, la version vraie et complète, avec les documents de Neil à l'appui. Pas la version mondaine avec son petit méchant bien propre et son petit crime bien net, mais la vraie. Constance Okafor, une servante de dix-neuf ans pendant l'hiver de 1924, impayée depuis des mois, sa mère mourant trois rues plus loin sans un sou pour payer un médecin, à qui l'on répétait d'être reconnaissante d'avoir un toit pendant qu'elle dépoussiérait, chaque jour que le bon Dieu faisait, une broche valant plus que tout ce qu'elle gagnerait en trois vies. Une fille aux abois qui a pris la seule chose qu'elle pouvait atteindre, à une famille qui l'avait volée la première, et qui en a fait cent ans d'accueil honnête pour les voyageurs traversant Frost Falls dans le froid.</w:t>
+        <w:t xml:space="preserve">, la version vraie et complète, avec les documents de Neil à l'appui. Pas la version des commérages avec son petit méchant bien propre et son petit crime bien net, mais la vraie. Constance Okafor, une servante de dix-neuf ans pendant l'hiver de 1924, impayée depuis des mois, sa mère mourant trois rues plus loin sans un sou pour payer un médecin, à qui l'on répétait d'être reconnaissante d'avoir un toit pendant qu'elle dépoussiérait, chaque jour que le bon Dieu faisait, une broche valant plus que tout ce qu'elle gagnerait en trois vies. Une fille aux abois qui a pris la seule chose qu'elle pouvait atteindre, à une famille qui l'avait volée la première, et qui en a fait cent ans d'accueil honnête pour les voyageurs traversant Frost Falls dans le froid.</w:t>
       </w:r>
     </w:p>
     <w:p/>
@@ -4667,13 +4667,13 @@
     <w:p/>
     <w:p>
       <w:r>
-        <w:t>Martha a eu les mots les plus justes à ce sujet, lors de l'atelier, ses aiguilles cliquant sans s'arrêter et ses yeux rivés sur son ouvrage.</w:t>
-      </w:r>
-    </w:p>
-    <w:p/>
-    <w:p>
-      <w:r>
-        <w:t>« Constance Okafor a volé pour essayer de sauver sa mère, a-t-elle dit, et elle a construit une maison qui garde cette ville au chaud depuis cent ans. Si quelqu'un à Frost Falls veut lui jeter la première pierre à cause d'une broche, il peut venir me la jeter à moi d'abord, parce que j'ai connu la misère quand j'étais jeune, la vraie misère, et la moitié des grands-mères des gens assis dans cette boutique aussi. Foutez-lui la paix. Laissez Fiona se tenir droite. C'est une belle histoire. Il y a juste un passage difficile au milieu. »</w:t>
+        <w:t xml:space="preserve">Martha a eu les mots les plus justes à ce sujet, au cercle, ses aiguilles cliquant sans s'arrêter et ses yeux rivés sur son ouvrage.</w:t>
+      </w:r>
+    </w:p>
+    <w:p/>
+    <w:p>
+      <w:r>
+        <w:t xml:space="preserve">« Constance Okafor a volé pour essayer de sauver sa mère, a-t-elle dit, et elle a construit une maison qui garde cette ville au chaud depuis cent ans. Si quelqu'un à Frost Falls veut lui jeter la première pierre à cause d'une broche, il peut venir me la jeter à moi d'abord, parce que j'ai connu la misère quand j'étais jeune, la vraie misère, et la moitié des grands-mères des gens assis dans cette boutique aussi. Laissez-la reposer en paix. Laissez Fiona se tenir droite. C'est une belle histoire. Il y a juste un passage difficile au milieu. »</w:t>
       </w:r>
     </w:p>
     <w:p/>
@@ -4691,7 +4691,7 @@
     <w:p/>
     <w:p>
       <w:r>
-        <w:t>Je m'étais préparée à devenir l'étrangère qui avait brisé un homme intègre. J'étais persuadée à plus de moitié que la ville se refroidirait à mon égard, qu'elle regretterait que je n'aie pas laissé les choses en l'état, qu'elle se rappelerait, chaque fois qu'elle me croiserait, que j'étais celle qui avait tiré Theo Hussein en pleine lumière et jeté l'opprobre sur l'endroit. Et il y a eu un peu de cela, çà et là, pendant un temps. Quelques personnes qui ne pouvaient pas tout à fait croiser mon regard, qui prenaient un air un peu taciturne quand je poussais la porte d'un magasin. Je l'ai compris et j'ai laissé couler. Je n'ai rien forcé.</w:t>
+        <w:t xml:space="preserve">Je m'étais préparée à devenir l'étrangère qui avait brisé un homme intègre. J'étais persuadée à plus de moitié que la ville se refroidirait à mon égard, qu'elle regretterait que je n'aie pas laissé les choses en l'état, qu'elle se rappellerait, chaque fois qu'elle me croiserait, que j'étais celle qui avait tiré Theo Hussein en pleine lumière et plongé l'endroit dans le chagrin. Et il y a eu un peu de cela, çà et là, pendant un temps. Quelques personnes qui ne pouvaient pas tout à fait croiser mon regard, qui prenaient un air un peu taciturne quand je poussais la porte d'un magasin. Je l'ai compris et j'ai laissé couler. Je n'ai rien forcé.</w:t>
       </w:r>
     </w:p>
     <w:p/>
@@ -4703,7 +4703,7 @@
     <w:p/>
     <w:p>
       <w:r>
-        <w:t>Et Martha. Martha m'a attrapé la main à l'atelier un après-midi gris, l'a serrée et a dit : « Tu te rappelles, il y a quelque temps, je t'ai dit que tu n'avais pas à porter les choses toute seule ? Qu'un cercle est fait pour s'y appuyer ? » J'ai répondu que je m'en souvenais très bien. « Eh bien, a-t-elle repris, tu as prouvé que tu faisais partie des nôtres, en portant ça comme tu l'as fait. Tu ne t'es pas contentée de t'appuyer sur le cercle quand tu en avais besoin. Tu as été le cercle, pour Fiona, alors qu'elle n'avait personne d'autre. Une étrangère ne fait pas ça, Jessica. Une des nôtres, si. » Et elle m'a tapoté la main une fois avant de replonger aussitôt dans sa mitaine, comme si elle ne venait pas de me détruire complètement là où j'étais assise.</w:t>
+        <w:t xml:space="preserve">Et Martha. Martha m'a attrapé la main au cercle un après-midi gris, l'a serrée et a dit : « Tu te rappelles, il y a quelque temps, je t'ai dit que tu n'avais pas à porter les choses toute seule ? Qu'un cercle est fait pour s'y appuyer ? » J'ai répondu que je m'en souvenais très bien. « Eh bien, a-t-elle repris, tu as prouvé que tu faisais partie des nôtres, en portant ça comme tu l'as fait. Tu ne t'es pas contentée de t'appuyer sur le cercle quand tu en avais besoin. Tu as été le cercle, pour Fiona, alors qu'elle n'avait personne d'autre. Une étrangère ne fait pas ça, Jessica. Une des nôtres, si. » Et elle m'a tapoté la main une fois avant de replonger aussitôt dans sa mitaine, comme si elle ne venait pas de me bouleverser complètement là où j'étais assise.</w:t>
       </w:r>
     </w:p>
     <w:p/>
@@ -4738,7 +4738,7 @@
         <w:rPr>
           <w:i/>
         </w:rPr>
-        <w:t>afin que ceux qui viendront après nous connaissent et sachent que nous avons pensé à eux.</w:t>
+        <w:t xml:space="preserve">afin que ceux qui viendront après nous nous connaissent et sachent que nous avons pensé à eux.</w:t>
       </w:r>
     </w:p>
     <w:p/>
@@ -4768,7 +4768,7 @@
     <w:p/>
     <w:p>
       <w:r>
-        <w:t>C'est Sam Patel qui a creusé, parce que Sam faisait le travail dur et honnête, et qu'il aimait ça. Nous nous sommes tous tenus autour de lui dans la lueur dorée des lanternes et des guirlandes lumineuses, notre buée s'élevant ensemble dans le froid. Emma Redfern tenait ma main d'un côté et Pip se blottissait, chaud, contre ma botte de l'autre. Boule de Neige portait son chapeau de bois de cerf. Mark se tenait derrière sa fille, les mains posées sur ses épaules. Tout le cercle était là, ainsi que Neil Carter, qui était resté plus longtemps que prévu et se tenait à l'arrière, son carnet pour une fois rangé dans sa poche. Lorsque la pelle de Sam a heurté quelque chose qui a sonné de façon sourde, solide et métallique, toute la place a poussé un seul et même soupir, un « oh » doux et stupéfait qui est resté suspendu dans l'air froid.</w:t>
+        <w:t xml:space="preserve">C'est Sam Patel qui a creusé, parce que Sam faisait le travail dur et honnête, et qu'il aimait ça. Nous nous sommes tous tenus autour de lui dans la lueur dorée des lanternes et des guirlandes lumineuses, notre buée s'élevant ensemble dans le froid. Emma Redfern tenait ma main d'un côté et Pip se blottissait, chaude, contre ma botte de l'autre. Snowball portait son chapeau de bois de cerf. Mark se tenait derrière sa fille, les mains posées sur ses épaules. Tout le cercle était là, ainsi que Neil Carter, qui était resté plus longtemps que prévu et se tenait à l'arrière, son carnet pour une fois rangé dans sa poche. Lorsque la pelle de Sam a heurté quelque chose qui a sonné de façon sourde, solide et métallique, toute la place a poussé un seul et même soupir, un « oh » doux et stupéfait qui est resté suspendu dans l'air froid.</w:t>
       </w:r>
     </w:p>
     <w:p/>
@@ -4816,13 +4816,13 @@
     <w:p/>
     <w:p>
       <w:r>
-        <w:t>Au moment où le coffret est sorti de terre, le givre s'est mis à courir le long des plus petites branches de l'orme, juste au-dessus de la tête de Sam, blanc et fin comme de la dentelle. Personne d'autre n'a levé les yeux. Tout le monde regardait le coffret. Nick, à côté de moi, a levé les yeux, puis a posé les siens sur moi, sans rien dire.</w:t>
-      </w:r>
-    </w:p>
-    <w:p/>
-    <w:p>
-      <w:r>
-        <w:t>Un instant plus tard, Bram a déboulé en courant à travers la place en tordant sa casquette, et derrière lui, bien sûr, est arrivé un renne. Danseuse cette fois-ci, qui s'était échappée de son enclos pour suivre les lanternes jusqu'en ville. Elle s'est plantée au milieu de la place, le givre scintillant sur ses bois, contemplant le coffret de cuivre déterré avec un intérêt modéré et sans hâte, tandis que cent villageois écarquillaient les yeux et qu'une petite fille poussait un cri perçant de pure joie.</w:t>
+        <w:t xml:space="preserve">Au moment où le coffret est sorti de terre, le givre s'est mis à courir le long des plus basses branches de l'orme, juste au-dessus de la tête de Sam, blanc et fin comme de la dentelle. Personne d'autre n'a levé les yeux. Tout le monde regardait le coffret. Nick, à côté de moi, a levé les yeux, puis a posé les siens sur moi, sans rien dire.</w:t>
+      </w:r>
+    </w:p>
+    <w:p/>
+    <w:p>
+      <w:r>
+        <w:t xml:space="preserve">Un instant plus tard, Bram a déboulé en courant à travers la place en tordant sa casquette, et derrière lui, bien sûr, est arrivé un renne. Dancer cette fois-ci, qui s'était échappée de son enclos pour suivre les lanternes jusqu'en ville. Elle s'est plantée au milieu de la place, le givre scintillant sur ses bois, contemplant le coffret de cuivre déterré avec un intérêt modéré et sans hâte, tandis que cent villageois écarquillaient les yeux et qu'une petite fille poussait un cri perçant de pure joie.</w:t>
       </w:r>
     </w:p>
     <w:p/>
@@ -4834,13 +4834,13 @@
     <w:p/>
     <w:p>
       <w:r>
-        <w:t>— Laissez-la rester, ai-je dit en riant alors qu'Emma s'arrachait à son père pour courir passer ses bras autour du cou de Danseuse. Elle ne fait de mal à personne, Bram. Laissez-la jeter un œil.</w:t>
-      </w:r>
-    </w:p>
-    <w:p/>
-    <w:p>
-      <w:r>
-        <w:t>Je suis restée là, sur la place, à regarder tout cela : l'orme et les lumières dorées, le coffret de cuivre vert, le renne, l'enfant qui riait et toute la ville rassemblée tout près dans la lueur des lanternes. Pip était allé se placer juste sous le nez de Danseuse et lui lançait un regard long et sévère, comme pour lui rappeler à qui appartenait ce pingouin. La main de Nick a trouvé la mienne. Au-delà de l'enclos se trouvait le foyer qu'il avait bâti pour la magie, et je me demandais quelle part de celle-ci tournait encore autour lorsque nous serions rentrés à la maison.</w:t>
+        <w:t xml:space="preserve">— Laissez-la rester, ai-je dit en riant alors qu'Emma s'arrachait à son père pour courir passer ses bras autour du cou de Dancer. Elle ne fait de mal à personne, Bram. Laissez-la jeter un œil.</w:t>
+      </w:r>
+    </w:p>
+    <w:p/>
+    <w:p>
+      <w:r>
+        <w:t xml:space="preserve">Je suis restée là, sur la place, à regarder tout cela : l'orme et les lumières dorées, le coffret de cuivre vert, le renne, l'enfant qui riait et toute la ville rassemblée tout près dans la lueur des lanternes. Pip était allée se placer juste sous le nez de Dancer et lui lançait un regard long et sévère, comme pour lui rappeler à qui appartenait ce pingouin. La main de Nick a trouvé la mienne. Au-delà de l'enclos se trouvait le foyer qu'il avait bâti pour la magie, et je me demandais quelle part de plus de celle-ci y tournerait lorsque nous serions rentrés à la maison.</w:t>
       </w:r>
     </w:p>
     <w:p/>
@@ -4869,7 +4869,7 @@
     <w:p/>
     <w:p>
       <w:r>
-        <w:t>J'ai raccompagné Emma et Snowball chez eux un soir de cette semaine-là, avec Pip qui marchait en se dandinant devant nous et Mark à mes côtés. Emma a parlé tout du long, comme elle le faisait désormais, de la boîte en cuivre et de ce qui pouvait bien se trouver à l'intérieur. Des pièces, pensait-elle. Ou une lettre. Ou un trésor, un vrai trésor, de l'or, espérait-elle, et est-ce que toute la ville aurait le droit de regarder, et est-ce qu'elle pourrait être tout près de devant quand ils l'ouvriraient, parce qu'elle avait été juste là quand elle était sortie de terre et que ça devait bien compter pour quelque chose, non ?</w:t>
+        <w:t xml:space="preserve">J'ai raccompagné Emma et Snowball chez eux un soir de cette semaine-là, avec Pip qui marchait en se dandinant devant nous et Mark à mes côtés. Emma a parlé tout du long, comme elle le faisait désormais, de la boîte en cuivre et de ce qui pouvait bien se trouver à l'intérieur. Des pièces, pensait-elle. Ou une lettre. Ou un trésor, un vrai trésor, de l'or, espérait-elle, et est-ce que toute la ville aurait le droit de regarder, et est-ce qu'elle pourrait être tout devant quand ils l'ouvriraient, parce qu'elle avait été juste là quand elle était sortie de terre et que ça devait bien compter pour quelque chose, non ?</w:t>
       </w:r>
     </w:p>
     <w:p/>
@@ -4917,7 +4917,7 @@
     <w:p/>
     <w:p>
       <w:r>
-        <w:t>Le houx était dedans, la brindille ramassée sur la citrouille, trempant dans un pouce d'eau. Les trois feuilles étaient sombres et luisantes, et les baies aussi rouges que l'après-midi de leur apparition.</w:t>
+        <w:t xml:space="preserve">Le houx était dedans, la brindille ramassée sur la citrouille, trempant dans deux ou trois centimètres d'eau. Les trois feuilles étaient sombres et luisantes, et les baies aussi rouges que l'après-midi de leur apparition.</w:t>
       </w:r>
     </w:p>
     <w:p/>
@@ -5040,7 +5040,7 @@
         <w:rPr>
           <w:i/>
         </w:rPr>
-        <w:t xml:space="preserve">There are more mysteries afoot for Jessica Claus! </w:t>
+        <w:t xml:space="preserve">D'autres mystères attendent Jessica Claus ! </w:t>
       </w:r>
       <w:r>
         <w:t>&lt;bt&gt;</w:t>
@@ -5058,19 +5058,19 @@
         <w:rPr>
           <w:i/>
         </w:rPr>
-        <w:t xml:space="preserve"> is coming soon.</w:t>
-      </w:r>
-    </w:p>
-    <w:p/>
-    <w:p>
-      <w:r>
-        <w:t>What's Next?</w:t>
-      </w:r>
-    </w:p>
-    <w:p/>
-    <w:p>
-      <w:r>
-        <w:t>Greta a préparé le même roulé à la cannelle depuis quarante ans. Elle l'avait fait le matin suivant l'enterrement de son mari parce qu'elle ne savait pas quoi faire d'autre de ses mains. Cette semaine-là, il est sorti de son four tout aigre, tout comme la tournée suivante, et celle d'après.</w:t>
+        <w:t xml:space="preserve"> paraîtra bientôt.</w:t>
+      </w:r>
+    </w:p>
+    <w:p/>
+    <w:p>
+      <w:r>
+        <w:t xml:space="preserve">Et ensuite ?</w:t>
+      </w:r>
+    </w:p>
+    <w:p/>
+    <w:p>
+      <w:r>
+        <w:t xml:space="preserve">Greta prépare le même roulé à la cannelle depuis quarante ans. Elle l'avait fait le matin suivant l'enterrement de son mari parce qu'elle ne savait pas quoi faire d'autre de ses mains. Cette semaine-là, il est sorti de son four tout aigre, tout comme la tournée suivante, et celle d'après.</w:t>
       </w:r>
     </w:p>
     <w:p/>
@@ -5082,7 +5082,7 @@
     <w:p/>
     <w:p>
       <w:r>
-        <w:t>Puis une brique a traversé la fenêtre, et un mot s'est affiché en rouge sur le bardage, là où tous les enfants de l'avenue Evergreen le liraient en passant.</w:t>
+        <w:t xml:space="preserve">Puis une brique a traversé la fenêtre, et un mot s'est affiché en rouge sur le bardage, là où tous les enfants d'Evergreen Avenue le liraient en passant.</w:t>
       </w:r>
     </w:p>
     <w:p/>
@@ -5094,7 +5094,7 @@
     <w:p/>
     <w:p>
       <w:r>
-        <w:t>And at the bright end of the avenue, a new patisserie has dated its grand opening to the one week the Holly Jolly will be dark.</w:t>
+        <w:t xml:space="preserve">Et, au bout illuminé de l'avenue, une nouvelle pâtisserie a fixé son inauguration à l'unique semaine où le Holly Jolly restera fermé.</w:t>
       </w:r>
     </w:p>
     <w:p/>
@@ -5109,7 +5109,7 @@
         <w:rPr>
           <w:i/>
         </w:rPr>
-        <w:t xml:space="preserve">There are more mysteries afoot for Jessica Claus! </w:t>
+        <w:t xml:space="preserve">D'autres mystères attendent Jessica Claus ! </w:t>
       </w:r>
       <w:r>
         <w:t>&lt;bt&gt;</w:t>
@@ -5127,7 +5127,7 @@
         <w:rPr>
           <w:i/>
         </w:rPr>
-        <w:t xml:space="preserve"> is coming soon.</w:t>
+        <w:t xml:space="preserve"> paraîtra bientôt.</w:t>
       </w:r>
     </w:p>
     <w:p/>
@@ -5154,7 +5154,7 @@
     <w:p/>
     <w:p>
       <w:r>
-        <w:t>La neige était tombée dans la nuit. Pas la neige précoce d'octobre, disparue aussi sec dans une suite de journées douces. De la vraie neige. Celle de la pleine saison, qui avait commencé à Halloween et tiendrait jusqu'au printemps. Elle recouvrait désormais l'avenue Evergreen d'une bonne épaisseur bien propre de quinze centimètres, crissant sous les pas de quiconque entrait en s'essuyant les bottes. Durant le week-end, les boutiques avaient troqué leurs squelettes et leurs citrouilles d'Halloween pour des tiges de maïs et des dindes en papier, même si les simples courges étaient restées sur les perrons, parfaites jusqu'à Thanksgiving. L'avenue s'était tue après Halloween, dans l'accalmie précédant la longue et éclatante ruée vers Noël.</w:t>
+        <w:t xml:space="preserve">La neige était tombée dans la nuit. Pas la neige précoce d'octobre, disparue aussi sec dans une suite de journées douces. De la vraie neige. Celle de la pleine saison, qui avait commencé à Halloween et tiendrait jusqu'au printemps. Elle recouvrait désormais Evergreen Avenue d'une bonne épaisseur bien propre de quinze centimètres, crissant sous les pas de quiconque entrait en s'essuyant les bottes. Durant le week-end, les boutiques avaient troqué leurs squelettes et leurs citrouilles d'Halloween pour des tiges de maïs et des dindes en papier, même si les simples courges étaient restées sur les perrons, parfaites jusqu'à Thanksgiving. L'avenue s'était tue après Halloween, dans l'accalmie précédant la longue et éclatante ruée vers Noël.</w:t>
       </w:r>
     </w:p>
     <w:p/>
@@ -5190,7 +5190,7 @@
     <w:p/>
     <w:p>
       <w:r>
-        <w:t>« Dans les poignets, ai-je dit », et elle a fronçé les sourcils en regardant ses propres mains avant de recommencer.</w:t>
+        <w:t xml:space="preserve">« Dans les poignets, ai-je dit », et elle a froncé les sourcils en regardant ses propres mains avant de recommencer.</w:t>
       </w:r>
     </w:p>
     <w:p/>
@@ -5208,7 +5208,7 @@
     <w:p/>
     <w:p>
       <w:r>
-        <w:t>Et Pip, qui ne faisait pas partie du cercle mais aurait été profondément offensée d'être oubliée dans le décompte des personnes présentes. Elle s'était installée sous la grande fenêtre dans l'unique rayon du bas soleil de novembre, dans un nid qu'elle s'était bâti à partir d'un écheveau tombé de laine rouge qu'Olivia n'avait pas, je l'avais remarqué, essayé de récupérer de sitôt. Elle restait là, luisante et satisfaite, un œil mi-clos sur les opérations. Sur tout ce qui brillait, en particulier. Et il y avait pas mal de choses qui brillaient. Olivia avait un bocal de pommes de pin dorées sur la table, avec une bobine de ruban doré juste à côté. Pip had already been spoken to about both. Twice.</w:t>
+        <w:t xml:space="preserve">Et Pip, qui ne faisait pas partie du cercle mais aurait été profondément offensée d'être oubliée dans le décompte des personnes présentes. Elle s'était installée sous la grande fenêtre dans l'unique rayon du bas soleil de novembre, dans un nid qu'elle s'était bâti à partir d'un écheveau tombé de laine rouge qu'Olivia n'avait pas, je l'avais remarqué, essayé de récupérer de sitôt. Elle restait là, luisante et satisfaite, un œil mi-clos sur les opérations. Sur tout ce qui brillait, en particulier. Et il y avait pas mal de choses qui brillaient. Olivia avait un bocal de pommes de pin dorées sur la table, avec une bobine de ruban doré juste à côté. Pip s'était déjà fait gronder pour l'un comme pour l'autre. Deux fois.</w:t>
       </w:r>
     </w:p>
     <w:p/>
@@ -5256,7 +5256,7 @@
     <w:p/>
     <w:p>
       <w:r>
-        <w:t xml:space="preserve">C'est alors qu'il m'est apparu, en posant les petites brindilles les unes sur les autres, tout le chemin que j'avais parcouru pour me trouver assise là. Non pas les miles. Il y en avait eu un bon paquet, mais je ne parlais pas des miles. Il n'y a pas si longtemps, j'étais la nouvelle venue à Frost Falls. La femme du Pôle Nord avec le mari célèbre et le manchot pour le moins original. Les gens s'étaient montrés gentils avec moi comme une ville est gentille avec un invité, c'est-à-dire qu'ils m'avaient fait une place tout en guettant ce que j'allais en faire. Et maintenant, Olivia essayait de piquer ma méthode pour lier une couronne. Le chien de Martha dormait contre ma chaise aussi naturellement que contre la sienne. Personne ne m'expliquait plus rien. Il allait de soi que je savais. J'avais gagné cela rapidement à travers un automne rude, à travers un chien perdu et une capsule temporelle. </w:t>
+        <w:t xml:space="preserve">C'est alors qu'il m'est apparu, en posant les petites brindilles les unes sur les autres, tout le chemin que j'avais parcouru pour me trouver assise là. Non pas les kilomètres. Il y en avait eu un bon paquet, mais je ne parlais pas des kilomètres. Il n'y a pas si longtemps, j'étais la nouvelle venue à Frost Falls. La femme du Pôle Nord avec le mari célèbre et le manchot pour le moins original. Les gens s'étaient montrés gentils avec moi comme une ville est gentille avec un invité, c'est-à-dire qu'ils m'avaient fait une place tout en guettant ce que j'allais en faire. Et maintenant, Olivia essayait de piquer ma méthode pour lier une couronne. Le chien de Martha dormait contre ma chaise aussi naturellement que contre la sienne. Personne ne m'expliquait plus rien. Il allait de soi que je savais. J'avais gagné cela rapidement à travers un automne rude, à travers un chien perdu et une capsule temporelle. </w:t>
       </w:r>
     </w:p>
     <w:p/>
@@ -5364,7 +5364,7 @@
     <w:p/>
     <w:p>
       <w:r>
-        <w:t xml:space="preserve">« Bon, peu importe qui c'est, a déclaré Greta d'un ton bonhomme en ramassant les serviettes, ils auront besoin de se nourrir comme tout le monde. Je leur apporterai une tourte le jour de l'ouverture. » </w:t>
+        <w:t xml:space="preserve">« Bon, peu importe qui c'est, a déclaré Greta d'un ton bonhomme en ramassant les serviettes, ils auront besoin de se nourrir comme tout le monde. Je leur apporterai une tarte le jour de l'ouverture. » </w:t>
       </w:r>
     </w:p>
     <w:p/>
@@ -5382,7 +5382,7 @@
     <w:p/>
     <w:p>
       <w:r>
-        <w:t>Le square s'étendait en face de Yarn Tales, un large terrain vague engazonné doté d'un kiosque à musique à une extrémité et d'un monument aux morts à l'autre. Les écoliers y avaient bâti une rangée de bonhommes de neige lors de la première vraie chute de neige. Trois spécimens, replets, de travers et coiffés de tout ce que les gamins avaient pu dégoter. Hier, comme le disait Ellie, ils tournaient le dos aux façades pour faire face à la route, les yeux en charbon et l'air jovial, observant le trafic passer comme le font les bonhommes de neige. J'étais passée devant moi-même la veille au soir. Ils faisaient face à la rue.</w:t>
+        <w:t xml:space="preserve">Le square s'étendait en face de Yarn Tales, une large étendue communale toute blanche dotée d'un kiosque à musique à une extrémité et d'un monument aux morts à l'autre. Les écoliers y avaient bâti une rangée de bonhommes de neige lors de la première vraie chute de neige. Trois spécimens, replets, de travers et coiffés de tout ce que les gamins avaient pu dégoter. Hier, comme le disait Ellie, ils tournaient le dos aux façades pour faire face à la route, les yeux en charbon et l'air jovial, observant le trafic passer comme le font les bonhommes de neige. J'étais passée devant moi-même la veille au soir. Ils faisaient face à la rue.</w:t>
       </w:r>
     </w:p>
     <w:p/>
@@ -5436,7 +5436,7 @@
     <w:p/>
     <w:p>
       <w:r>
-        <w:t>Parce que je connais la différence. Je vis depuis longtemps maintenant aux côtés de la magie de Noël. Assez longtemps pour la reconnaître dans mes os, clairement comme un pas sur mon propre perchoir. Il ne s'agissait pas d'un gamin aux doigts gelés. La magie s'était échappée à Frost Falls. Elle était en liberté depuis notre arrivée, en quête d'un foyer. Mon mari était en train de lui en construire un. Lentement et patiemment dans son atelier, un âtre où elle pourrait se nicher, et elle se rapprochait un peu plus du feu chaque jour. Mais elle n'était pas encore fixée. Elle rôdait toujours en ville la nuit, chaleureuse, maladroite et totalement dépourvue de malice, accomplissant ces petites choses impossibles que fait la magie lorsqu'elle a plus de cœur que de raison. Transformant les lumières du festival d'orange en or. Et maintenant, manifestement, en faisant pivoter dans le noir le bonhomme de neige d'un enfant pour le faire regarder ce qui avait attiré son attention vagabonde.</w:t>
+        <w:t xml:space="preserve">Parce que je connais la différence. Je vis depuis longtemps maintenant aux côtés de la magie de Noël. Assez longtemps pour la reconnaître dans mes os, clairement comme un pas dans mon propre escalier. Il ne s'agissait pas d'un gamin aux doigts gelés. La magie s'était échappée à Frost Falls. Elle était en liberté depuis notre arrivée, en quête d'un foyer. Mon mari était en train de lui en construire un. Lentement et patiemment dans son atelier, un âtre où elle pourrait se nicher, et elle se rapprochait un peu plus du feu chaque jour. Mais elle n'était pas encore fixée. Elle rôdait toujours en ville la nuit, chaleureuse, maladroite et totalement dépourvue de malice, accomplissant ces petites choses impossibles que fait la magie lorsqu'elle a plus de cœur que de raison. Transformant les lumières du festival d'orange en or. Et maintenant, manifestement, en faisant pivoter dans le noir le bonhomme de neige d'un enfant pour le faire regarder ce qui avait attiré son attention vagabonde.</w:t>
       </w:r>
     </w:p>
     <w:p/>
@@ -5448,7 +5448,7 @@
     <w:p/>
     <w:p>
       <w:r>
-        <w:t>Mais je n'ai rien dit de tout cela au cercle. J'ai pris un biscuit au gingembre, ai dit non à Pip qui relouchait sur les miettes, et je me suis rassis pour terminer ma couronne. J'ai serré le sapin baumier, brin après brin, tous pointant dans la même direction. Derrière moi, une bûche a éclaté dans le poêle et les femmes ont bavardé. La neige brillait sur le square avec un bonhomme de neige tourné du mauvais côté. Quelque chose commençait. J'ai fait confiance à ce petit picotement frais au bas de la nuque, et il est resté avec moi toute la matinée.</w:t>
+        <w:t xml:space="preserve">Mais je n'ai rien dit de tout cela au cercle. J'ai pris un biscuit au gingembre, ai dit non à Pip qui relouchait sur les miettes, et je me suis rassise pour terminer ma couronne. J'ai serré le sapin baumier, brin après brin, tous pointant dans la même direction. Derrière moi, une bûche a éclaté dans le poêle et les femmes ont bavardé. La neige brillait sur le square avec un bonhomme de neige tourné du mauvais côté. Quelque chose commençait. J'ai fait confiance à ce petit picotement frais au bas de la nuque, et il est resté avec moi toute la matinée.</w:t>
       </w:r>
     </w:p>
     <w:p/>
@@ -5475,7 +5475,7 @@
         <w:rPr>
           <w:i/>
         </w:rPr>
-        <w:t xml:space="preserve"> is coming soon!</w:t>
+        <w:t xml:space="preserve"> paraîtra bientôt !</w:t>
       </w:r>
     </w:p>
     <w:sectPr>

</xml_diff>